<commit_message>
feat(mocap): bind opaque native restart replay contracts (#5470)
</commit_message>
<xml_diff>
--- a/manuals/tools/dist/tools-engineering-design-manual.docx
+++ b/manuals/tools/dist/tools-engineering-design-manual.docx
@@ -2314,7 +2314,7 @@
     </w:p>
     <w:bookmarkEnd w:id="45"/>
     <w:bookmarkEnd w:id="46"/>
-    <w:bookmarkStart w:id="97" w:name="swing-rate-of-closure-d-plane-exemplar"/>
+    <w:bookmarkStart w:id="92" w:name="swing-rate-of-closure-d-plane-exemplar"/>
     <w:p>
       <w:pPr>
         <w:pStyle w:val="Heading1"/>
@@ -6499,7 +6499,7 @@
     </w:p>
     <w:bookmarkEnd w:id="88"/>
     <w:bookmarkEnd w:id="89"/>
-    <w:bookmarkStart w:id="96" w:name="revision-history"/>
+    <w:bookmarkStart w:id="91" w:name="revision-history"/>
     <w:p>
       <w:pPr>
         <w:pStyle w:val="Heading2"/>
@@ -6508,7 +6508,7 @@
         <w:t xml:space="preserve">Revision History</w:t>
       </w:r>
     </w:p>
-    <w:bookmarkStart w:id="95" w:name="revision-record"/>
+    <w:bookmarkStart w:id="90" w:name="revision-record"/>
     <w:p>
       <w:pPr>
         <w:pStyle w:val="Heading3"/>
@@ -6549,8 +6549,618 @@
         <w:t xml:space="preserve">behavior changes, tests, provenance, limitations, and every generated artifact.</w:t>
       </w:r>
     </w:p>
-    <w:bookmarkStart w:id="94" w:name="refs"/>
-    <w:bookmarkStart w:id="91" w:name="ref-pandoc-manual"/>
+    <w:bookmarkEnd w:id="90"/>
+    <w:bookmarkEnd w:id="91"/>
+    <w:bookmarkEnd w:id="92"/>
+    <w:bookmarkStart w:id="107" w:name="Xf38ac95301459e28f388688aee8c1cf941b78a4"/>
+    <w:p>
+      <w:pPr>
+        <w:pStyle w:val="Heading1"/>
+      </w:pPr>
+      <w:r>
+        <w:t xml:space="preserve">Opaque Native Restart and Saved-Input Replay</w:t>
+      </w:r>
+    </w:p>
+    <w:bookmarkStart w:id="93" w:name="scope-and-authority"/>
+    <w:p>
+      <w:pPr>
+        <w:pStyle w:val="Heading2"/>
+      </w:pPr>
+      <w:r>
+        <w:t xml:space="preserve">Scope and Authority</w:t>
+      </w:r>
+    </w:p>
+    <w:p>
+      <w:pPr>
+        <w:pStyle w:val="FirstParagraph"/>
+      </w:pPr>
+      <w:r>
+        <w:t xml:space="preserve">Tools #5470 supplies typed transport for native state that cannot be represented</w:t>
+      </w:r>
+      <w:r>
+        <w:t xml:space="preserve"> </w:t>
+      </w:r>
+      <w:r>
+        <w:t xml:space="preserve">truthfully as a named numeric state vector. The wire format is</w:t>
+      </w:r>
+      <w:r>
+        <w:t xml:space="preserve"> </w:t>
+      </w:r>
+      <w:r>
+        <w:rPr>
+          <w:rStyle w:val="VerbatimChar"/>
+        </w:rPr>
+        <w:t xml:space="preserve">native-state-replay/1.1.0</w:t>
+      </w:r>
+      <w:r>
+        <w:t xml:space="preserve">. Its complete initial-state authority is a native</w:t>
+      </w:r>
+      <w:r>
+        <w:t xml:space="preserve"> </w:t>
+      </w:r>
+      <w:r>
+        <w:t xml:space="preserve">artifact descriptor and separately resolved immutable payload bytes. Numeric</w:t>
+      </w:r>
+      <w:r>
+        <w:t xml:space="preserve"> </w:t>
+      </w:r>
+      <w:r>
+        <w:t xml:space="preserve">observations are deliberately absent from this restart authority. The existing</w:t>
+      </w:r>
+      <w:r>
+        <w:t xml:space="preserve"> </w:t>
+      </w:r>
+      <w:r>
+        <w:rPr>
+          <w:rStyle w:val="VerbatimChar"/>
+        </w:rPr>
+        <w:t xml:space="preserve">experiment-replay/1.0.0</w:t>
+      </w:r>
+      <w:r>
+        <w:t xml:space="preserve"> </w:t>
+      </w:r>
+      <w:r>
+        <w:t xml:space="preserve">numeric reader and semantics remain unchanged; that</w:t>
+      </w:r>
+      <w:r>
+        <w:t xml:space="preserve"> </w:t>
+      </w:r>
+      <w:r>
+        <w:t xml:space="preserve">reader rejects the native envelope instead of discarding hidden state.</w:t>
+      </w:r>
+    </w:p>
+    <w:p>
+      <w:pPr>
+        <w:pStyle w:val="BodyText"/>
+      </w:pPr>
+      <w:r>
+        <w:t xml:space="preserve">These are interchange contracts, not a physics solver or qualification system.</w:t>
+      </w:r>
+      <w:r>
+        <w:t xml:space="preserve"> </w:t>
+      </w:r>
+      <w:r>
+        <w:t xml:space="preserve">UpstreamDrift #11921 owns actual R2025b decoding, independent integration,</w:t>
+      </w:r>
+      <w:r>
+        <w:t xml:space="preserve"> </w:t>
+      </w:r>
+      <w:r>
+        <w:t xml:space="preserve">model coverage and acceptance. All required engine/model rows remain visible.</w:t>
+      </w:r>
+    </w:p>
+    <w:bookmarkEnd w:id="93"/>
+    <w:bookmarkStart w:id="94" w:name="state-model-and-runtime-identity"/>
+    <w:p>
+      <w:pPr>
+        <w:pStyle w:val="Heading2"/>
+      </w:pPr>
+      <w:r>
+        <w:t xml:space="preserve">State, Model and Runtime Identity</w:t>
+      </w:r>
+    </w:p>
+    <w:p>
+      <w:pPr>
+        <w:pStyle w:val="FirstParagraph"/>
+      </w:pPr>
+      <w:r>
+        <w:rPr>
+          <w:rStyle w:val="VerbatimChar"/>
+        </w:rPr>
+        <w:t xml:space="preserve">NativeStateArtifact</w:t>
+      </w:r>
+      <w:r>
+        <w:t xml:space="preserve"> </w:t>
+      </w:r>
+      <w:r>
+        <w:t xml:space="preserve">binds format/version and expected decoded native class,</w:t>
+      </w:r>
+      <w:r>
+        <w:t xml:space="preserve"> </w:t>
+      </w:r>
+      <w:r>
+        <w:t xml:space="preserve">exact producing runtime/provider, source and loaded-model SHA-256 values,</w:t>
+      </w:r>
+      <w:r>
+        <w:t xml:space="preserve"> </w:t>
+      </w:r>
+      <w:r>
+        <w:t xml:space="preserve">native clock, solver and effective configuration/checksum policy, byte size,</w:t>
+      </w:r>
+      <w:r>
+        <w:t xml:space="preserve"> </w:t>
+      </w:r>
+      <w:r>
+        <w:t xml:space="preserve">payload digest and explicit complete-native-restart or observables-only role.</w:t>
+      </w:r>
+      <w:r>
+        <w:t xml:space="preserve"> </w:t>
+      </w:r>
+      <w:r>
+        <w:rPr>
+          <w:rStyle w:val="VerbatimChar"/>
+        </w:rPr>
+        <w:t xml:space="preserve">NativeReplayModel</w:t>
+      </w:r>
+      <w:r>
+        <w:t xml:space="preserve"> </w:t>
+      </w:r>
+      <w:r>
+        <w:t xml:space="preserve">preserves inventory model/variant identity and ordered input</w:t>
+      </w:r>
+      <w:r>
+        <w:t xml:space="preserve"> </w:t>
+      </w:r>
+      <w:r>
+        <w:t xml:space="preserve">mapping separately. Native artifacts cannot substitute an observables-only</w:t>
+      </w:r>
+      <w:r>
+        <w:t xml:space="preserve"> </w:t>
+      </w:r>
+      <w:r>
+        <w:t xml:space="preserve">scope during replay admission.</w:t>
+      </w:r>
+    </w:p>
+    <w:p>
+      <w:pPr>
+        <w:pStyle w:val="BodyText"/>
+      </w:pPr>
+      <w:r>
+        <w:rPr>
+          <w:rStyle w:val="VerbatimChar"/>
+        </w:rPr>
+        <w:t xml:space="preserve">freeze_native_state_artifact</w:t>
+      </w:r>
+      <w:r>
+        <w:t xml:space="preserve"> </w:t>
+      </w:r>
+      <w:r>
+        <w:t xml:space="preserve">verifies an owned immutable byte snapshot. It</w:t>
+      </w:r>
+      <w:r>
+        <w:t xml:space="preserve"> </w:t>
+      </w:r>
+      <w:r>
+        <w:t xml:space="preserve">rejects wrong size/hash and numeric/list coercion; it never deserializes or</w:t>
+      </w:r>
+      <w:r>
+        <w:t xml:space="preserve"> </w:t>
+      </w:r>
+      <w:r>
+        <w:t xml:space="preserve">executes the payload. A consumer must load these verified bytes and independently</w:t>
+      </w:r>
+      <w:r>
+        <w:t xml:space="preserve"> </w:t>
+      </w:r>
+      <w:r>
+        <w:t xml:space="preserve">verify actual decoded class, time, runtime and model compatibility. Hashing MAT</w:t>
+      </w:r>
+      <w:r>
+        <w:t xml:space="preserve"> </w:t>
+      </w:r>
+      <w:r>
+        <w:t xml:space="preserve">bytes identifies one serialization; it does not establish canonical semantic</w:t>
+      </w:r>
+      <w:r>
+        <w:t xml:space="preserve"> </w:t>
+      </w:r>
+      <w:r>
+        <w:t xml:space="preserve">state encoding, source-to-binary equivalence or transitive library closure.</w:t>
+      </w:r>
+    </w:p>
+    <w:bookmarkEnd w:id="94"/>
+    <w:bookmarkStart w:id="95" w:name="native-clock-and-input-boundary"/>
+    <w:p>
+      <w:pPr>
+        <w:pStyle w:val="Heading2"/>
+      </w:pPr>
+      <w:r>
+        <w:t xml:space="preserve">Native Clock and Input Boundary</w:t>
+      </w:r>
+    </w:p>
+    <w:p>
+      <w:pPr>
+        <w:pStyle w:val="FirstParagraph"/>
+      </w:pPr>
+      <w:r>
+        <w:t xml:space="preserve">The saved native</w:t>
+      </w:r>
+      <w:r>
+        <w:t xml:space="preserve"> </w:t>
+      </w:r>
+      <w:r>
+        <w:rPr>
+          <w:rStyle w:val="VerbatimChar"/>
+        </w:rPr>
+        <w:t xml:space="preserve">snapshot_time_seconds</w:t>
+      </w:r>
+      <w:r>
+        <w:t xml:space="preserve"> </w:t>
+      </w:r>
+      <w:r>
+        <w:t xml:space="preserve">and</w:t>
+      </w:r>
+      <w:r>
+        <w:t xml:space="preserve"> </w:t>
+      </w:r>
+      <w:r>
+        <w:rPr>
+          <w:rStyle w:val="VerbatimChar"/>
+        </w:rPr>
+        <w:t xml:space="preserve">start_time_seconds</w:t>
+      </w:r>
+      <w:r>
+        <w:t xml:space="preserve"> </w:t>
+      </w:r>
+      <w:r>
+        <w:t xml:space="preserve">are finite and</w:t>
+      </w:r>
+      <w:r>
+        <w:t xml:space="preserve"> </w:t>
+      </w:r>
+      <w:r>
+        <w:t xml:space="preserve">ordered, with an explicit native clock identity. Saved input histories reuse</w:t>
+      </w:r>
+      <w:r>
+        <w:t xml:space="preserve"> </w:t>
+      </w:r>
+      <w:r>
+        <w:t xml:space="preserve">the existing interval-relative time and interpolation contracts. Native replay</w:t>
+      </w:r>
+      <w:r>
+        <w:t xml:space="preserve"> </w:t>
+      </w:r>
+      <w:r>
+        <w:t xml:space="preserve">time is the saved snapshot plus each relative input time; the operating point</w:t>
+      </w:r>
+      <w:r>
+        <w:t xml:space="preserve"> </w:t>
+      </w:r>
+      <w:r>
+        <w:t xml:space="preserve">is never retimed to zero. Overflow or loss of strict ordering at native floating</w:t>
+      </w:r>
+      <w:r>
+        <w:t xml:space="preserve"> </w:t>
+      </w:r>
+      <w:r>
+        <w:t xml:space="preserve">point precision is rejected. Requested intervals and an explicitly supplied</w:t>
+      </w:r>
+      <w:r>
+        <w:t xml:space="preserve"> </w:t>
+      </w:r>
+      <w:r>
+        <w:t xml:space="preserve">solver step must also survive translation to the native epoch within the larger</w:t>
+      </w:r>
+      <w:r>
+        <w:t xml:space="preserve"> </w:t>
+      </w:r>
+      <w:r>
+        <w:t xml:space="preserve">of 1e-9 relative interval error or 64 ULPs of that interval. Epoch ULPs never</w:t>
+      </w:r>
+      <w:r>
+        <w:t xml:space="preserve"> </w:t>
+      </w:r>
+      <w:r>
+        <w:t xml:space="preserve">relax this policy. Consumers must check effective native solver precision too. Physical input units, muscle excitation versus</w:t>
+      </w:r>
+      <w:r>
+        <w:t xml:space="preserve"> </w:t>
+      </w:r>
+      <w:r>
+        <w:t xml:space="preserve">activation, force versus command, and explicit contact identity remain governed</w:t>
+      </w:r>
+      <w:r>
+        <w:t xml:space="preserve"> </w:t>
+      </w:r>
+      <w:r>
+        <w:t xml:space="preserve">by the shared</w:t>
+      </w:r>
+      <w:r>
+        <w:t xml:space="preserve"> </w:t>
+      </w:r>
+      <w:r>
+        <w:rPr>
+          <w:rStyle w:val="VerbatimChar"/>
+        </w:rPr>
+        <w:t xml:space="preserve">InputHistory</w:t>
+      </w:r>
+      <w:r>
+        <w:t xml:space="preserve"> </w:t>
+      </w:r>
+      <w:r>
+        <w:t xml:space="preserve">and</w:t>
+      </w:r>
+      <w:r>
+        <w:t xml:space="preserve"> </w:t>
+      </w:r>
+      <w:r>
+        <w:rPr>
+          <w:rStyle w:val="VerbatimChar"/>
+        </w:rPr>
+        <w:t xml:space="preserve">ReplayExecutionPolicy</w:t>
+      </w:r>
+      <w:r>
+        <w:t xml:space="preserve"> </w:t>
+      </w:r>
+      <w:r>
+        <w:t xml:space="preserve">contracts.</w:t>
+      </w:r>
+    </w:p>
+    <w:bookmarkEnd w:id="95"/>
+    <w:bookmarkStart w:id="96" w:name="integrity-and-failure-semantics"/>
+    <w:p>
+      <w:pPr>
+        <w:pStyle w:val="Heading2"/>
+      </w:pPr>
+      <w:r>
+        <w:t xml:space="preserve">Integrity and Failure Semantics</w:t>
+      </w:r>
+    </w:p>
+    <w:p>
+      <w:pPr>
+        <w:pStyle w:val="FirstParagraph"/>
+      </w:pPr>
+      <w:r>
+        <w:rPr>
+          <w:rStyle w:val="VerbatimChar"/>
+        </w:rPr>
+        <w:t xml:space="preserve">NativeReplayIntegrity</w:t>
+      </w:r>
+      <w:r>
+        <w:t xml:space="preserve"> </w:t>
+      </w:r>
+      <w:r>
+        <w:t xml:space="preserve">retains shared component hashes and adds an entire</w:t>
+      </w:r>
+      <w:r>
+        <w:t xml:space="preserve"> </w:t>
+      </w:r>
+      <w:r>
+        <w:t xml:space="preserve">envelope digest, including experiment identity. Strict JSON rejects duplicate</w:t>
+      </w:r>
+      <w:r>
+        <w:t xml:space="preserve"> </w:t>
+      </w:r>
+      <w:r>
+        <w:t xml:space="preserve">or unknown fields, unsupported versions and stale integrity. Capability</w:t>
+      </w:r>
+      <w:r>
+        <w:t xml:space="preserve"> </w:t>
+      </w:r>
+      <w:r>
+        <w:t xml:space="preserve">availability remains distinct from declared support; required unavailable or</w:t>
+      </w:r>
+      <w:r>
+        <w:t xml:space="preserve"> </w:t>
+      </w:r>
+      <w:r>
+        <w:t xml:space="preserve">unsupported capabilities remain blockers. Metadata equality does not prove a</w:t>
+      </w:r>
+      <w:r>
+        <w:t xml:space="preserve"> </w:t>
+      </w:r>
+      <w:r>
+        <w:t xml:space="preserve">native engine followed the declared policy.</w:t>
+      </w:r>
+    </w:p>
+    <w:bookmarkEnd w:id="96"/>
+    <w:bookmarkStart w:id="97" w:name="native-consumer-requirements"/>
+    <w:p>
+      <w:pPr>
+        <w:pStyle w:val="Heading2"/>
+      </w:pPr>
+      <w:r>
+        <w:t xml:space="preserve">Native Consumer Requirements</w:t>
+      </w:r>
+    </w:p>
+    <w:p>
+      <w:pPr>
+        <w:pStyle w:val="FirstParagraph"/>
+      </w:pPr>
+      <w:r>
+        <w:t xml:space="preserve">For R2025b, preserve hidden Simscape/block state, solver/execution state and</w:t>
+      </w:r>
+      <w:r>
+        <w:t xml:space="preserve"> </w:t>
+      </w:r>
+      <w:r>
+        <w:t xml:space="preserve">operating-point compatibility. Disable block reduction before capture and bind</w:t>
+      </w:r>
+      <w:r>
+        <w:t xml:space="preserve"> </w:t>
+      </w:r>
+      <w:r>
+        <w:t xml:space="preserve">effective solver settings rather than unresolved UI values such as</w:t>
+      </w:r>
+      <w:r>
+        <w:t xml:space="preserve"> </w:t>
+      </w:r>
+      <w:r>
+        <w:rPr>
+          <w:rStyle w:val="VerbatimChar"/>
+        </w:rPr>
+        <w:t xml:space="preserve">auto</w:t>
+      </w:r>
+      <w:r>
+        <w:t xml:space="preserve">.</w:t>
+      </w:r>
+      <w:r>
+        <w:t xml:space="preserve"> </w:t>
+      </w:r>
+      <w:r>
+        <w:t xml:space="preserve">Verify a nonzero-time saved/reloaded restart against uninterrupted native</w:t>
+      </w:r>
+      <w:r>
+        <w:t xml:space="preserve"> </w:t>
+      </w:r>
+      <w:r>
+        <w:t xml:space="preserve">integration, including discrete/hidden state. Preserve wrong model/runtime/time,</w:t>
+      </w:r>
+      <w:r>
+        <w:t xml:space="preserve"> </w:t>
+      </w:r>
+      <w:r>
+        <w:t xml:space="preserve">tampered or missing blob, stale artifact and observable-downgrade negatives.</w:t>
+      </w:r>
+      <w:r>
+        <w:t xml:space="preserve"> </w:t>
+      </w:r>
+      <w:r>
+        <w:t xml:space="preserve">No state reset is permitted during the requested saved-input replay horizon.</w:t>
+      </w:r>
+    </w:p>
+    <w:bookmarkEnd w:id="97"/>
+    <w:bookmarkStart w:id="98" w:name="evidence-and-remaining-work"/>
+    <w:p>
+      <w:pPr>
+        <w:pStyle w:val="Heading2"/>
+      </w:pPr>
+      <w:r>
+        <w:t xml:space="preserve">Evidence and Remaining Work</w:t>
+      </w:r>
+    </w:p>
+    <w:p>
+      <w:pPr>
+        <w:pStyle w:val="FirstParagraph"/>
+      </w:pPr>
+      <w:r>
+        <w:t xml:space="preserve">Initial missing-module, coercion, public-facade, duplicate-key and experiment</w:t>
+      </w:r>
+      <w:r>
+        <w:t xml:space="preserve"> </w:t>
+      </w:r>
+      <w:r>
+        <w:t xml:space="preserve">identity failures were observed before fixes. The current focused suite passes</w:t>
+      </w:r>
+      <w:r>
+        <w:t xml:space="preserve"> </w:t>
+      </w:r>
+      <w:r>
+        <w:t xml:space="preserve">77 tests, including 23 unchanged numeric T01 tests and 11 native JSON Schema tests. Astra review supplied</w:t>
+      </w:r>
+      <w:r>
+        <w:t xml:space="preserve"> </w:t>
+      </w:r>
+      <w:r>
+        <w:t xml:space="preserve">reproduced string-channel coercion and large-epoch interval-retiming negatives;</w:t>
+      </w:r>
+      <w:r>
+        <w:t xml:space="preserve"> </w:t>
+      </w:r>
+      <w:r>
+        <w:t xml:space="preserve">both failed before correction. Configured source typing passes. The schema reuses stable numeric-contract</w:t>
+      </w:r>
+      <w:r>
+        <w:t xml:space="preserve"> </w:t>
+      </w:r>
+      <w:r>
+        <w:t xml:space="preserve">definitions by local reference. The manual renderer uses the pinned toolchain;</w:t>
+      </w:r>
+      <w:r>
+        <w:t xml:space="preserve"> </w:t>
+      </w:r>
+      <w:r>
+        <w:t xml:space="preserve">QA inspects every actual page and rejects missing, duplicate or reordered page</w:t>
+      </w:r>
+      <w:r>
+        <w:t xml:space="preserve"> </w:t>
+      </w:r>
+      <w:r>
+        <w:t xml:space="preserve">records as the manual grows. Inventory/governance/normal hooks and actual</w:t>
+      </w:r>
+      <w:r>
+        <w:t xml:space="preserve"> </w:t>
+      </w:r>
+      <w:r>
+        <w:t xml:space="preserve">R2025b integration remain pending at this development checkpoint. This chapter</w:t>
+      </w:r>
+      <w:r>
+        <w:t xml:space="preserve"> </w:t>
+      </w:r>
+      <w:r>
+        <w:t xml:space="preserve">does not approve a scientific calculation or manual release.</w:t>
+      </w:r>
+    </w:p>
+    <w:bookmarkEnd w:id="98"/>
+    <w:bookmarkStart w:id="106" w:name="primary-references"/>
+    <w:p>
+      <w:pPr>
+        <w:pStyle w:val="Heading2"/>
+      </w:pPr>
+      <w:r>
+        <w:t xml:space="preserve">Primary References</w:t>
+      </w:r>
+    </w:p>
+    <w:p>
+      <w:pPr>
+        <w:pStyle w:val="FirstParagraph"/>
+      </w:pPr>
+      <w:hyperlink r:id="rId99">
+        <w:r>
+          <w:rPr>
+            <w:rStyle w:val="Hyperlink"/>
+          </w:rPr>
+          <w:t xml:space="preserve">MathWorks R2025b ModelOperatingPoint</w:t>
+        </w:r>
+      </w:hyperlink>
+      <w:r>
+        <w:t xml:space="preserve"> </w:t>
+      </w:r>
+      <w:r>
+        <w:t xml:space="preserve">defines native restart state and the read-only snapshot clock; its numeric</w:t>
+      </w:r>
+      <w:r>
+        <w:t xml:space="preserve"> </w:t>
+      </w:r>
+      <w:r>
+        <w:t xml:space="preserve">logged-state view excludes internal Simscape state.</w:t>
+      </w:r>
+      <w:r>
+        <w:t xml:space="preserve"> </w:t>
+      </w:r>
+      <w:hyperlink r:id="rId100">
+        <w:r>
+          <w:rPr>
+            <w:rStyle w:val="Hyperlink"/>
+          </w:rPr>
+          <w:t xml:space="preserve">MathWorks R2025b Operating-Point Workflow</w:t>
+        </w:r>
+      </w:hyperlink>
+      <w:r>
+        <w:t xml:space="preserve"> </w:t>
+      </w:r>
+      <w:r>
+        <w:t xml:space="preserve">documents compatibility and effective configuration constraints. These native</w:t>
+      </w:r>
+      <w:r>
+        <w:t xml:space="preserve"> </w:t>
+      </w:r>
+      <w:r>
+        <w:t xml:space="preserve">claims require separate actual execution evidence from UpstreamDrift.</w:t>
+      </w:r>
+    </w:p>
+    <w:bookmarkStart w:id="105" w:name="refs"/>
+    <w:bookmarkStart w:id="102" w:name="ref-pandoc-manual"/>
     <w:p>
       <w:pPr>
         <w:pStyle w:val="Bibliography"/>
@@ -6574,7 +7184,7 @@
       <w:r>
         <w:t xml:space="preserve"> </w:t>
       </w:r>
-      <w:hyperlink r:id="rId90">
+      <w:hyperlink r:id="rId101">
         <w:r>
           <w:rPr>
             <w:rStyle w:val="Hyperlink"/>
@@ -6586,8 +7196,8 @@
         <w:t xml:space="preserve">.</w:t>
       </w:r>
     </w:p>
-    <w:bookmarkEnd w:id="91"/>
-    <w:bookmarkStart w:id="93" w:name="ref-quarto-guide"/>
+    <w:bookmarkEnd w:id="102"/>
+    <w:bookmarkStart w:id="104" w:name="ref-quarto-guide"/>
     <w:p>
       <w:pPr>
         <w:pStyle w:val="Bibliography"/>
@@ -6611,7 +7221,7 @@
       <w:r>
         <w:t xml:space="preserve"> </w:t>
       </w:r>
-      <w:hyperlink r:id="rId92">
+      <w:hyperlink r:id="rId103">
         <w:r>
           <w:rPr>
             <w:rStyle w:val="Hyperlink"/>
@@ -6623,11 +7233,10 @@
         <w:t xml:space="preserve">.</w:t>
       </w:r>
     </w:p>
-    <w:bookmarkEnd w:id="93"/>
-    <w:bookmarkEnd w:id="94"/>
-    <w:bookmarkEnd w:id="95"/>
-    <w:bookmarkEnd w:id="96"/>
-    <w:bookmarkEnd w:id="97"/>
+    <w:bookmarkEnd w:id="104"/>
+    <w:bookmarkEnd w:id="105"/>
+    <w:bookmarkEnd w:id="106"/>
+    <w:bookmarkEnd w:id="107"/>
     <w:sectPr>
       <w:headerReference r:id="rId9" w:type="default"/>
       <w:footerReference r:id="rId10" w:type="default"/>

</xml_diff>

<commit_message>
feat(mocap): bind opaque native restart replay contracts (#5471)
* feat(mocap): bind opaque native restart replay contracts (#5470)

* chore(mocap): normalize schema and collated turnover metadata

* docs(mocap): refresh governed turnover after main integration

* docs(mocap): stage native replay transport review (#5470)

* docs(mocap): bind governed transport handoff to PR5471

* docs(mocap): generate native transport PR5471 specification row

* fix: verify native transport against full CI contracts

---------

Co-authored-by: codex-scheduled <codex-scheduled@users.noreply.github.com>
</commit_message>
<xml_diff>
--- a/manuals/tools/dist/tools-engineering-design-manual.docx
+++ b/manuals/tools/dist/tools-engineering-design-manual.docx
@@ -2314,7 +2314,7 @@
     </w:p>
     <w:bookmarkEnd w:id="45"/>
     <w:bookmarkEnd w:id="46"/>
-    <w:bookmarkStart w:id="97" w:name="swing-rate-of-closure-d-plane-exemplar"/>
+    <w:bookmarkStart w:id="92" w:name="swing-rate-of-closure-d-plane-exemplar"/>
     <w:p>
       <w:pPr>
         <w:pStyle w:val="Heading1"/>
@@ -6499,7 +6499,7 @@
     </w:p>
     <w:bookmarkEnd w:id="88"/>
     <w:bookmarkEnd w:id="89"/>
-    <w:bookmarkStart w:id="96" w:name="revision-history"/>
+    <w:bookmarkStart w:id="91" w:name="revision-history"/>
     <w:p>
       <w:pPr>
         <w:pStyle w:val="Heading2"/>
@@ -6508,7 +6508,7 @@
         <w:t xml:space="preserve">Revision History</w:t>
       </w:r>
     </w:p>
-    <w:bookmarkStart w:id="95" w:name="revision-record"/>
+    <w:bookmarkStart w:id="90" w:name="revision-record"/>
     <w:p>
       <w:pPr>
         <w:pStyle w:val="Heading3"/>
@@ -6549,8 +6549,618 @@
         <w:t xml:space="preserve">behavior changes, tests, provenance, limitations, and every generated artifact.</w:t>
       </w:r>
     </w:p>
-    <w:bookmarkStart w:id="94" w:name="refs"/>
-    <w:bookmarkStart w:id="91" w:name="ref-pandoc-manual"/>
+    <w:bookmarkEnd w:id="90"/>
+    <w:bookmarkEnd w:id="91"/>
+    <w:bookmarkEnd w:id="92"/>
+    <w:bookmarkStart w:id="107" w:name="Xf38ac95301459e28f388688aee8c1cf941b78a4"/>
+    <w:p>
+      <w:pPr>
+        <w:pStyle w:val="Heading1"/>
+      </w:pPr>
+      <w:r>
+        <w:t xml:space="preserve">Opaque Native Restart and Saved-Input Replay</w:t>
+      </w:r>
+    </w:p>
+    <w:bookmarkStart w:id="93" w:name="scope-and-authority"/>
+    <w:p>
+      <w:pPr>
+        <w:pStyle w:val="Heading2"/>
+      </w:pPr>
+      <w:r>
+        <w:t xml:space="preserve">Scope and Authority</w:t>
+      </w:r>
+    </w:p>
+    <w:p>
+      <w:pPr>
+        <w:pStyle w:val="FirstParagraph"/>
+      </w:pPr>
+      <w:r>
+        <w:t xml:space="preserve">Tools #5470 supplies typed transport for native state that cannot be represented</w:t>
+      </w:r>
+      <w:r>
+        <w:t xml:space="preserve"> </w:t>
+      </w:r>
+      <w:r>
+        <w:t xml:space="preserve">truthfully as a named numeric state vector. The wire format is</w:t>
+      </w:r>
+      <w:r>
+        <w:t xml:space="preserve"> </w:t>
+      </w:r>
+      <w:r>
+        <w:rPr>
+          <w:rStyle w:val="VerbatimChar"/>
+        </w:rPr>
+        <w:t xml:space="preserve">native-state-replay/1.1.0</w:t>
+      </w:r>
+      <w:r>
+        <w:t xml:space="preserve">. Its complete initial-state authority is a native</w:t>
+      </w:r>
+      <w:r>
+        <w:t xml:space="preserve"> </w:t>
+      </w:r>
+      <w:r>
+        <w:t xml:space="preserve">artifact descriptor and separately resolved immutable payload bytes. Numeric</w:t>
+      </w:r>
+      <w:r>
+        <w:t xml:space="preserve"> </w:t>
+      </w:r>
+      <w:r>
+        <w:t xml:space="preserve">observations are deliberately absent from this restart authority. The existing</w:t>
+      </w:r>
+      <w:r>
+        <w:t xml:space="preserve"> </w:t>
+      </w:r>
+      <w:r>
+        <w:rPr>
+          <w:rStyle w:val="VerbatimChar"/>
+        </w:rPr>
+        <w:t xml:space="preserve">experiment-replay/1.0.0</w:t>
+      </w:r>
+      <w:r>
+        <w:t xml:space="preserve"> </w:t>
+      </w:r>
+      <w:r>
+        <w:t xml:space="preserve">numeric reader and semantics remain unchanged; that</w:t>
+      </w:r>
+      <w:r>
+        <w:t xml:space="preserve"> </w:t>
+      </w:r>
+      <w:r>
+        <w:t xml:space="preserve">reader rejects the native envelope instead of discarding hidden state.</w:t>
+      </w:r>
+    </w:p>
+    <w:p>
+      <w:pPr>
+        <w:pStyle w:val="BodyText"/>
+      </w:pPr>
+      <w:r>
+        <w:t xml:space="preserve">These are interchange contracts, not a physics solver or qualification system.</w:t>
+      </w:r>
+      <w:r>
+        <w:t xml:space="preserve"> </w:t>
+      </w:r>
+      <w:r>
+        <w:t xml:space="preserve">UpstreamDrift #11921 owns actual R2025b decoding, independent integration,</w:t>
+      </w:r>
+      <w:r>
+        <w:t xml:space="preserve"> </w:t>
+      </w:r>
+      <w:r>
+        <w:t xml:space="preserve">model coverage and acceptance. All required engine/model rows remain visible.</w:t>
+      </w:r>
+    </w:p>
+    <w:bookmarkEnd w:id="93"/>
+    <w:bookmarkStart w:id="94" w:name="state-model-and-runtime-identity"/>
+    <w:p>
+      <w:pPr>
+        <w:pStyle w:val="Heading2"/>
+      </w:pPr>
+      <w:r>
+        <w:t xml:space="preserve">State, Model and Runtime Identity</w:t>
+      </w:r>
+    </w:p>
+    <w:p>
+      <w:pPr>
+        <w:pStyle w:val="FirstParagraph"/>
+      </w:pPr>
+      <w:r>
+        <w:rPr>
+          <w:rStyle w:val="VerbatimChar"/>
+        </w:rPr>
+        <w:t xml:space="preserve">NativeStateArtifact</w:t>
+      </w:r>
+      <w:r>
+        <w:t xml:space="preserve"> </w:t>
+      </w:r>
+      <w:r>
+        <w:t xml:space="preserve">binds format/version and expected decoded native class,</w:t>
+      </w:r>
+      <w:r>
+        <w:t xml:space="preserve"> </w:t>
+      </w:r>
+      <w:r>
+        <w:t xml:space="preserve">exact producing runtime/provider, source and loaded-model SHA-256 values,</w:t>
+      </w:r>
+      <w:r>
+        <w:t xml:space="preserve"> </w:t>
+      </w:r>
+      <w:r>
+        <w:t xml:space="preserve">native clock, solver and effective configuration/checksum policy, byte size,</w:t>
+      </w:r>
+      <w:r>
+        <w:t xml:space="preserve"> </w:t>
+      </w:r>
+      <w:r>
+        <w:t xml:space="preserve">payload digest and explicit complete-native-restart or observables-only role.</w:t>
+      </w:r>
+      <w:r>
+        <w:t xml:space="preserve"> </w:t>
+      </w:r>
+      <w:r>
+        <w:rPr>
+          <w:rStyle w:val="VerbatimChar"/>
+        </w:rPr>
+        <w:t xml:space="preserve">NativeReplayModel</w:t>
+      </w:r>
+      <w:r>
+        <w:t xml:space="preserve"> </w:t>
+      </w:r>
+      <w:r>
+        <w:t xml:space="preserve">preserves inventory model/variant identity and ordered input</w:t>
+      </w:r>
+      <w:r>
+        <w:t xml:space="preserve"> </w:t>
+      </w:r>
+      <w:r>
+        <w:t xml:space="preserve">mapping separately. Native artifacts cannot substitute an observables-only</w:t>
+      </w:r>
+      <w:r>
+        <w:t xml:space="preserve"> </w:t>
+      </w:r>
+      <w:r>
+        <w:t xml:space="preserve">scope during replay admission.</w:t>
+      </w:r>
+    </w:p>
+    <w:p>
+      <w:pPr>
+        <w:pStyle w:val="BodyText"/>
+      </w:pPr>
+      <w:r>
+        <w:rPr>
+          <w:rStyle w:val="VerbatimChar"/>
+        </w:rPr>
+        <w:t xml:space="preserve">freeze_native_state_artifact</w:t>
+      </w:r>
+      <w:r>
+        <w:t xml:space="preserve"> </w:t>
+      </w:r>
+      <w:r>
+        <w:t xml:space="preserve">verifies an owned immutable byte snapshot. It</w:t>
+      </w:r>
+      <w:r>
+        <w:t xml:space="preserve"> </w:t>
+      </w:r>
+      <w:r>
+        <w:t xml:space="preserve">rejects wrong size/hash and numeric/list coercion; it never deserializes or</w:t>
+      </w:r>
+      <w:r>
+        <w:t xml:space="preserve"> </w:t>
+      </w:r>
+      <w:r>
+        <w:t xml:space="preserve">executes the payload. A consumer must load these verified bytes and independently</w:t>
+      </w:r>
+      <w:r>
+        <w:t xml:space="preserve"> </w:t>
+      </w:r>
+      <w:r>
+        <w:t xml:space="preserve">verify actual decoded class, time, runtime and model compatibility. Hashing MAT</w:t>
+      </w:r>
+      <w:r>
+        <w:t xml:space="preserve"> </w:t>
+      </w:r>
+      <w:r>
+        <w:t xml:space="preserve">bytes identifies one serialization; it does not establish canonical semantic</w:t>
+      </w:r>
+      <w:r>
+        <w:t xml:space="preserve"> </w:t>
+      </w:r>
+      <w:r>
+        <w:t xml:space="preserve">state encoding, source-to-binary equivalence or transitive library closure.</w:t>
+      </w:r>
+    </w:p>
+    <w:bookmarkEnd w:id="94"/>
+    <w:bookmarkStart w:id="95" w:name="native-clock-and-input-boundary"/>
+    <w:p>
+      <w:pPr>
+        <w:pStyle w:val="Heading2"/>
+      </w:pPr>
+      <w:r>
+        <w:t xml:space="preserve">Native Clock and Input Boundary</w:t>
+      </w:r>
+    </w:p>
+    <w:p>
+      <w:pPr>
+        <w:pStyle w:val="FirstParagraph"/>
+      </w:pPr>
+      <w:r>
+        <w:t xml:space="preserve">The saved native</w:t>
+      </w:r>
+      <w:r>
+        <w:t xml:space="preserve"> </w:t>
+      </w:r>
+      <w:r>
+        <w:rPr>
+          <w:rStyle w:val="VerbatimChar"/>
+        </w:rPr>
+        <w:t xml:space="preserve">snapshot_time_seconds</w:t>
+      </w:r>
+      <w:r>
+        <w:t xml:space="preserve"> </w:t>
+      </w:r>
+      <w:r>
+        <w:t xml:space="preserve">and</w:t>
+      </w:r>
+      <w:r>
+        <w:t xml:space="preserve"> </w:t>
+      </w:r>
+      <w:r>
+        <w:rPr>
+          <w:rStyle w:val="VerbatimChar"/>
+        </w:rPr>
+        <w:t xml:space="preserve">start_time_seconds</w:t>
+      </w:r>
+      <w:r>
+        <w:t xml:space="preserve"> </w:t>
+      </w:r>
+      <w:r>
+        <w:t xml:space="preserve">are finite and</w:t>
+      </w:r>
+      <w:r>
+        <w:t xml:space="preserve"> </w:t>
+      </w:r>
+      <w:r>
+        <w:t xml:space="preserve">ordered, with an explicit native clock identity. Saved input histories reuse</w:t>
+      </w:r>
+      <w:r>
+        <w:t xml:space="preserve"> </w:t>
+      </w:r>
+      <w:r>
+        <w:t xml:space="preserve">the existing interval-relative time and interpolation contracts. Native replay</w:t>
+      </w:r>
+      <w:r>
+        <w:t xml:space="preserve"> </w:t>
+      </w:r>
+      <w:r>
+        <w:t xml:space="preserve">time is the saved snapshot plus each relative input time; the operating point</w:t>
+      </w:r>
+      <w:r>
+        <w:t xml:space="preserve"> </w:t>
+      </w:r>
+      <w:r>
+        <w:t xml:space="preserve">is never retimed to zero. Overflow or loss of strict ordering at native floating</w:t>
+      </w:r>
+      <w:r>
+        <w:t xml:space="preserve"> </w:t>
+      </w:r>
+      <w:r>
+        <w:t xml:space="preserve">point precision is rejected. Requested intervals and an explicitly supplied</w:t>
+      </w:r>
+      <w:r>
+        <w:t xml:space="preserve"> </w:t>
+      </w:r>
+      <w:r>
+        <w:t xml:space="preserve">solver step must also survive translation to the native epoch within the larger</w:t>
+      </w:r>
+      <w:r>
+        <w:t xml:space="preserve"> </w:t>
+      </w:r>
+      <w:r>
+        <w:t xml:space="preserve">of 1e-9 relative interval error or 64 ULPs of that interval. Epoch ULPs never</w:t>
+      </w:r>
+      <w:r>
+        <w:t xml:space="preserve"> </w:t>
+      </w:r>
+      <w:r>
+        <w:t xml:space="preserve">relax this policy. Consumers must check effective native solver precision too. Physical input units, muscle excitation versus</w:t>
+      </w:r>
+      <w:r>
+        <w:t xml:space="preserve"> </w:t>
+      </w:r>
+      <w:r>
+        <w:t xml:space="preserve">activation, force versus command, and explicit contact identity remain governed</w:t>
+      </w:r>
+      <w:r>
+        <w:t xml:space="preserve"> </w:t>
+      </w:r>
+      <w:r>
+        <w:t xml:space="preserve">by the shared</w:t>
+      </w:r>
+      <w:r>
+        <w:t xml:space="preserve"> </w:t>
+      </w:r>
+      <w:r>
+        <w:rPr>
+          <w:rStyle w:val="VerbatimChar"/>
+        </w:rPr>
+        <w:t xml:space="preserve">InputHistory</w:t>
+      </w:r>
+      <w:r>
+        <w:t xml:space="preserve"> </w:t>
+      </w:r>
+      <w:r>
+        <w:t xml:space="preserve">and</w:t>
+      </w:r>
+      <w:r>
+        <w:t xml:space="preserve"> </w:t>
+      </w:r>
+      <w:r>
+        <w:rPr>
+          <w:rStyle w:val="VerbatimChar"/>
+        </w:rPr>
+        <w:t xml:space="preserve">ReplayExecutionPolicy</w:t>
+      </w:r>
+      <w:r>
+        <w:t xml:space="preserve"> </w:t>
+      </w:r>
+      <w:r>
+        <w:t xml:space="preserve">contracts.</w:t>
+      </w:r>
+    </w:p>
+    <w:bookmarkEnd w:id="95"/>
+    <w:bookmarkStart w:id="96" w:name="integrity-and-failure-semantics"/>
+    <w:p>
+      <w:pPr>
+        <w:pStyle w:val="Heading2"/>
+      </w:pPr>
+      <w:r>
+        <w:t xml:space="preserve">Integrity and Failure Semantics</w:t>
+      </w:r>
+    </w:p>
+    <w:p>
+      <w:pPr>
+        <w:pStyle w:val="FirstParagraph"/>
+      </w:pPr>
+      <w:r>
+        <w:rPr>
+          <w:rStyle w:val="VerbatimChar"/>
+        </w:rPr>
+        <w:t xml:space="preserve">NativeReplayIntegrity</w:t>
+      </w:r>
+      <w:r>
+        <w:t xml:space="preserve"> </w:t>
+      </w:r>
+      <w:r>
+        <w:t xml:space="preserve">retains shared component hashes and adds an entire</w:t>
+      </w:r>
+      <w:r>
+        <w:t xml:space="preserve"> </w:t>
+      </w:r>
+      <w:r>
+        <w:t xml:space="preserve">envelope digest, including experiment identity. Strict JSON rejects duplicate</w:t>
+      </w:r>
+      <w:r>
+        <w:t xml:space="preserve"> </w:t>
+      </w:r>
+      <w:r>
+        <w:t xml:space="preserve">or unknown fields, unsupported versions and stale integrity. Capability</w:t>
+      </w:r>
+      <w:r>
+        <w:t xml:space="preserve"> </w:t>
+      </w:r>
+      <w:r>
+        <w:t xml:space="preserve">availability remains distinct from declared support; required unavailable or</w:t>
+      </w:r>
+      <w:r>
+        <w:t xml:space="preserve"> </w:t>
+      </w:r>
+      <w:r>
+        <w:t xml:space="preserve">unsupported capabilities remain blockers. Metadata equality does not prove a</w:t>
+      </w:r>
+      <w:r>
+        <w:t xml:space="preserve"> </w:t>
+      </w:r>
+      <w:r>
+        <w:t xml:space="preserve">native engine followed the declared policy.</w:t>
+      </w:r>
+    </w:p>
+    <w:bookmarkEnd w:id="96"/>
+    <w:bookmarkStart w:id="97" w:name="native-consumer-requirements"/>
+    <w:p>
+      <w:pPr>
+        <w:pStyle w:val="Heading2"/>
+      </w:pPr>
+      <w:r>
+        <w:t xml:space="preserve">Native Consumer Requirements</w:t>
+      </w:r>
+    </w:p>
+    <w:p>
+      <w:pPr>
+        <w:pStyle w:val="FirstParagraph"/>
+      </w:pPr>
+      <w:r>
+        <w:t xml:space="preserve">For R2025b, preserve hidden Simscape/block state, solver/execution state and</w:t>
+      </w:r>
+      <w:r>
+        <w:t xml:space="preserve"> </w:t>
+      </w:r>
+      <w:r>
+        <w:t xml:space="preserve">operating-point compatibility. Disable block reduction before capture and bind</w:t>
+      </w:r>
+      <w:r>
+        <w:t xml:space="preserve"> </w:t>
+      </w:r>
+      <w:r>
+        <w:t xml:space="preserve">effective solver settings rather than unresolved UI values such as</w:t>
+      </w:r>
+      <w:r>
+        <w:t xml:space="preserve"> </w:t>
+      </w:r>
+      <w:r>
+        <w:rPr>
+          <w:rStyle w:val="VerbatimChar"/>
+        </w:rPr>
+        <w:t xml:space="preserve">auto</w:t>
+      </w:r>
+      <w:r>
+        <w:t xml:space="preserve">.</w:t>
+      </w:r>
+      <w:r>
+        <w:t xml:space="preserve"> </w:t>
+      </w:r>
+      <w:r>
+        <w:t xml:space="preserve">Verify a nonzero-time saved/reloaded restart against uninterrupted native</w:t>
+      </w:r>
+      <w:r>
+        <w:t xml:space="preserve"> </w:t>
+      </w:r>
+      <w:r>
+        <w:t xml:space="preserve">integration, including discrete/hidden state. Preserve wrong model/runtime/time,</w:t>
+      </w:r>
+      <w:r>
+        <w:t xml:space="preserve"> </w:t>
+      </w:r>
+      <w:r>
+        <w:t xml:space="preserve">tampered or missing blob, stale artifact and observable-downgrade negatives.</w:t>
+      </w:r>
+      <w:r>
+        <w:t xml:space="preserve"> </w:t>
+      </w:r>
+      <w:r>
+        <w:t xml:space="preserve">No state reset is permitted during the requested saved-input replay horizon.</w:t>
+      </w:r>
+    </w:p>
+    <w:bookmarkEnd w:id="97"/>
+    <w:bookmarkStart w:id="98" w:name="evidence-and-remaining-work"/>
+    <w:p>
+      <w:pPr>
+        <w:pStyle w:val="Heading2"/>
+      </w:pPr>
+      <w:r>
+        <w:t xml:space="preserve">Evidence and Remaining Work</w:t>
+      </w:r>
+    </w:p>
+    <w:p>
+      <w:pPr>
+        <w:pStyle w:val="FirstParagraph"/>
+      </w:pPr>
+      <w:r>
+        <w:t xml:space="preserve">Initial missing-module, coercion, public-facade, duplicate-key and experiment</w:t>
+      </w:r>
+      <w:r>
+        <w:t xml:space="preserve"> </w:t>
+      </w:r>
+      <w:r>
+        <w:t xml:space="preserve">identity failures were observed before fixes. The current focused suite passes</w:t>
+      </w:r>
+      <w:r>
+        <w:t xml:space="preserve"> </w:t>
+      </w:r>
+      <w:r>
+        <w:t xml:space="preserve">77 tests, including 23 unchanged numeric T01 tests and 11 native JSON Schema tests. Astra review supplied</w:t>
+      </w:r>
+      <w:r>
+        <w:t xml:space="preserve"> </w:t>
+      </w:r>
+      <w:r>
+        <w:t xml:space="preserve">reproduced string-channel coercion and large-epoch interval-retiming negatives;</w:t>
+      </w:r>
+      <w:r>
+        <w:t xml:space="preserve"> </w:t>
+      </w:r>
+      <w:r>
+        <w:t xml:space="preserve">both failed before correction. Configured source typing passes. The schema reuses stable numeric-contract</w:t>
+      </w:r>
+      <w:r>
+        <w:t xml:space="preserve"> </w:t>
+      </w:r>
+      <w:r>
+        <w:t xml:space="preserve">definitions by local reference. The manual renderer uses the pinned toolchain;</w:t>
+      </w:r>
+      <w:r>
+        <w:t xml:space="preserve"> </w:t>
+      </w:r>
+      <w:r>
+        <w:t xml:space="preserve">QA inspects every actual page and rejects missing, duplicate or reordered page</w:t>
+      </w:r>
+      <w:r>
+        <w:t xml:space="preserve"> </w:t>
+      </w:r>
+      <w:r>
+        <w:t xml:space="preserve">records as the manual grows. Inventory/governance/normal hooks and actual</w:t>
+      </w:r>
+      <w:r>
+        <w:t xml:space="preserve"> </w:t>
+      </w:r>
+      <w:r>
+        <w:t xml:space="preserve">R2025b integration remain pending at this development checkpoint. This chapter</w:t>
+      </w:r>
+      <w:r>
+        <w:t xml:space="preserve"> </w:t>
+      </w:r>
+      <w:r>
+        <w:t xml:space="preserve">does not approve a scientific calculation or manual release.</w:t>
+      </w:r>
+    </w:p>
+    <w:bookmarkEnd w:id="98"/>
+    <w:bookmarkStart w:id="106" w:name="primary-references"/>
+    <w:p>
+      <w:pPr>
+        <w:pStyle w:val="Heading2"/>
+      </w:pPr>
+      <w:r>
+        <w:t xml:space="preserve">Primary References</w:t>
+      </w:r>
+    </w:p>
+    <w:p>
+      <w:pPr>
+        <w:pStyle w:val="FirstParagraph"/>
+      </w:pPr>
+      <w:hyperlink r:id="rId99">
+        <w:r>
+          <w:rPr>
+            <w:rStyle w:val="Hyperlink"/>
+          </w:rPr>
+          <w:t xml:space="preserve">MathWorks R2025b ModelOperatingPoint</w:t>
+        </w:r>
+      </w:hyperlink>
+      <w:r>
+        <w:t xml:space="preserve"> </w:t>
+      </w:r>
+      <w:r>
+        <w:t xml:space="preserve">defines native restart state and the read-only snapshot clock; its numeric</w:t>
+      </w:r>
+      <w:r>
+        <w:t xml:space="preserve"> </w:t>
+      </w:r>
+      <w:r>
+        <w:t xml:space="preserve">logged-state view excludes internal Simscape state.</w:t>
+      </w:r>
+      <w:r>
+        <w:t xml:space="preserve"> </w:t>
+      </w:r>
+      <w:hyperlink r:id="rId100">
+        <w:r>
+          <w:rPr>
+            <w:rStyle w:val="Hyperlink"/>
+          </w:rPr>
+          <w:t xml:space="preserve">MathWorks R2025b Operating-Point Workflow</w:t>
+        </w:r>
+      </w:hyperlink>
+      <w:r>
+        <w:t xml:space="preserve"> </w:t>
+      </w:r>
+      <w:r>
+        <w:t xml:space="preserve">documents compatibility and effective configuration constraints. These native</w:t>
+      </w:r>
+      <w:r>
+        <w:t xml:space="preserve"> </w:t>
+      </w:r>
+      <w:r>
+        <w:t xml:space="preserve">claims require separate actual execution evidence from UpstreamDrift.</w:t>
+      </w:r>
+    </w:p>
+    <w:bookmarkStart w:id="105" w:name="refs"/>
+    <w:bookmarkStart w:id="102" w:name="ref-pandoc-manual"/>
     <w:p>
       <w:pPr>
         <w:pStyle w:val="Bibliography"/>
@@ -6574,7 +7184,7 @@
       <w:r>
         <w:t xml:space="preserve"> </w:t>
       </w:r>
-      <w:hyperlink r:id="rId90">
+      <w:hyperlink r:id="rId101">
         <w:r>
           <w:rPr>
             <w:rStyle w:val="Hyperlink"/>
@@ -6586,8 +7196,8 @@
         <w:t xml:space="preserve">.</w:t>
       </w:r>
     </w:p>
-    <w:bookmarkEnd w:id="91"/>
-    <w:bookmarkStart w:id="93" w:name="ref-quarto-guide"/>
+    <w:bookmarkEnd w:id="102"/>
+    <w:bookmarkStart w:id="104" w:name="ref-quarto-guide"/>
     <w:p>
       <w:pPr>
         <w:pStyle w:val="Bibliography"/>
@@ -6611,7 +7221,7 @@
       <w:r>
         <w:t xml:space="preserve"> </w:t>
       </w:r>
-      <w:hyperlink r:id="rId92">
+      <w:hyperlink r:id="rId103">
         <w:r>
           <w:rPr>
             <w:rStyle w:val="Hyperlink"/>
@@ -6623,11 +7233,10 @@
         <w:t xml:space="preserve">.</w:t>
       </w:r>
     </w:p>
-    <w:bookmarkEnd w:id="93"/>
-    <w:bookmarkEnd w:id="94"/>
-    <w:bookmarkEnd w:id="95"/>
-    <w:bookmarkEnd w:id="96"/>
-    <w:bookmarkEnd w:id="97"/>
+    <w:bookmarkEnd w:id="104"/>
+    <w:bookmarkEnd w:id="105"/>
+    <w:bookmarkEnd w:id="106"/>
+    <w:bookmarkEnd w:id="107"/>
     <w:sectPr>
       <w:headerReference r:id="rId9" w:type="default"/>
       <w:footerReference r:id="rId10" w:type="default"/>

</xml_diff>

<commit_message>
fix(manual): tolerate PDF extractor line wrapping
</commit_message>
<xml_diff>
--- a/manuals/tools/dist/tools-engineering-design-manual.docx
+++ b/manuals/tools/dist/tools-engineering-design-manual.docx
@@ -1110,7 +1110,7 @@
     </w:p>
     <w:bookmarkEnd w:id="30"/>
     <w:bookmarkEnd w:id="31"/>
-    <w:bookmarkStart w:id="38" w:name="reproducible-rendering-contract"/>
+    <w:bookmarkStart w:id="39" w:name="reproducible-rendering-contract"/>
     <w:p>
       <w:pPr>
         <w:pStyle w:val="Heading1"/>
@@ -1482,14 +1482,13 @@
       </w:r>
     </w:p>
     <w:bookmarkEnd w:id="37"/>
-    <w:bookmarkEnd w:id="38"/>
-    <w:bookmarkStart w:id="39" w:name="references"/>
+    <w:bookmarkStart w:id="38" w:name="pdf-extractor-compatibility"/>
     <w:p>
       <w:pPr>
-        <w:pStyle w:val="Heading1"/>
-      </w:pPr>
-      <w:r>
-        <w:t xml:space="preserve">References</w:t>
+        <w:pStyle w:val="Heading2"/>
+      </w:pPr>
+      <w:r>
+        <w:t xml:space="preserve">PDF Extractor Compatibility</w:t>
       </w:r>
     </w:p>
     <w:p>
@@ -1497,6 +1496,67 @@
         <w:pStyle w:val="FirstParagraph"/>
       </w:pPr>
       <w:r>
+        <w:t xml:space="preserve">Live QA verifies the exact PDF byte digest and page count, ordered page</w:t>
+      </w:r>
+      <w:r>
+        <w:t xml:space="preserve"> </w:t>
+      </w:r>
+      <w:r>
+        <w:t xml:space="preserve">identity, normalized non-whitespace character count, first-line prefix, fonts,</w:t>
+      </w:r>
+      <w:r>
+        <w:t xml:space="preserve"> </w:t>
+      </w:r>
+      <w:r>
+        <w:t xml:space="preserve">bookmarks, images and annotations. Extracted line counts remain recorded</w:t>
+      </w:r>
+      <w:r>
+        <w:t xml:space="preserve"> </w:t>
+      </w:r>
+      <w:r>
+        <w:t xml:space="preserve">diagnostics: an extractor version can change line wrapping while the PDF bytes</w:t>
+      </w:r>
+      <w:r>
+        <w:t xml:space="preserve"> </w:t>
+      </w:r>
+      <w:r>
+        <w:t xml:space="preserve">and normalized text stay identical. Line counts do not participate in inventory</w:t>
+      </w:r>
+      <w:r>
+        <w:t xml:space="preserve"> </w:t>
+      </w:r>
+      <w:r>
+        <w:t xml:space="preserve">equality. Empty-page and unresolved-reference checks still fail closed.</w:t>
+      </w:r>
+      <w:r>
+        <w:t xml:space="preserve"> </w:t>
+      </w:r>
+      <w:r>
+        <w:t xml:space="preserve">Regression tests preserve equality under body rewrapping and verify the existing</w:t>
+      </w:r>
+      <w:r>
+        <w:t xml:space="preserve"> </w:t>
+      </w:r>
+      <w:r>
+        <w:t xml:space="preserve">ledger with the CI extractor. No rendered artifact is edited by this policy.</w:t>
+      </w:r>
+    </w:p>
+    <w:bookmarkEnd w:id="38"/>
+    <w:bookmarkEnd w:id="39"/>
+    <w:bookmarkStart w:id="40" w:name="references"/>
+    <w:p>
+      <w:pPr>
+        <w:pStyle w:val="Heading1"/>
+      </w:pPr>
+      <w:r>
+        <w:t xml:space="preserve">References</w:t>
+      </w:r>
+    </w:p>
+    <w:p>
+      <w:pPr>
+        <w:pStyle w:val="FirstParagraph"/>
+      </w:pPr>
+      <w:r>
         <w:t xml:space="preserve">The cited Pandoc and Quarto records are resolved from the governed bibliography</w:t>
       </w:r>
       <w:r>
@@ -1512,8 +1572,8 @@
         <w:t xml:space="preserve">qualified render.</w:t>
       </w:r>
     </w:p>
-    <w:bookmarkEnd w:id="39"/>
-    <w:bookmarkStart w:id="46" w:name="required-textbook-chapter-contract"/>
+    <w:bookmarkEnd w:id="40"/>
+    <w:bookmarkStart w:id="47" w:name="required-textbook-chapter-contract"/>
     <w:p>
       <w:pPr>
         <w:pStyle w:val="Heading1"/>
@@ -1522,7 +1582,7 @@
         <w:t xml:space="preserve">Required Textbook Chapter Contract</w:t>
       </w:r>
     </w:p>
-    <w:bookmarkStart w:id="40" w:name="outcome-and-authority-1"/>
+    <w:bookmarkStart w:id="41" w:name="outcome-and-authority-1"/>
     <w:p>
       <w:pPr>
         <w:pStyle w:val="Heading2"/>
@@ -1645,8 +1705,8 @@
         <w:t xml:space="preserve">content.</w:t>
       </w:r>
     </w:p>
-    <w:bookmarkEnd w:id="40"/>
-    <w:bookmarkStart w:id="41" w:name="required-chapter-anatomy"/>
+    <w:bookmarkEnd w:id="41"/>
+    <w:bookmarkStart w:id="42" w:name="required-chapter-anatomy"/>
     <w:p>
       <w:pPr>
         <w:pStyle w:val="Heading2"/>
@@ -1731,8 +1791,8 @@
         <w:t xml:space="preserve">failure.</w:t>
       </w:r>
     </w:p>
-    <w:bookmarkEnd w:id="41"/>
-    <w:bookmarkStart w:id="42" w:name="registration-and-traceability"/>
+    <w:bookmarkEnd w:id="42"/>
+    <w:bookmarkStart w:id="43" w:name="registration-and-traceability"/>
     <w:p>
       <w:pPr>
         <w:pStyle w:val="Heading2"/>
@@ -1856,8 +1916,8 @@
         <w:t xml:space="preserve">.</w:t>
       </w:r>
     </w:p>
-    <w:bookmarkEnd w:id="42"/>
-    <w:bookmarkStart w:id="43" w:name="linter-algorithm-and-evidence"/>
+    <w:bookmarkEnd w:id="43"/>
+    <w:bookmarkStart w:id="44" w:name="linter-algorithm-and-evidence"/>
     <w:p>
       <w:pPr>
         <w:pStyle w:val="Heading2"/>
@@ -2128,8 +2188,8 @@
         <w:t xml:space="preserve">approval or an immutable publication digest.</w:t>
       </w:r>
     </w:p>
-    <w:bookmarkEnd w:id="43"/>
-    <w:bookmarkStart w:id="44" w:name="failure-and-ownership-boundaries"/>
+    <w:bookmarkEnd w:id="44"/>
+    <w:bookmarkStart w:id="45" w:name="failure-and-ownership-boundaries"/>
     <w:p>
       <w:pPr>
         <w:pStyle w:val="Heading2"/>
@@ -2202,8 +2262,8 @@
         <w:t xml:space="preserve">approval.</w:t>
       </w:r>
     </w:p>
-    <w:bookmarkEnd w:id="44"/>
-    <w:bookmarkStart w:id="45" w:name="consumer-workflow"/>
+    <w:bookmarkEnd w:id="45"/>
+    <w:bookmarkStart w:id="46" w:name="consumer-workflow"/>
     <w:p>
       <w:pPr>
         <w:pStyle w:val="Heading2"/>
@@ -2312,9 +2372,9 @@
         <w:br w:type="page"/>
       </w:r>
     </w:p>
-    <w:bookmarkEnd w:id="45"/>
     <w:bookmarkEnd w:id="46"/>
-    <w:bookmarkStart w:id="92" w:name="swing-rate-of-closure-d-plane-exemplar"/>
+    <w:bookmarkEnd w:id="47"/>
+    <w:bookmarkStart w:id="93" w:name="swing-rate-of-closure-d-plane-exemplar"/>
     <w:p>
       <w:pPr>
         <w:pStyle w:val="Heading1"/>
@@ -2323,7 +2383,7 @@
         <w:t xml:space="preserve">Swing and Rate-of-Closure D-Plane Geometry</w:t>
       </w:r>
     </w:p>
-    <w:bookmarkStart w:id="47" w:name="purpose-and-scope"/>
+    <w:bookmarkStart w:id="48" w:name="purpose-and-scope"/>
     <w:p>
       <w:pPr>
         <w:pStyle w:val="Heading2"/>
@@ -2397,8 +2457,8 @@
         <w:t xml:space="preserve">decision. The calculation and rendered artifacts are verified-unapproved.</w:t>
       </w:r>
     </w:p>
-    <w:bookmarkEnd w:id="47"/>
-    <w:bookmarkStart w:id="51" w:name="design-by-contract"/>
+    <w:bookmarkEnd w:id="48"/>
+    <w:bookmarkStart w:id="52" w:name="design-by-contract"/>
     <w:p>
       <w:pPr>
         <w:pStyle w:val="Heading2"/>
@@ -2407,7 +2467,7 @@
         <w:t xml:space="preserve">Design by Contract</w:t>
       </w:r>
     </w:p>
-    <w:bookmarkStart w:id="48" w:name="preconditions"/>
+    <w:bookmarkStart w:id="49" w:name="preconditions"/>
     <w:p>
       <w:pPr>
         <w:pStyle w:val="Heading3"/>
@@ -2530,8 +2590,8 @@
         <w:t xml:space="preserve">consistent pose, twist, club, scenario, and inspection-event records.</w:t>
       </w:r>
     </w:p>
-    <w:bookmarkEnd w:id="48"/>
-    <w:bookmarkStart w:id="49" w:name="postconditions"/>
+    <w:bookmarkEnd w:id="49"/>
+    <w:bookmarkStart w:id="50" w:name="postconditions"/>
     <w:p>
       <w:pPr>
         <w:pStyle w:val="Heading3"/>
@@ -2604,8 +2664,8 @@
         <w:t xml:space="preserve">plane, horizontal heading, or face-to-path result.</w:t>
       </w:r>
     </w:p>
-    <w:bookmarkEnd w:id="49"/>
-    <w:bookmarkStart w:id="50" w:name="invariants"/>
+    <w:bookmarkEnd w:id="50"/>
+    <w:bookmarkStart w:id="51" w:name="invariants"/>
     <w:p>
       <w:pPr>
         <w:pStyle w:val="Heading3"/>
@@ -2646,9 +2706,9 @@
         <w:t xml:space="preserve">geometry because only direction enters the method.</w:t>
       </w:r>
     </w:p>
-    <w:bookmarkEnd w:id="50"/>
     <w:bookmarkEnd w:id="51"/>
-    <w:bookmarkStart w:id="56" w:name="coordinates-frames-and-time"/>
+    <w:bookmarkEnd w:id="52"/>
+    <w:bookmarkStart w:id="57" w:name="coordinates-frames-and-time"/>
     <w:p>
       <w:pPr>
         <w:pStyle w:val="Heading2"/>
@@ -2657,7 +2717,7 @@
         <w:t xml:space="preserve">Coordinates, Frames, and Time</w:t>
       </w:r>
     </w:p>
-    <w:bookmarkStart w:id="53" w:name="coordinate-frames"/>
+    <w:bookmarkStart w:id="54" w:name="coordinate-frames"/>
     <w:p>
       <w:pPr>
         <w:pStyle w:val="Heading3"/>
@@ -2670,8 +2730,8 @@
       <w:pPr>
         <w:pStyle w:val="FirstParagraph"/>
       </w:pPr>
-      <w:bookmarkStart w:id="52" w:name="dplane-coordinate-frame"/>
-      <w:bookmarkEnd w:id="52"/>
+      <w:bookmarkStart w:id="53" w:name="dplane-coordinate-frame"/>
+      <w:bookmarkEnd w:id="53"/>
     </w:p>
     <w:p>
       <w:pPr>
@@ -2875,8 +2935,8 @@
         <w:t xml:space="preserve">then expresses reference, face-center, and contact vectors in this same frame.</w:t>
       </w:r>
     </w:p>
-    <w:bookmarkEnd w:id="53"/>
-    <w:bookmarkStart w:id="54" w:name="axis-and-handedness"/>
+    <w:bookmarkEnd w:id="54"/>
+    <w:bookmarkStart w:id="55" w:name="axis-and-handedness"/>
     <w:p>
       <w:pPr>
         <w:pStyle w:val="Heading3"/>
@@ -2911,8 +2971,8 @@
         <w:t xml:space="preserve">normal is travel-times-face, so its orientation also depends on declared order.</w:t>
       </w:r>
     </w:p>
-    <w:bookmarkEnd w:id="54"/>
-    <w:bookmarkStart w:id="55" w:name="time-convention"/>
+    <w:bookmarkEnd w:id="55"/>
+    <w:bookmarkStart w:id="56" w:name="time-convention"/>
     <w:p>
       <w:pPr>
         <w:pStyle w:val="Heading3"/>
@@ -2959,9 +3019,9 @@
         <w:t xml:space="preserve">fallback. A miss remains a closest-approach event and is not relabeled impact.</w:t>
       </w:r>
     </w:p>
-    <w:bookmarkEnd w:id="55"/>
     <w:bookmarkEnd w:id="56"/>
-    <w:bookmarkStart w:id="59" w:name="units-and-dimensions"/>
+    <w:bookmarkEnd w:id="57"/>
+    <w:bookmarkStart w:id="60" w:name="units-and-dimensions"/>
     <w:p>
       <w:pPr>
         <w:pStyle w:val="Heading2"/>
@@ -2970,7 +3030,7 @@
         <w:t xml:space="preserve">Units and Dimensions</w:t>
       </w:r>
     </w:p>
-    <w:bookmarkStart w:id="57" w:name="symbol-and-unit-table"/>
+    <w:bookmarkStart w:id="58" w:name="symbol-and-unit-table"/>
     <w:p>
       <w:pPr>
         <w:pStyle w:val="Heading3"/>
@@ -3388,8 +3448,8 @@
         </w:tc>
       </w:tr>
     </w:tbl>
-    <w:bookmarkEnd w:id="57"/>
-    <w:bookmarkStart w:id="58" w:name="dimensional-checks"/>
+    <w:bookmarkEnd w:id="58"/>
+    <w:bookmarkStart w:id="59" w:name="dimensional-checks"/>
     <w:p>
       <w:pPr>
         <w:pStyle w:val="Heading3"/>
@@ -3568,9 +3628,9 @@
         <w:t xml:space="preserve">, and multiplying by metres produces m/s.</w:t>
       </w:r>
     </w:p>
-    <w:bookmarkEnd w:id="58"/>
     <w:bookmarkEnd w:id="59"/>
-    <w:bookmarkStart w:id="64" w:name="derivation-and-assumptions"/>
+    <w:bookmarkEnd w:id="60"/>
+    <w:bookmarkStart w:id="65" w:name="derivation-and-assumptions"/>
     <w:p>
       <w:pPr>
         <w:pStyle w:val="Heading2"/>
@@ -3579,7 +3639,7 @@
         <w:t xml:space="preserve">Derivation and Assumptions</w:t>
       </w:r>
     </w:p>
-    <w:bookmarkStart w:id="60" w:name="assumptions"/>
+    <w:bookmarkStart w:id="61" w:name="assumptions"/>
     <w:p>
       <w:pPr>
         <w:pStyle w:val="Heading3"/>
@@ -3626,8 +3686,8 @@
         <w:t xml:space="preserve">angular components followed by translational components.</w:t>
       </w:r>
     </w:p>
-    <w:bookmarkEnd w:id="60"/>
-    <w:bookmarkStart w:id="63" w:name="derivation"/>
+    <w:bookmarkEnd w:id="61"/>
+    <w:bookmarkStart w:id="64" w:name="derivation"/>
     <w:p>
       <w:pPr>
         <w:pStyle w:val="Heading3"/>
@@ -3788,8 +3848,8 @@
       <w:pPr>
         <w:pStyle w:val="BodyText"/>
       </w:pPr>
-      <w:bookmarkStart w:id="61" w:name="dplane-spin-loft-equation"/>
-      <w:bookmarkEnd w:id="61"/>
+      <w:bookmarkStart w:id="62" w:name="dplane-spin-loft-equation"/>
+      <w:bookmarkEnd w:id="62"/>
     </w:p>
     <w:p>
       <w:pPr>
@@ -3953,8 +4013,8 @@
       <w:pPr>
         <w:pStyle w:val="BodyText"/>
       </w:pPr>
-      <w:bookmarkStart w:id="62" w:name="dplane-normal-equation"/>
-      <w:bookmarkEnd w:id="62"/>
+      <w:bookmarkStart w:id="63" w:name="dplane-normal-equation"/>
+      <w:bookmarkEnd w:id="63"/>
     </w:p>
     <w:p>
       <w:pPr>
@@ -4453,9 +4513,9 @@
         <w:t xml:space="preserve">applying the same geometry.</w:t>
       </w:r>
     </w:p>
-    <w:bookmarkEnd w:id="63"/>
     <w:bookmarkEnd w:id="64"/>
-    <w:bookmarkStart w:id="68" w:name="algorithm"/>
+    <w:bookmarkEnd w:id="65"/>
+    <w:bookmarkStart w:id="69" w:name="algorithm"/>
     <w:p>
       <w:pPr>
         <w:pStyle w:val="Heading2"/>
@@ -4464,7 +4524,7 @@
         <w:t xml:space="preserve">Algorithm</w:t>
       </w:r>
     </w:p>
-    <w:bookmarkStart w:id="65" w:name="inputs"/>
+    <w:bookmarkStart w:id="66" w:name="inputs"/>
     <w:p>
       <w:pPr>
         <w:pStyle w:val="Heading3"/>
@@ -4583,8 +4643,8 @@
         <w:t xml:space="preserve">tangent rather than asking callers to assemble those values.</w:t>
       </w:r>
     </w:p>
-    <w:bookmarkEnd w:id="65"/>
-    <w:bookmarkStart w:id="66" w:name="procedure"/>
+    <w:bookmarkEnd w:id="66"/>
+    <w:bookmarkStart w:id="67" w:name="procedure"/>
     <w:p>
       <w:pPr>
         <w:pStyle w:val="Heading3"/>
@@ -4795,8 +4855,8 @@
         <w:t xml:space="preserve">unit directions.</w:t>
       </w:r>
     </w:p>
-    <w:bookmarkEnd w:id="66"/>
-    <w:bookmarkStart w:id="67" w:name="outputs"/>
+    <w:bookmarkEnd w:id="67"/>
+    <w:bookmarkStart w:id="68" w:name="outputs"/>
     <w:p>
       <w:pPr>
         <w:pStyle w:val="Heading3"/>
@@ -4861,9 +4921,9 @@
         <w:t xml:space="preserve">geometry basis, limitations, pose, and wedge-kinematics evidence.</w:t>
       </w:r>
     </w:p>
-    <w:bookmarkEnd w:id="67"/>
     <w:bookmarkEnd w:id="68"/>
-    <w:bookmarkStart w:id="71" w:name="implementation-symbols"/>
+    <w:bookmarkEnd w:id="69"/>
+    <w:bookmarkStart w:id="72" w:name="implementation-symbols"/>
     <w:p>
       <w:pPr>
         <w:pStyle w:val="Heading2"/>
@@ -4872,7 +4932,7 @@
         <w:t xml:space="preserve">Implementation Symbols</w:t>
       </w:r>
     </w:p>
-    <w:bookmarkStart w:id="69" w:name="public-symbols"/>
+    <w:bookmarkStart w:id="70" w:name="public-symbols"/>
     <w:p>
       <w:pPr>
         <w:pStyle w:val="Heading3"/>
@@ -5012,8 +5072,8 @@
         <w:t xml:space="preserve">.</w:t>
       </w:r>
     </w:p>
-    <w:bookmarkEnd w:id="69"/>
-    <w:bookmarkStart w:id="70" w:name="source-mapping"/>
+    <w:bookmarkEnd w:id="70"/>
+    <w:bookmarkStart w:id="71" w:name="source-mapping"/>
     <w:p>
       <w:pPr>
         <w:pStyle w:val="Heading3"/>
@@ -5105,9 +5165,9 @@
         <w:t xml:space="preserve">IDs and public symbols remain recorded in the module inventory.</w:t>
       </w:r>
     </w:p>
-    <w:bookmarkEnd w:id="70"/>
     <w:bookmarkEnd w:id="71"/>
-    <w:bookmarkStart w:id="74" w:name="error-and-failure-semantics"/>
+    <w:bookmarkEnd w:id="72"/>
+    <w:bookmarkStart w:id="75" w:name="error-and-failure-semantics"/>
     <w:p>
       <w:pPr>
         <w:pStyle w:val="Heading2"/>
@@ -5116,7 +5176,7 @@
         <w:t xml:space="preserve">Error and Failure Semantics</w:t>
       </w:r>
     </w:p>
-    <w:bookmarkStart w:id="72" w:name="error-conditions"/>
+    <w:bookmarkStart w:id="73" w:name="error-conditions"/>
     <w:p>
       <w:pPr>
         <w:pStyle w:val="Heading3"/>
@@ -5193,8 +5253,8 @@
         <w:t xml:space="preserve">from valid singular geometry.</w:t>
       </w:r>
     </w:p>
-    <w:bookmarkEnd w:id="72"/>
-    <w:bookmarkStart w:id="73" w:name="recovery-and-cancellation"/>
+    <w:bookmarkEnd w:id="73"/>
+    <w:bookmarkStart w:id="74" w:name="recovery-and-cancellation"/>
     <w:p>
       <w:pPr>
         <w:pStyle w:val="Heading3"/>
@@ -5235,9 +5295,9 @@
         <w:t xml:space="preserve">Higher-level cancellation occurs before calls or between complete runs.</w:t>
       </w:r>
     </w:p>
-    <w:bookmarkEnd w:id="73"/>
     <w:bookmarkEnd w:id="74"/>
-    <w:bookmarkStart w:id="77" w:name="uncertainty-and-sensitivity"/>
+    <w:bookmarkEnd w:id="75"/>
+    <w:bookmarkStart w:id="78" w:name="uncertainty-and-sensitivity"/>
     <w:p>
       <w:pPr>
         <w:pStyle w:val="Heading2"/>
@@ -5246,7 +5306,7 @@
         <w:t xml:space="preserve">Uncertainty and Sensitivity</w:t>
       </w:r>
     </w:p>
-    <w:bookmarkStart w:id="75" w:name="uncertainty-sources"/>
+    <w:bookmarkStart w:id="76" w:name="uncertainty-sources"/>
     <w:p>
       <w:pPr>
         <w:pStyle w:val="Heading3"/>
@@ -5287,8 +5347,8 @@
         <w:t xml:space="preserve">model. Angles therefore remain model-conditioned rather than observed truth.</w:t>
       </w:r>
     </w:p>
-    <w:bookmarkEnd w:id="75"/>
-    <w:bookmarkStart w:id="76" w:name="sensitivity"/>
+    <w:bookmarkEnd w:id="76"/>
+    <w:bookmarkStart w:id="77" w:name="sensitivity"/>
     <w:p>
       <w:pPr>
         <w:pStyle w:val="Heading3"/>
@@ -5329,9 +5389,9 @@
         <w:t xml:space="preserve">typed status; downstream code must not carry forward a prior frame’s plane.</w:t>
       </w:r>
     </w:p>
-    <w:bookmarkEnd w:id="76"/>
     <w:bookmarkEnd w:id="77"/>
-    <w:bookmarkStart w:id="80" w:name="verification-and-validation"/>
+    <w:bookmarkEnd w:id="78"/>
+    <w:bookmarkStart w:id="81" w:name="verification-and-validation"/>
     <w:p>
       <w:pPr>
         <w:pStyle w:val="Heading2"/>
@@ -5340,7 +5400,7 @@
         <w:t xml:space="preserve">Verification and Validation</w:t>
       </w:r>
     </w:p>
-    <w:bookmarkStart w:id="78" w:name="test-evidence"/>
+    <w:bookmarkStart w:id="79" w:name="test-evidence"/>
     <w:p>
       <w:pPr>
         <w:pStyle w:val="Heading3"/>
@@ -5493,8 +5553,8 @@
         <w:t xml:space="preserve">normalizes that value for its face-center D-plane.</w:t>
       </w:r>
     </w:p>
-    <w:bookmarkEnd w:id="78"/>
-    <w:bookmarkStart w:id="79" w:name="acceptance-criteria"/>
+    <w:bookmarkEnd w:id="79"/>
+    <w:bookmarkStart w:id="80" w:name="acceptance-criteria"/>
     <w:p>
       <w:pPr>
         <w:pStyle w:val="Heading3"/>
@@ -5535,9 +5595,9 @@
         <w:t xml:space="preserve">reproduction, not scientific or publication approval.</w:t>
       </w:r>
     </w:p>
-    <w:bookmarkEnd w:id="79"/>
     <w:bookmarkEnd w:id="80"/>
-    <w:bookmarkStart w:id="83" w:name="limits-and-applicability"/>
+    <w:bookmarkEnd w:id="81"/>
+    <w:bookmarkStart w:id="84" w:name="limits-and-applicability"/>
     <w:p>
       <w:pPr>
         <w:pStyle w:val="Heading2"/>
@@ -5546,7 +5606,7 @@
         <w:t xml:space="preserve">Limits and Applicability</w:t>
       </w:r>
     </w:p>
-    <w:bookmarkStart w:id="81" w:name="validity-range"/>
+    <w:bookmarkStart w:id="82" w:name="validity-range"/>
     <w:p>
       <w:pPr>
         <w:pStyle w:val="Heading3"/>
@@ -5719,8 +5779,8 @@
         <w:t xml:space="preserve">-degree tolerance.</w:t>
       </w:r>
     </w:p>
-    <w:bookmarkEnd w:id="81"/>
-    <w:bookmarkStart w:id="82" w:name="known-limitations"/>
+    <w:bookmarkEnd w:id="82"/>
+    <w:bookmarkStart w:id="83" w:name="known-limitations"/>
     <w:p>
       <w:pPr>
         <w:pStyle w:val="Heading3"/>
@@ -5773,9 +5833,9 @@
         <w:t xml:space="preserve">no markerless module exists on this D3 base. Unmerged content is not promoted.</w:t>
       </w:r>
     </w:p>
-    <w:bookmarkEnd w:id="82"/>
     <w:bookmarkEnd w:id="83"/>
-    <w:bookmarkStart w:id="86" w:name="worked-examples"/>
+    <w:bookmarkEnd w:id="84"/>
+    <w:bookmarkStart w:id="87" w:name="worked-examples"/>
     <w:p>
       <w:pPr>
         <w:pStyle w:val="Heading2"/>
@@ -5784,7 +5844,7 @@
         <w:t xml:space="preserve">Worked Examples</w:t>
       </w:r>
     </w:p>
-    <w:bookmarkStart w:id="84" w:name="example-inputs"/>
+    <w:bookmarkStart w:id="85" w:name="example-inputs"/>
     <w:p>
       <w:pPr>
         <w:pStyle w:val="Heading3"/>
@@ -6067,8 +6127,8 @@
         <w:t xml:space="preserve">degree.</w:t>
       </w:r>
     </w:p>
-    <w:bookmarkEnd w:id="84"/>
-    <w:bookmarkStart w:id="85" w:name="example-results"/>
+    <w:bookmarkEnd w:id="85"/>
+    <w:bookmarkStart w:id="86" w:name="example-results"/>
     <w:p>
       <w:pPr>
         <w:pStyle w:val="Heading3"/>
@@ -6361,9 +6421,9 @@
         <w:t xml:space="preserve">cross-client golden fixture and executable Python test, not renderer-only text.</w:t>
       </w:r>
     </w:p>
-    <w:bookmarkEnd w:id="85"/>
     <w:bookmarkEnd w:id="86"/>
-    <w:bookmarkStart w:id="89" w:name="references-and-provenance"/>
+    <w:bookmarkEnd w:id="87"/>
+    <w:bookmarkStart w:id="90" w:name="references-and-provenance"/>
     <w:p>
       <w:pPr>
         <w:pStyle w:val="Heading2"/>
@@ -6372,7 +6432,7 @@
         <w:t xml:space="preserve">References and Provenance</w:t>
       </w:r>
     </w:p>
-    <w:bookmarkStart w:id="87" w:name="references-1"/>
+    <w:bookmarkStart w:id="88" w:name="references-1"/>
     <w:p>
       <w:pPr>
         <w:pStyle w:val="Heading3"/>
@@ -6431,8 +6491,8 @@
         <w:t xml:space="preserve">chapter makes no literature-backed ball-flight or equipment-performance claim.</w:t>
       </w:r>
     </w:p>
-    <w:bookmarkEnd w:id="87"/>
-    <w:bookmarkStart w:id="88" w:name="provenance"/>
+    <w:bookmarkEnd w:id="88"/>
+    <w:bookmarkStart w:id="89" w:name="provenance"/>
     <w:p>
       <w:pPr>
         <w:pStyle w:val="Heading3"/>
@@ -6497,9 +6557,9 @@
         <w:t xml:space="preserve">.</w:t>
       </w:r>
     </w:p>
-    <w:bookmarkEnd w:id="88"/>
     <w:bookmarkEnd w:id="89"/>
-    <w:bookmarkStart w:id="91" w:name="revision-history"/>
+    <w:bookmarkEnd w:id="90"/>
+    <w:bookmarkStart w:id="92" w:name="revision-history"/>
     <w:p>
       <w:pPr>
         <w:pStyle w:val="Heading2"/>
@@ -6508,7 +6568,7 @@
         <w:t xml:space="preserve">Revision History</w:t>
       </w:r>
     </w:p>
-    <w:bookmarkStart w:id="90" w:name="revision-record"/>
+    <w:bookmarkStart w:id="91" w:name="revision-record"/>
     <w:p>
       <w:pPr>
         <w:pStyle w:val="Heading3"/>
@@ -6549,10 +6609,10 @@
         <w:t xml:space="preserve">behavior changes, tests, provenance, limitations, and every generated artifact.</w:t>
       </w:r>
     </w:p>
-    <w:bookmarkEnd w:id="90"/>
     <w:bookmarkEnd w:id="91"/>
     <w:bookmarkEnd w:id="92"/>
-    <w:bookmarkStart w:id="107" w:name="Xf38ac95301459e28f388688aee8c1cf941b78a4"/>
+    <w:bookmarkEnd w:id="93"/>
+    <w:bookmarkStart w:id="108" w:name="Xf38ac95301459e28f388688aee8c1cf941b78a4"/>
     <w:p>
       <w:pPr>
         <w:pStyle w:val="Heading1"/>
@@ -6561,7 +6621,7 @@
         <w:t xml:space="preserve">Opaque Native Restart and Saved-Input Replay</w:t>
       </w:r>
     </w:p>
-    <w:bookmarkStart w:id="93" w:name="scope-and-authority"/>
+    <w:bookmarkStart w:id="94" w:name="scope-and-authority"/>
     <w:p>
       <w:pPr>
         <w:pStyle w:val="Heading2"/>
@@ -6649,8 +6709,8 @@
         <w:t xml:space="preserve">model coverage and acceptance. All required engine/model rows remain visible.</w:t>
       </w:r>
     </w:p>
-    <w:bookmarkEnd w:id="93"/>
-    <w:bookmarkStart w:id="94" w:name="state-model-and-runtime-identity"/>
+    <w:bookmarkEnd w:id="94"/>
+    <w:bookmarkStart w:id="95" w:name="state-model-and-runtime-identity"/>
     <w:p>
       <w:pPr>
         <w:pStyle w:val="Heading2"/>
@@ -6768,8 +6828,8 @@
         <w:t xml:space="preserve">state encoding, source-to-binary equivalence or transitive library closure.</w:t>
       </w:r>
     </w:p>
-    <w:bookmarkEnd w:id="94"/>
-    <w:bookmarkStart w:id="95" w:name="native-clock-and-input-boundary"/>
+    <w:bookmarkEnd w:id="95"/>
+    <w:bookmarkStart w:id="96" w:name="native-clock-and-input-boundary"/>
     <w:p>
       <w:pPr>
         <w:pStyle w:val="Heading2"/>
@@ -6906,8 +6966,8 @@
         <w:t xml:space="preserve">contracts.</w:t>
       </w:r>
     </w:p>
-    <w:bookmarkEnd w:id="95"/>
-    <w:bookmarkStart w:id="96" w:name="integrity-and-failure-semantics"/>
+    <w:bookmarkEnd w:id="96"/>
+    <w:bookmarkStart w:id="97" w:name="integrity-and-failure-semantics"/>
     <w:p>
       <w:pPr>
         <w:pStyle w:val="Heading2"/>
@@ -6963,8 +7023,8 @@
         <w:t xml:space="preserve">native engine followed the declared policy.</w:t>
       </w:r>
     </w:p>
-    <w:bookmarkEnd w:id="96"/>
-    <w:bookmarkStart w:id="97" w:name="native-consumer-requirements"/>
+    <w:bookmarkEnd w:id="97"/>
+    <w:bookmarkStart w:id="98" w:name="native-consumer-requirements"/>
     <w:p>
       <w:pPr>
         <w:pStyle w:val="Heading2"/>
@@ -7029,8 +7089,8 @@
         <w:t xml:space="preserve">No state reset is permitted during the requested saved-input replay horizon.</w:t>
       </w:r>
     </w:p>
-    <w:bookmarkEnd w:id="97"/>
-    <w:bookmarkStart w:id="98" w:name="evidence-and-remaining-work"/>
+    <w:bookmarkEnd w:id="98"/>
+    <w:bookmarkStart w:id="99" w:name="evidence-and-remaining-work"/>
     <w:p>
       <w:pPr>
         <w:pStyle w:val="Heading2"/>
@@ -7101,8 +7161,8 @@
         <w:t xml:space="preserve">does not approve a scientific calculation or manual release.</w:t>
       </w:r>
     </w:p>
-    <w:bookmarkEnd w:id="98"/>
-    <w:bookmarkStart w:id="106" w:name="primary-references"/>
+    <w:bookmarkEnd w:id="99"/>
+    <w:bookmarkStart w:id="107" w:name="primary-references"/>
     <w:p>
       <w:pPr>
         <w:pStyle w:val="Heading2"/>
@@ -7115,7 +7175,7 @@
       <w:pPr>
         <w:pStyle w:val="FirstParagraph"/>
       </w:pPr>
-      <w:hyperlink r:id="rId99">
+      <w:hyperlink r:id="rId100">
         <w:r>
           <w:rPr>
             <w:rStyle w:val="Hyperlink"/>
@@ -7138,7 +7198,7 @@
       <w:r>
         <w:t xml:space="preserve"> </w:t>
       </w:r>
-      <w:hyperlink r:id="rId100">
+      <w:hyperlink r:id="rId101">
         <w:r>
           <w:rPr>
             <w:rStyle w:val="Hyperlink"/>
@@ -7159,8 +7219,8 @@
         <w:t xml:space="preserve">claims require separate actual execution evidence from UpstreamDrift.</w:t>
       </w:r>
     </w:p>
-    <w:bookmarkStart w:id="105" w:name="refs"/>
-    <w:bookmarkStart w:id="102" w:name="ref-pandoc-manual"/>
+    <w:bookmarkStart w:id="106" w:name="refs"/>
+    <w:bookmarkStart w:id="103" w:name="ref-pandoc-manual"/>
     <w:p>
       <w:pPr>
         <w:pStyle w:val="Bibliography"/>
@@ -7184,7 +7244,7 @@
       <w:r>
         <w:t xml:space="preserve"> </w:t>
       </w:r>
-      <w:hyperlink r:id="rId101">
+      <w:hyperlink r:id="rId102">
         <w:r>
           <w:rPr>
             <w:rStyle w:val="Hyperlink"/>
@@ -7196,8 +7256,8 @@
         <w:t xml:space="preserve">.</w:t>
       </w:r>
     </w:p>
-    <w:bookmarkEnd w:id="102"/>
-    <w:bookmarkStart w:id="104" w:name="ref-quarto-guide"/>
+    <w:bookmarkEnd w:id="103"/>
+    <w:bookmarkStart w:id="105" w:name="ref-quarto-guide"/>
     <w:p>
       <w:pPr>
         <w:pStyle w:val="Bibliography"/>
@@ -7221,7 +7281,7 @@
       <w:r>
         <w:t xml:space="preserve"> </w:t>
       </w:r>
-      <w:hyperlink r:id="rId103">
+      <w:hyperlink r:id="rId104">
         <w:r>
           <w:rPr>
             <w:rStyle w:val="Hyperlink"/>
@@ -7233,10 +7293,10 @@
         <w:t xml:space="preserve">.</w:t>
       </w:r>
     </w:p>
-    <w:bookmarkEnd w:id="104"/>
     <w:bookmarkEnd w:id="105"/>
     <w:bookmarkEnd w:id="106"/>
     <w:bookmarkEnd w:id="107"/>
+    <w:bookmarkEnd w:id="108"/>
     <w:sectPr>
       <w:headerReference r:id="rId9" w:type="default"/>
       <w:footerReference r:id="rId10" w:type="default"/>

</xml_diff>

<commit_message>
fix(manual): preserve governance across source growth and extractor wrapping (#5473)
* test(manual): preserve governance as canonical chapters grow

* docs(governance): bind manual repair to PR5473

* fix(manual): tolerate PDF extractor line wrapping

* fix(ci): install XML safety dependency for manual governance

---------

Co-authored-by: codex-scheduled <codex-scheduled@users.noreply.github.com>
</commit_message>
<xml_diff>
--- a/manuals/tools/dist/tools-engineering-design-manual.docx
+++ b/manuals/tools/dist/tools-engineering-design-manual.docx
@@ -1110,7 +1110,7 @@
     </w:p>
     <w:bookmarkEnd w:id="30"/>
     <w:bookmarkEnd w:id="31"/>
-    <w:bookmarkStart w:id="38" w:name="reproducible-rendering-contract"/>
+    <w:bookmarkStart w:id="39" w:name="reproducible-rendering-contract"/>
     <w:p>
       <w:pPr>
         <w:pStyle w:val="Heading1"/>
@@ -1482,14 +1482,13 @@
       </w:r>
     </w:p>
     <w:bookmarkEnd w:id="37"/>
-    <w:bookmarkEnd w:id="38"/>
-    <w:bookmarkStart w:id="39" w:name="references"/>
+    <w:bookmarkStart w:id="38" w:name="pdf-extractor-compatibility"/>
     <w:p>
       <w:pPr>
-        <w:pStyle w:val="Heading1"/>
-      </w:pPr>
-      <w:r>
-        <w:t xml:space="preserve">References</w:t>
+        <w:pStyle w:val="Heading2"/>
+      </w:pPr>
+      <w:r>
+        <w:t xml:space="preserve">PDF Extractor Compatibility</w:t>
       </w:r>
     </w:p>
     <w:p>
@@ -1497,6 +1496,67 @@
         <w:pStyle w:val="FirstParagraph"/>
       </w:pPr>
       <w:r>
+        <w:t xml:space="preserve">Live QA verifies the exact PDF byte digest and page count, ordered page</w:t>
+      </w:r>
+      <w:r>
+        <w:t xml:space="preserve"> </w:t>
+      </w:r>
+      <w:r>
+        <w:t xml:space="preserve">identity, normalized non-whitespace character count, first-line prefix, fonts,</w:t>
+      </w:r>
+      <w:r>
+        <w:t xml:space="preserve"> </w:t>
+      </w:r>
+      <w:r>
+        <w:t xml:space="preserve">bookmarks, images and annotations. Extracted line counts remain recorded</w:t>
+      </w:r>
+      <w:r>
+        <w:t xml:space="preserve"> </w:t>
+      </w:r>
+      <w:r>
+        <w:t xml:space="preserve">diagnostics: an extractor version can change line wrapping while the PDF bytes</w:t>
+      </w:r>
+      <w:r>
+        <w:t xml:space="preserve"> </w:t>
+      </w:r>
+      <w:r>
+        <w:t xml:space="preserve">and normalized text stay identical. Line counts do not participate in inventory</w:t>
+      </w:r>
+      <w:r>
+        <w:t xml:space="preserve"> </w:t>
+      </w:r>
+      <w:r>
+        <w:t xml:space="preserve">equality. Empty-page and unresolved-reference checks still fail closed.</w:t>
+      </w:r>
+      <w:r>
+        <w:t xml:space="preserve"> </w:t>
+      </w:r>
+      <w:r>
+        <w:t xml:space="preserve">Regression tests preserve equality under body rewrapping and verify the existing</w:t>
+      </w:r>
+      <w:r>
+        <w:t xml:space="preserve"> </w:t>
+      </w:r>
+      <w:r>
+        <w:t xml:space="preserve">ledger with the CI extractor. No rendered artifact is edited by this policy.</w:t>
+      </w:r>
+    </w:p>
+    <w:bookmarkEnd w:id="38"/>
+    <w:bookmarkEnd w:id="39"/>
+    <w:bookmarkStart w:id="40" w:name="references"/>
+    <w:p>
+      <w:pPr>
+        <w:pStyle w:val="Heading1"/>
+      </w:pPr>
+      <w:r>
+        <w:t xml:space="preserve">References</w:t>
+      </w:r>
+    </w:p>
+    <w:p>
+      <w:pPr>
+        <w:pStyle w:val="FirstParagraph"/>
+      </w:pPr>
+      <w:r>
         <w:t xml:space="preserve">The cited Pandoc and Quarto records are resolved from the governed bibliography</w:t>
       </w:r>
       <w:r>
@@ -1512,8 +1572,8 @@
         <w:t xml:space="preserve">qualified render.</w:t>
       </w:r>
     </w:p>
-    <w:bookmarkEnd w:id="39"/>
-    <w:bookmarkStart w:id="46" w:name="required-textbook-chapter-contract"/>
+    <w:bookmarkEnd w:id="40"/>
+    <w:bookmarkStart w:id="47" w:name="required-textbook-chapter-contract"/>
     <w:p>
       <w:pPr>
         <w:pStyle w:val="Heading1"/>
@@ -1522,7 +1582,7 @@
         <w:t xml:space="preserve">Required Textbook Chapter Contract</w:t>
       </w:r>
     </w:p>
-    <w:bookmarkStart w:id="40" w:name="outcome-and-authority-1"/>
+    <w:bookmarkStart w:id="41" w:name="outcome-and-authority-1"/>
     <w:p>
       <w:pPr>
         <w:pStyle w:val="Heading2"/>
@@ -1645,8 +1705,8 @@
         <w:t xml:space="preserve">content.</w:t>
       </w:r>
     </w:p>
-    <w:bookmarkEnd w:id="40"/>
-    <w:bookmarkStart w:id="41" w:name="required-chapter-anatomy"/>
+    <w:bookmarkEnd w:id="41"/>
+    <w:bookmarkStart w:id="42" w:name="required-chapter-anatomy"/>
     <w:p>
       <w:pPr>
         <w:pStyle w:val="Heading2"/>
@@ -1731,8 +1791,8 @@
         <w:t xml:space="preserve">failure.</w:t>
       </w:r>
     </w:p>
-    <w:bookmarkEnd w:id="41"/>
-    <w:bookmarkStart w:id="42" w:name="registration-and-traceability"/>
+    <w:bookmarkEnd w:id="42"/>
+    <w:bookmarkStart w:id="43" w:name="registration-and-traceability"/>
     <w:p>
       <w:pPr>
         <w:pStyle w:val="Heading2"/>
@@ -1856,8 +1916,8 @@
         <w:t xml:space="preserve">.</w:t>
       </w:r>
     </w:p>
-    <w:bookmarkEnd w:id="42"/>
-    <w:bookmarkStart w:id="43" w:name="linter-algorithm-and-evidence"/>
+    <w:bookmarkEnd w:id="43"/>
+    <w:bookmarkStart w:id="44" w:name="linter-algorithm-and-evidence"/>
     <w:p>
       <w:pPr>
         <w:pStyle w:val="Heading2"/>
@@ -2128,8 +2188,8 @@
         <w:t xml:space="preserve">approval or an immutable publication digest.</w:t>
       </w:r>
     </w:p>
-    <w:bookmarkEnd w:id="43"/>
-    <w:bookmarkStart w:id="44" w:name="failure-and-ownership-boundaries"/>
+    <w:bookmarkEnd w:id="44"/>
+    <w:bookmarkStart w:id="45" w:name="failure-and-ownership-boundaries"/>
     <w:p>
       <w:pPr>
         <w:pStyle w:val="Heading2"/>
@@ -2202,8 +2262,8 @@
         <w:t xml:space="preserve">approval.</w:t>
       </w:r>
     </w:p>
-    <w:bookmarkEnd w:id="44"/>
-    <w:bookmarkStart w:id="45" w:name="consumer-workflow"/>
+    <w:bookmarkEnd w:id="45"/>
+    <w:bookmarkStart w:id="46" w:name="consumer-workflow"/>
     <w:p>
       <w:pPr>
         <w:pStyle w:val="Heading2"/>
@@ -2312,9 +2372,9 @@
         <w:br w:type="page"/>
       </w:r>
     </w:p>
-    <w:bookmarkEnd w:id="45"/>
     <w:bookmarkEnd w:id="46"/>
-    <w:bookmarkStart w:id="92" w:name="swing-rate-of-closure-d-plane-exemplar"/>
+    <w:bookmarkEnd w:id="47"/>
+    <w:bookmarkStart w:id="93" w:name="swing-rate-of-closure-d-plane-exemplar"/>
     <w:p>
       <w:pPr>
         <w:pStyle w:val="Heading1"/>
@@ -2323,7 +2383,7 @@
         <w:t xml:space="preserve">Swing and Rate-of-Closure D-Plane Geometry</w:t>
       </w:r>
     </w:p>
-    <w:bookmarkStart w:id="47" w:name="purpose-and-scope"/>
+    <w:bookmarkStart w:id="48" w:name="purpose-and-scope"/>
     <w:p>
       <w:pPr>
         <w:pStyle w:val="Heading2"/>
@@ -2397,8 +2457,8 @@
         <w:t xml:space="preserve">decision. The calculation and rendered artifacts are verified-unapproved.</w:t>
       </w:r>
     </w:p>
-    <w:bookmarkEnd w:id="47"/>
-    <w:bookmarkStart w:id="51" w:name="design-by-contract"/>
+    <w:bookmarkEnd w:id="48"/>
+    <w:bookmarkStart w:id="52" w:name="design-by-contract"/>
     <w:p>
       <w:pPr>
         <w:pStyle w:val="Heading2"/>
@@ -2407,7 +2467,7 @@
         <w:t xml:space="preserve">Design by Contract</w:t>
       </w:r>
     </w:p>
-    <w:bookmarkStart w:id="48" w:name="preconditions"/>
+    <w:bookmarkStart w:id="49" w:name="preconditions"/>
     <w:p>
       <w:pPr>
         <w:pStyle w:val="Heading3"/>
@@ -2530,8 +2590,8 @@
         <w:t xml:space="preserve">consistent pose, twist, club, scenario, and inspection-event records.</w:t>
       </w:r>
     </w:p>
-    <w:bookmarkEnd w:id="48"/>
-    <w:bookmarkStart w:id="49" w:name="postconditions"/>
+    <w:bookmarkEnd w:id="49"/>
+    <w:bookmarkStart w:id="50" w:name="postconditions"/>
     <w:p>
       <w:pPr>
         <w:pStyle w:val="Heading3"/>
@@ -2604,8 +2664,8 @@
         <w:t xml:space="preserve">plane, horizontal heading, or face-to-path result.</w:t>
       </w:r>
     </w:p>
-    <w:bookmarkEnd w:id="49"/>
-    <w:bookmarkStart w:id="50" w:name="invariants"/>
+    <w:bookmarkEnd w:id="50"/>
+    <w:bookmarkStart w:id="51" w:name="invariants"/>
     <w:p>
       <w:pPr>
         <w:pStyle w:val="Heading3"/>
@@ -2646,9 +2706,9 @@
         <w:t xml:space="preserve">geometry because only direction enters the method.</w:t>
       </w:r>
     </w:p>
-    <w:bookmarkEnd w:id="50"/>
     <w:bookmarkEnd w:id="51"/>
-    <w:bookmarkStart w:id="56" w:name="coordinates-frames-and-time"/>
+    <w:bookmarkEnd w:id="52"/>
+    <w:bookmarkStart w:id="57" w:name="coordinates-frames-and-time"/>
     <w:p>
       <w:pPr>
         <w:pStyle w:val="Heading2"/>
@@ -2657,7 +2717,7 @@
         <w:t xml:space="preserve">Coordinates, Frames, and Time</w:t>
       </w:r>
     </w:p>
-    <w:bookmarkStart w:id="53" w:name="coordinate-frames"/>
+    <w:bookmarkStart w:id="54" w:name="coordinate-frames"/>
     <w:p>
       <w:pPr>
         <w:pStyle w:val="Heading3"/>
@@ -2670,8 +2730,8 @@
       <w:pPr>
         <w:pStyle w:val="FirstParagraph"/>
       </w:pPr>
-      <w:bookmarkStart w:id="52" w:name="dplane-coordinate-frame"/>
-      <w:bookmarkEnd w:id="52"/>
+      <w:bookmarkStart w:id="53" w:name="dplane-coordinate-frame"/>
+      <w:bookmarkEnd w:id="53"/>
     </w:p>
     <w:p>
       <w:pPr>
@@ -2875,8 +2935,8 @@
         <w:t xml:space="preserve">then expresses reference, face-center, and contact vectors in this same frame.</w:t>
       </w:r>
     </w:p>
-    <w:bookmarkEnd w:id="53"/>
-    <w:bookmarkStart w:id="54" w:name="axis-and-handedness"/>
+    <w:bookmarkEnd w:id="54"/>
+    <w:bookmarkStart w:id="55" w:name="axis-and-handedness"/>
     <w:p>
       <w:pPr>
         <w:pStyle w:val="Heading3"/>
@@ -2911,8 +2971,8 @@
         <w:t xml:space="preserve">normal is travel-times-face, so its orientation also depends on declared order.</w:t>
       </w:r>
     </w:p>
-    <w:bookmarkEnd w:id="54"/>
-    <w:bookmarkStart w:id="55" w:name="time-convention"/>
+    <w:bookmarkEnd w:id="55"/>
+    <w:bookmarkStart w:id="56" w:name="time-convention"/>
     <w:p>
       <w:pPr>
         <w:pStyle w:val="Heading3"/>
@@ -2959,9 +3019,9 @@
         <w:t xml:space="preserve">fallback. A miss remains a closest-approach event and is not relabeled impact.</w:t>
       </w:r>
     </w:p>
-    <w:bookmarkEnd w:id="55"/>
     <w:bookmarkEnd w:id="56"/>
-    <w:bookmarkStart w:id="59" w:name="units-and-dimensions"/>
+    <w:bookmarkEnd w:id="57"/>
+    <w:bookmarkStart w:id="60" w:name="units-and-dimensions"/>
     <w:p>
       <w:pPr>
         <w:pStyle w:val="Heading2"/>
@@ -2970,7 +3030,7 @@
         <w:t xml:space="preserve">Units and Dimensions</w:t>
       </w:r>
     </w:p>
-    <w:bookmarkStart w:id="57" w:name="symbol-and-unit-table"/>
+    <w:bookmarkStart w:id="58" w:name="symbol-and-unit-table"/>
     <w:p>
       <w:pPr>
         <w:pStyle w:val="Heading3"/>
@@ -3388,8 +3448,8 @@
         </w:tc>
       </w:tr>
     </w:tbl>
-    <w:bookmarkEnd w:id="57"/>
-    <w:bookmarkStart w:id="58" w:name="dimensional-checks"/>
+    <w:bookmarkEnd w:id="58"/>
+    <w:bookmarkStart w:id="59" w:name="dimensional-checks"/>
     <w:p>
       <w:pPr>
         <w:pStyle w:val="Heading3"/>
@@ -3568,9 +3628,9 @@
         <w:t xml:space="preserve">, and multiplying by metres produces m/s.</w:t>
       </w:r>
     </w:p>
-    <w:bookmarkEnd w:id="58"/>
     <w:bookmarkEnd w:id="59"/>
-    <w:bookmarkStart w:id="64" w:name="derivation-and-assumptions"/>
+    <w:bookmarkEnd w:id="60"/>
+    <w:bookmarkStart w:id="65" w:name="derivation-and-assumptions"/>
     <w:p>
       <w:pPr>
         <w:pStyle w:val="Heading2"/>
@@ -3579,7 +3639,7 @@
         <w:t xml:space="preserve">Derivation and Assumptions</w:t>
       </w:r>
     </w:p>
-    <w:bookmarkStart w:id="60" w:name="assumptions"/>
+    <w:bookmarkStart w:id="61" w:name="assumptions"/>
     <w:p>
       <w:pPr>
         <w:pStyle w:val="Heading3"/>
@@ -3626,8 +3686,8 @@
         <w:t xml:space="preserve">angular components followed by translational components.</w:t>
       </w:r>
     </w:p>
-    <w:bookmarkEnd w:id="60"/>
-    <w:bookmarkStart w:id="63" w:name="derivation"/>
+    <w:bookmarkEnd w:id="61"/>
+    <w:bookmarkStart w:id="64" w:name="derivation"/>
     <w:p>
       <w:pPr>
         <w:pStyle w:val="Heading3"/>
@@ -3788,8 +3848,8 @@
       <w:pPr>
         <w:pStyle w:val="BodyText"/>
       </w:pPr>
-      <w:bookmarkStart w:id="61" w:name="dplane-spin-loft-equation"/>
-      <w:bookmarkEnd w:id="61"/>
+      <w:bookmarkStart w:id="62" w:name="dplane-spin-loft-equation"/>
+      <w:bookmarkEnd w:id="62"/>
     </w:p>
     <w:p>
       <w:pPr>
@@ -3953,8 +4013,8 @@
       <w:pPr>
         <w:pStyle w:val="BodyText"/>
       </w:pPr>
-      <w:bookmarkStart w:id="62" w:name="dplane-normal-equation"/>
-      <w:bookmarkEnd w:id="62"/>
+      <w:bookmarkStart w:id="63" w:name="dplane-normal-equation"/>
+      <w:bookmarkEnd w:id="63"/>
     </w:p>
     <w:p>
       <w:pPr>
@@ -4453,9 +4513,9 @@
         <w:t xml:space="preserve">applying the same geometry.</w:t>
       </w:r>
     </w:p>
-    <w:bookmarkEnd w:id="63"/>
     <w:bookmarkEnd w:id="64"/>
-    <w:bookmarkStart w:id="68" w:name="algorithm"/>
+    <w:bookmarkEnd w:id="65"/>
+    <w:bookmarkStart w:id="69" w:name="algorithm"/>
     <w:p>
       <w:pPr>
         <w:pStyle w:val="Heading2"/>
@@ -4464,7 +4524,7 @@
         <w:t xml:space="preserve">Algorithm</w:t>
       </w:r>
     </w:p>
-    <w:bookmarkStart w:id="65" w:name="inputs"/>
+    <w:bookmarkStart w:id="66" w:name="inputs"/>
     <w:p>
       <w:pPr>
         <w:pStyle w:val="Heading3"/>
@@ -4583,8 +4643,8 @@
         <w:t xml:space="preserve">tangent rather than asking callers to assemble those values.</w:t>
       </w:r>
     </w:p>
-    <w:bookmarkEnd w:id="65"/>
-    <w:bookmarkStart w:id="66" w:name="procedure"/>
+    <w:bookmarkEnd w:id="66"/>
+    <w:bookmarkStart w:id="67" w:name="procedure"/>
     <w:p>
       <w:pPr>
         <w:pStyle w:val="Heading3"/>
@@ -4795,8 +4855,8 @@
         <w:t xml:space="preserve">unit directions.</w:t>
       </w:r>
     </w:p>
-    <w:bookmarkEnd w:id="66"/>
-    <w:bookmarkStart w:id="67" w:name="outputs"/>
+    <w:bookmarkEnd w:id="67"/>
+    <w:bookmarkStart w:id="68" w:name="outputs"/>
     <w:p>
       <w:pPr>
         <w:pStyle w:val="Heading3"/>
@@ -4861,9 +4921,9 @@
         <w:t xml:space="preserve">geometry basis, limitations, pose, and wedge-kinematics evidence.</w:t>
       </w:r>
     </w:p>
-    <w:bookmarkEnd w:id="67"/>
     <w:bookmarkEnd w:id="68"/>
-    <w:bookmarkStart w:id="71" w:name="implementation-symbols"/>
+    <w:bookmarkEnd w:id="69"/>
+    <w:bookmarkStart w:id="72" w:name="implementation-symbols"/>
     <w:p>
       <w:pPr>
         <w:pStyle w:val="Heading2"/>
@@ -4872,7 +4932,7 @@
         <w:t xml:space="preserve">Implementation Symbols</w:t>
       </w:r>
     </w:p>
-    <w:bookmarkStart w:id="69" w:name="public-symbols"/>
+    <w:bookmarkStart w:id="70" w:name="public-symbols"/>
     <w:p>
       <w:pPr>
         <w:pStyle w:val="Heading3"/>
@@ -5012,8 +5072,8 @@
         <w:t xml:space="preserve">.</w:t>
       </w:r>
     </w:p>
-    <w:bookmarkEnd w:id="69"/>
-    <w:bookmarkStart w:id="70" w:name="source-mapping"/>
+    <w:bookmarkEnd w:id="70"/>
+    <w:bookmarkStart w:id="71" w:name="source-mapping"/>
     <w:p>
       <w:pPr>
         <w:pStyle w:val="Heading3"/>
@@ -5105,9 +5165,9 @@
         <w:t xml:space="preserve">IDs and public symbols remain recorded in the module inventory.</w:t>
       </w:r>
     </w:p>
-    <w:bookmarkEnd w:id="70"/>
     <w:bookmarkEnd w:id="71"/>
-    <w:bookmarkStart w:id="74" w:name="error-and-failure-semantics"/>
+    <w:bookmarkEnd w:id="72"/>
+    <w:bookmarkStart w:id="75" w:name="error-and-failure-semantics"/>
     <w:p>
       <w:pPr>
         <w:pStyle w:val="Heading2"/>
@@ -5116,7 +5176,7 @@
         <w:t xml:space="preserve">Error and Failure Semantics</w:t>
       </w:r>
     </w:p>
-    <w:bookmarkStart w:id="72" w:name="error-conditions"/>
+    <w:bookmarkStart w:id="73" w:name="error-conditions"/>
     <w:p>
       <w:pPr>
         <w:pStyle w:val="Heading3"/>
@@ -5193,8 +5253,8 @@
         <w:t xml:space="preserve">from valid singular geometry.</w:t>
       </w:r>
     </w:p>
-    <w:bookmarkEnd w:id="72"/>
-    <w:bookmarkStart w:id="73" w:name="recovery-and-cancellation"/>
+    <w:bookmarkEnd w:id="73"/>
+    <w:bookmarkStart w:id="74" w:name="recovery-and-cancellation"/>
     <w:p>
       <w:pPr>
         <w:pStyle w:val="Heading3"/>
@@ -5235,9 +5295,9 @@
         <w:t xml:space="preserve">Higher-level cancellation occurs before calls or between complete runs.</w:t>
       </w:r>
     </w:p>
-    <w:bookmarkEnd w:id="73"/>
     <w:bookmarkEnd w:id="74"/>
-    <w:bookmarkStart w:id="77" w:name="uncertainty-and-sensitivity"/>
+    <w:bookmarkEnd w:id="75"/>
+    <w:bookmarkStart w:id="78" w:name="uncertainty-and-sensitivity"/>
     <w:p>
       <w:pPr>
         <w:pStyle w:val="Heading2"/>
@@ -5246,7 +5306,7 @@
         <w:t xml:space="preserve">Uncertainty and Sensitivity</w:t>
       </w:r>
     </w:p>
-    <w:bookmarkStart w:id="75" w:name="uncertainty-sources"/>
+    <w:bookmarkStart w:id="76" w:name="uncertainty-sources"/>
     <w:p>
       <w:pPr>
         <w:pStyle w:val="Heading3"/>
@@ -5287,8 +5347,8 @@
         <w:t xml:space="preserve">model. Angles therefore remain model-conditioned rather than observed truth.</w:t>
       </w:r>
     </w:p>
-    <w:bookmarkEnd w:id="75"/>
-    <w:bookmarkStart w:id="76" w:name="sensitivity"/>
+    <w:bookmarkEnd w:id="76"/>
+    <w:bookmarkStart w:id="77" w:name="sensitivity"/>
     <w:p>
       <w:pPr>
         <w:pStyle w:val="Heading3"/>
@@ -5329,9 +5389,9 @@
         <w:t xml:space="preserve">typed status; downstream code must not carry forward a prior frame’s plane.</w:t>
       </w:r>
     </w:p>
-    <w:bookmarkEnd w:id="76"/>
     <w:bookmarkEnd w:id="77"/>
-    <w:bookmarkStart w:id="80" w:name="verification-and-validation"/>
+    <w:bookmarkEnd w:id="78"/>
+    <w:bookmarkStart w:id="81" w:name="verification-and-validation"/>
     <w:p>
       <w:pPr>
         <w:pStyle w:val="Heading2"/>
@@ -5340,7 +5400,7 @@
         <w:t xml:space="preserve">Verification and Validation</w:t>
       </w:r>
     </w:p>
-    <w:bookmarkStart w:id="78" w:name="test-evidence"/>
+    <w:bookmarkStart w:id="79" w:name="test-evidence"/>
     <w:p>
       <w:pPr>
         <w:pStyle w:val="Heading3"/>
@@ -5493,8 +5553,8 @@
         <w:t xml:space="preserve">normalizes that value for its face-center D-plane.</w:t>
       </w:r>
     </w:p>
-    <w:bookmarkEnd w:id="78"/>
-    <w:bookmarkStart w:id="79" w:name="acceptance-criteria"/>
+    <w:bookmarkEnd w:id="79"/>
+    <w:bookmarkStart w:id="80" w:name="acceptance-criteria"/>
     <w:p>
       <w:pPr>
         <w:pStyle w:val="Heading3"/>
@@ -5535,9 +5595,9 @@
         <w:t xml:space="preserve">reproduction, not scientific or publication approval.</w:t>
       </w:r>
     </w:p>
-    <w:bookmarkEnd w:id="79"/>
     <w:bookmarkEnd w:id="80"/>
-    <w:bookmarkStart w:id="83" w:name="limits-and-applicability"/>
+    <w:bookmarkEnd w:id="81"/>
+    <w:bookmarkStart w:id="84" w:name="limits-and-applicability"/>
     <w:p>
       <w:pPr>
         <w:pStyle w:val="Heading2"/>
@@ -5546,7 +5606,7 @@
         <w:t xml:space="preserve">Limits and Applicability</w:t>
       </w:r>
     </w:p>
-    <w:bookmarkStart w:id="81" w:name="validity-range"/>
+    <w:bookmarkStart w:id="82" w:name="validity-range"/>
     <w:p>
       <w:pPr>
         <w:pStyle w:val="Heading3"/>
@@ -5719,8 +5779,8 @@
         <w:t xml:space="preserve">-degree tolerance.</w:t>
       </w:r>
     </w:p>
-    <w:bookmarkEnd w:id="81"/>
-    <w:bookmarkStart w:id="82" w:name="known-limitations"/>
+    <w:bookmarkEnd w:id="82"/>
+    <w:bookmarkStart w:id="83" w:name="known-limitations"/>
     <w:p>
       <w:pPr>
         <w:pStyle w:val="Heading3"/>
@@ -5773,9 +5833,9 @@
         <w:t xml:space="preserve">no markerless module exists on this D3 base. Unmerged content is not promoted.</w:t>
       </w:r>
     </w:p>
-    <w:bookmarkEnd w:id="82"/>
     <w:bookmarkEnd w:id="83"/>
-    <w:bookmarkStart w:id="86" w:name="worked-examples"/>
+    <w:bookmarkEnd w:id="84"/>
+    <w:bookmarkStart w:id="87" w:name="worked-examples"/>
     <w:p>
       <w:pPr>
         <w:pStyle w:val="Heading2"/>
@@ -5784,7 +5844,7 @@
         <w:t xml:space="preserve">Worked Examples</w:t>
       </w:r>
     </w:p>
-    <w:bookmarkStart w:id="84" w:name="example-inputs"/>
+    <w:bookmarkStart w:id="85" w:name="example-inputs"/>
     <w:p>
       <w:pPr>
         <w:pStyle w:val="Heading3"/>
@@ -6067,8 +6127,8 @@
         <w:t xml:space="preserve">degree.</w:t>
       </w:r>
     </w:p>
-    <w:bookmarkEnd w:id="84"/>
-    <w:bookmarkStart w:id="85" w:name="example-results"/>
+    <w:bookmarkEnd w:id="85"/>
+    <w:bookmarkStart w:id="86" w:name="example-results"/>
     <w:p>
       <w:pPr>
         <w:pStyle w:val="Heading3"/>
@@ -6361,9 +6421,9 @@
         <w:t xml:space="preserve">cross-client golden fixture and executable Python test, not renderer-only text.</w:t>
       </w:r>
     </w:p>
-    <w:bookmarkEnd w:id="85"/>
     <w:bookmarkEnd w:id="86"/>
-    <w:bookmarkStart w:id="89" w:name="references-and-provenance"/>
+    <w:bookmarkEnd w:id="87"/>
+    <w:bookmarkStart w:id="90" w:name="references-and-provenance"/>
     <w:p>
       <w:pPr>
         <w:pStyle w:val="Heading2"/>
@@ -6372,7 +6432,7 @@
         <w:t xml:space="preserve">References and Provenance</w:t>
       </w:r>
     </w:p>
-    <w:bookmarkStart w:id="87" w:name="references-1"/>
+    <w:bookmarkStart w:id="88" w:name="references-1"/>
     <w:p>
       <w:pPr>
         <w:pStyle w:val="Heading3"/>
@@ -6431,8 +6491,8 @@
         <w:t xml:space="preserve">chapter makes no literature-backed ball-flight or equipment-performance claim.</w:t>
       </w:r>
     </w:p>
-    <w:bookmarkEnd w:id="87"/>
-    <w:bookmarkStart w:id="88" w:name="provenance"/>
+    <w:bookmarkEnd w:id="88"/>
+    <w:bookmarkStart w:id="89" w:name="provenance"/>
     <w:p>
       <w:pPr>
         <w:pStyle w:val="Heading3"/>
@@ -6497,9 +6557,9 @@
         <w:t xml:space="preserve">.</w:t>
       </w:r>
     </w:p>
-    <w:bookmarkEnd w:id="88"/>
     <w:bookmarkEnd w:id="89"/>
-    <w:bookmarkStart w:id="91" w:name="revision-history"/>
+    <w:bookmarkEnd w:id="90"/>
+    <w:bookmarkStart w:id="92" w:name="revision-history"/>
     <w:p>
       <w:pPr>
         <w:pStyle w:val="Heading2"/>
@@ -6508,7 +6568,7 @@
         <w:t xml:space="preserve">Revision History</w:t>
       </w:r>
     </w:p>
-    <w:bookmarkStart w:id="90" w:name="revision-record"/>
+    <w:bookmarkStart w:id="91" w:name="revision-record"/>
     <w:p>
       <w:pPr>
         <w:pStyle w:val="Heading3"/>
@@ -6549,10 +6609,10 @@
         <w:t xml:space="preserve">behavior changes, tests, provenance, limitations, and every generated artifact.</w:t>
       </w:r>
     </w:p>
-    <w:bookmarkEnd w:id="90"/>
     <w:bookmarkEnd w:id="91"/>
     <w:bookmarkEnd w:id="92"/>
-    <w:bookmarkStart w:id="107" w:name="Xf38ac95301459e28f388688aee8c1cf941b78a4"/>
+    <w:bookmarkEnd w:id="93"/>
+    <w:bookmarkStart w:id="108" w:name="Xf38ac95301459e28f388688aee8c1cf941b78a4"/>
     <w:p>
       <w:pPr>
         <w:pStyle w:val="Heading1"/>
@@ -6561,7 +6621,7 @@
         <w:t xml:space="preserve">Opaque Native Restart and Saved-Input Replay</w:t>
       </w:r>
     </w:p>
-    <w:bookmarkStart w:id="93" w:name="scope-and-authority"/>
+    <w:bookmarkStart w:id="94" w:name="scope-and-authority"/>
     <w:p>
       <w:pPr>
         <w:pStyle w:val="Heading2"/>
@@ -6649,8 +6709,8 @@
         <w:t xml:space="preserve">model coverage and acceptance. All required engine/model rows remain visible.</w:t>
       </w:r>
     </w:p>
-    <w:bookmarkEnd w:id="93"/>
-    <w:bookmarkStart w:id="94" w:name="state-model-and-runtime-identity"/>
+    <w:bookmarkEnd w:id="94"/>
+    <w:bookmarkStart w:id="95" w:name="state-model-and-runtime-identity"/>
     <w:p>
       <w:pPr>
         <w:pStyle w:val="Heading2"/>
@@ -6768,8 +6828,8 @@
         <w:t xml:space="preserve">state encoding, source-to-binary equivalence or transitive library closure.</w:t>
       </w:r>
     </w:p>
-    <w:bookmarkEnd w:id="94"/>
-    <w:bookmarkStart w:id="95" w:name="native-clock-and-input-boundary"/>
+    <w:bookmarkEnd w:id="95"/>
+    <w:bookmarkStart w:id="96" w:name="native-clock-and-input-boundary"/>
     <w:p>
       <w:pPr>
         <w:pStyle w:val="Heading2"/>
@@ -6906,8 +6966,8 @@
         <w:t xml:space="preserve">contracts.</w:t>
       </w:r>
     </w:p>
-    <w:bookmarkEnd w:id="95"/>
-    <w:bookmarkStart w:id="96" w:name="integrity-and-failure-semantics"/>
+    <w:bookmarkEnd w:id="96"/>
+    <w:bookmarkStart w:id="97" w:name="integrity-and-failure-semantics"/>
     <w:p>
       <w:pPr>
         <w:pStyle w:val="Heading2"/>
@@ -6963,8 +7023,8 @@
         <w:t xml:space="preserve">native engine followed the declared policy.</w:t>
       </w:r>
     </w:p>
-    <w:bookmarkEnd w:id="96"/>
-    <w:bookmarkStart w:id="97" w:name="native-consumer-requirements"/>
+    <w:bookmarkEnd w:id="97"/>
+    <w:bookmarkStart w:id="98" w:name="native-consumer-requirements"/>
     <w:p>
       <w:pPr>
         <w:pStyle w:val="Heading2"/>
@@ -7029,8 +7089,8 @@
         <w:t xml:space="preserve">No state reset is permitted during the requested saved-input replay horizon.</w:t>
       </w:r>
     </w:p>
-    <w:bookmarkEnd w:id="97"/>
-    <w:bookmarkStart w:id="98" w:name="evidence-and-remaining-work"/>
+    <w:bookmarkEnd w:id="98"/>
+    <w:bookmarkStart w:id="99" w:name="evidence-and-remaining-work"/>
     <w:p>
       <w:pPr>
         <w:pStyle w:val="Heading2"/>
@@ -7101,8 +7161,8 @@
         <w:t xml:space="preserve">does not approve a scientific calculation or manual release.</w:t>
       </w:r>
     </w:p>
-    <w:bookmarkEnd w:id="98"/>
-    <w:bookmarkStart w:id="106" w:name="primary-references"/>
+    <w:bookmarkEnd w:id="99"/>
+    <w:bookmarkStart w:id="107" w:name="primary-references"/>
     <w:p>
       <w:pPr>
         <w:pStyle w:val="Heading2"/>
@@ -7115,7 +7175,7 @@
       <w:pPr>
         <w:pStyle w:val="FirstParagraph"/>
       </w:pPr>
-      <w:hyperlink r:id="rId99">
+      <w:hyperlink r:id="rId100">
         <w:r>
           <w:rPr>
             <w:rStyle w:val="Hyperlink"/>
@@ -7138,7 +7198,7 @@
       <w:r>
         <w:t xml:space="preserve"> </w:t>
       </w:r>
-      <w:hyperlink r:id="rId100">
+      <w:hyperlink r:id="rId101">
         <w:r>
           <w:rPr>
             <w:rStyle w:val="Hyperlink"/>
@@ -7159,8 +7219,8 @@
         <w:t xml:space="preserve">claims require separate actual execution evidence from UpstreamDrift.</w:t>
       </w:r>
     </w:p>
-    <w:bookmarkStart w:id="105" w:name="refs"/>
-    <w:bookmarkStart w:id="102" w:name="ref-pandoc-manual"/>
+    <w:bookmarkStart w:id="106" w:name="refs"/>
+    <w:bookmarkStart w:id="103" w:name="ref-pandoc-manual"/>
     <w:p>
       <w:pPr>
         <w:pStyle w:val="Bibliography"/>
@@ -7184,7 +7244,7 @@
       <w:r>
         <w:t xml:space="preserve"> </w:t>
       </w:r>
-      <w:hyperlink r:id="rId101">
+      <w:hyperlink r:id="rId102">
         <w:r>
           <w:rPr>
             <w:rStyle w:val="Hyperlink"/>
@@ -7196,8 +7256,8 @@
         <w:t xml:space="preserve">.</w:t>
       </w:r>
     </w:p>
-    <w:bookmarkEnd w:id="102"/>
-    <w:bookmarkStart w:id="104" w:name="ref-quarto-guide"/>
+    <w:bookmarkEnd w:id="103"/>
+    <w:bookmarkStart w:id="105" w:name="ref-quarto-guide"/>
     <w:p>
       <w:pPr>
         <w:pStyle w:val="Bibliography"/>
@@ -7221,7 +7281,7 @@
       <w:r>
         <w:t xml:space="preserve"> </w:t>
       </w:r>
-      <w:hyperlink r:id="rId103">
+      <w:hyperlink r:id="rId104">
         <w:r>
           <w:rPr>
             <w:rStyle w:val="Hyperlink"/>
@@ -7233,10 +7293,10 @@
         <w:t xml:space="preserve">.</w:t>
       </w:r>
     </w:p>
-    <w:bookmarkEnd w:id="104"/>
     <w:bookmarkEnd w:id="105"/>
     <w:bookmarkEnd w:id="106"/>
     <w:bookmarkEnd w:id="107"/>
+    <w:bookmarkEnd w:id="108"/>
     <w:sectPr>
       <w:headerReference r:id="rId9" w:type="default"/>
       <w:footerReference r:id="rId10" w:type="default"/>

</xml_diff>

<commit_message>
docs(mesh): document lamina kernel and URDF export evidence (#5503 #5504)
</commit_message>
<xml_diff>
--- a/manuals/tools/dist/tools-engineering-design-manual.docx
+++ b/manuals/tools/dist/tools-engineering-design-manual.docx
@@ -50,7 +50,19 @@
         <w:t xml:space="preserve"> </w:t>
       </w:r>
       <w:r>
-        <w:t xml:space="preserve">denominator. TOOLS-D4 registers one model-conditioned D-plane calculation and</w:t>
+        <w:t xml:space="preserve">denominator; it is awaiting regeneration for the #5503 source additions and is</w:t>
+      </w:r>
+      <w:r>
+        <w:t xml:space="preserve"> </w:t>
+      </w:r>
+      <w:r>
+        <w:t xml:space="preserve">not treated as current for this change. TOOLS-D4 registers one</w:t>
+      </w:r>
+      <w:r>
+        <w:t xml:space="preserve"> </w:t>
+      </w:r>
+      <w:r>
+        <w:t xml:space="preserve">model-conditioned D-plane calculation and</w:t>
       </w:r>
       <w:r>
         <w:t xml:space="preserve"> </w:t>
@@ -93,6 +105,32 @@
       </w:r>
       <w:r>
         <w:t xml:space="preserve">but none is approved for publication or engineering use.</w:t>
+      </w:r>
+    </w:p>
+    <w:p>
+      <w:pPr>
+        <w:pStyle w:val="BodyText"/>
+      </w:pPr>
+      <w:r>
+        <w:t xml:space="preserve">Chapter 06 is an included, unregistered numerical-kernel note for</w:t>
+      </w:r>
+      <w:r>
+        <w:t xml:space="preserve"> </w:t>
+      </w:r>
+      <w:r>
+        <w:t xml:space="preserve">triangle-multiset lamina moments. It is not a governed calculation or exemplar:</w:t>
+      </w:r>
+      <w:r>
+        <w:t xml:space="preserve"> </w:t>
+      </w:r>
+      <w:r>
+        <w:t xml:space="preserve">the current freshness generator does not execute this pathway, and no source</w:t>
+      </w:r>
+      <w:r>
+        <w:t xml:space="preserve"> </w:t>
+      </w:r>
+      <w:r>
+        <w:t xml:space="preserve">mesh/consumer admission or scientific review is supplied.</w:t>
       </w:r>
     </w:p>
     <w:bookmarkEnd w:id="19"/>
@@ -6612,7 +6650,7 @@
     <w:bookmarkEnd w:id="91"/>
     <w:bookmarkEnd w:id="92"/>
     <w:bookmarkEnd w:id="93"/>
-    <w:bookmarkStart w:id="108" w:name="Xf38ac95301459e28f388688aee8c1cf941b78a4"/>
+    <w:bookmarkStart w:id="103" w:name="Xf38ac95301459e28f388688aee8c1cf941b78a4"/>
     <w:p>
       <w:pPr>
         <w:pStyle w:val="Heading1"/>
@@ -7162,7 +7200,7 @@
       </w:r>
     </w:p>
     <w:bookmarkEnd w:id="99"/>
-    <w:bookmarkStart w:id="107" w:name="primary-references"/>
+    <w:bookmarkStart w:id="102" w:name="primary-references"/>
     <w:p>
       <w:pPr>
         <w:pStyle w:val="Heading2"/>
@@ -7219,8 +7257,4049 @@
         <w:t xml:space="preserve">claims require separate actual execution evidence from UpstreamDrift.</w:t>
       </w:r>
     </w:p>
-    <w:bookmarkStart w:id="106" w:name="refs"/>
-    <w:bookmarkStart w:id="103" w:name="ref-pandoc-manual"/>
+    <w:p>
+      <w:r>
+        <w:br w:type="page"/>
+      </w:r>
+    </w:p>
+    <w:bookmarkEnd w:id="102"/>
+    <w:bookmarkEnd w:id="103"/>
+    <w:bookmarkStart w:id="155" w:name="triangle-multiset-lamina-mass-moments"/>
+    <w:p>
+      <w:pPr>
+        <w:pStyle w:val="Heading1"/>
+      </w:pPr>
+      <w:r>
+        <w:t xml:space="preserve">Triangle-Multiset Lamina Mass Moments</w:t>
+      </w:r>
+    </w:p>
+    <w:bookmarkStart w:id="104" w:name="purpose-and-scope-1"/>
+    <w:p>
+      <w:pPr>
+        <w:pStyle w:val="Heading2"/>
+      </w:pPr>
+      <w:r>
+        <w:t xml:space="preserve">Purpose and Scope</w:t>
+      </w:r>
+    </w:p>
+    <w:p>
+      <w:pPr>
+        <w:pStyle w:val="FirstParagraph"/>
+      </w:pPr>
+      <w:r>
+        <w:t xml:space="preserve">This note describes the numerical kernel introduced for Tools #5503. Given</w:t>
+      </w:r>
+      <w:r>
+        <w:t xml:space="preserve"> </w:t>
+      </w:r>
+      <w:r>
+        <w:t xml:space="preserve">triangles already expressed in one orthonormal metre frame and one positive</w:t>
+      </w:r>
+      <w:r>
+        <w:t xml:space="preserve"> </w:t>
+      </w:r>
+      <w:r>
+        <w:t xml:space="preserve">total mass, it computes the center of mass and inertia tensor of a zero-thickness</w:t>
+      </w:r>
+      <w:r>
+        <w:t xml:space="preserve"> </w:t>
+      </w:r>
+      <w:r>
+        <w:t xml:space="preserve">lamina whose surface-mass density is proportional to unsigned triangle area.</w:t>
+      </w:r>
+      <w:r>
+        <w:t xml:space="preserve"> </w:t>
+      </w:r>
+      <w:r>
+        <w:t xml:space="preserve">The source is a triangle</w:t>
+      </w:r>
+      <w:r>
+        <w:t xml:space="preserve"> </w:t>
+      </w:r>
+      <w:r>
+        <w:rPr>
+          <w:b/>
+          <w:bCs/>
+        </w:rPr>
+        <w:t xml:space="preserve">multiset</w:t>
+      </w:r>
+      <w:r>
+        <w:t xml:space="preserve">: repeated faces count repeatedly. The</w:t>
+      </w:r>
+      <w:r>
+        <w:t xml:space="preserve"> </w:t>
+      </w:r>
+      <w:r>
+        <w:t xml:space="preserve">kernel is included in the manual for transparent review but is not yet a</w:t>
+      </w:r>
+      <w:r>
+        <w:t xml:space="preserve"> </w:t>
+      </w:r>
+      <w:r>
+        <w:t xml:space="preserve">registered or approved calculation. It does not load or admit a geometry asset,</w:t>
+      </w:r>
+      <w:r>
+        <w:t xml:space="preserve"> </w:t>
+      </w:r>
+      <w:r>
+        <w:t xml:space="preserve">establish frame authority, infer tissue ownership, model volume or thickness,</w:t>
+      </w:r>
+      <w:r>
+        <w:t xml:space="preserve"> </w:t>
+      </w:r>
+      <w:r>
+        <w:t xml:space="preserve">or qualify a native humanoid/body model.</w:t>
+      </w:r>
+    </w:p>
+    <w:bookmarkEnd w:id="104"/>
+    <w:bookmarkStart w:id="108" w:name="design-by-contract-1"/>
+    <w:p>
+      <w:pPr>
+        <w:pStyle w:val="Heading2"/>
+      </w:pPr>
+      <w:r>
+        <w:t xml:space="preserve">Design by Contract</w:t>
+      </w:r>
+    </w:p>
+    <w:bookmarkStart w:id="105" w:name="preconditions-1"/>
+    <w:p>
+      <w:pPr>
+        <w:pStyle w:val="Heading3"/>
+      </w:pPr>
+      <w:r>
+        <w:t xml:space="preserve">Preconditions</w:t>
+      </w:r>
+    </w:p>
+    <w:p>
+      <w:pPr>
+        <w:pStyle w:val="FirstParagraph"/>
+      </w:pPr>
+      <w:r>
+        <w:rPr>
+          <w:rStyle w:val="VerbatimChar"/>
+        </w:rPr>
+        <w:t xml:space="preserve">vertices</w:t>
+      </w:r>
+      <w:r>
+        <w:t xml:space="preserve"> </w:t>
+      </w:r>
+      <w:r>
+        <w:t xml:space="preserve">must convert to a finite</w:t>
+      </w:r>
+      <w:r>
+        <w:t xml:space="preserve"> </w:t>
+      </w:r>
+      <w:r>
+        <w:rPr>
+          <w:rStyle w:val="VerbatimChar"/>
+        </w:rPr>
+        <w:t xml:space="preserve">float64</w:t>
+      </w:r>
+      <w:r>
+        <w:t xml:space="preserve"> </w:t>
+      </w:r>
+      <w:r>
+        <w:t xml:space="preserve">array of shape</w:t>
+      </w:r>
+      <w:r>
+        <w:t xml:space="preserve"> </w:t>
+      </w:r>
+      <w:r>
+        <w:rPr>
+          <w:rStyle w:val="VerbatimChar"/>
+        </w:rPr>
+        <w:t xml:space="preserve">(N, 3)</w:t>
+      </w:r>
+      <w:r>
+        <w:t xml:space="preserve">.</w:t>
+      </w:r>
+      <w:r>
+        <w:t xml:space="preserve"> </w:t>
+      </w:r>
+      <w:r>
+        <w:rPr>
+          <w:rStyle w:val="VerbatimChar"/>
+        </w:rPr>
+        <w:t xml:space="preserve">faces</w:t>
+      </w:r>
+      <w:r>
+        <w:t xml:space="preserve"> </w:t>
+      </w:r>
+      <w:r>
+        <w:t xml:space="preserve">is an integer array of shape</w:t>
+      </w:r>
+      <w:r>
+        <w:t xml:space="preserve"> </w:t>
+      </w:r>
+      <w:r>
+        <w:rPr>
+          <w:rStyle w:val="VerbatimChar"/>
+        </w:rPr>
+        <w:t xml:space="preserve">(T, 3)</w:t>
+      </w:r>
+      <w:r>
+        <w:t xml:space="preserve"> </w:t>
+      </w:r>
+      <w:r>
+        <w:t xml:space="preserve">whose indices lie in</w:t>
+      </w:r>
+      <w:r>
+        <w:t xml:space="preserve"> </w:t>
+      </w:r>
+      <w:r>
+        <w:rPr>
+          <w:rStyle w:val="VerbatimChar"/>
+        </w:rPr>
+        <w:t xml:space="preserve">[0, N)</w:t>
+      </w:r>
+      <w:r>
+        <w:t xml:space="preserve">.</w:t>
+      </w:r>
+      <w:r>
+        <w:t xml:space="preserve"> </w:t>
+      </w:r>
+      <w:r>
+        <w:rPr>
+          <w:rStyle w:val="VerbatimChar"/>
+        </w:rPr>
+        <w:t xml:space="preserve">mass</w:t>
+      </w:r>
+      <w:r>
+        <w:t xml:space="preserve"> </w:t>
+      </w:r>
+      <w:r>
+        <w:t xml:space="preserve">is a positive, finite, non-boolean scalar in kilograms. All vertex</w:t>
+      </w:r>
+      <w:r>
+        <w:t xml:space="preserve"> </w:t>
+      </w:r>
+      <w:r>
+        <w:t xml:space="preserve">coordinates are metres in one caller-declared orthonormal coordinate frame.</w:t>
+      </w:r>
+      <w:r>
+        <w:t xml:space="preserve"> </w:t>
+      </w:r>
+      <w:r>
+        <w:t xml:space="preserve">At least one input triangle must have positive representable area; each</w:t>
+      </w:r>
+      <w:r>
+        <w:t xml:space="preserve"> </w:t>
+      </w:r>
+      <w:r>
+        <w:t xml:space="preserve">nonzero area and its normalized fraction must be representable as a positive</w:t>
+      </w:r>
+      <w:r>
+        <w:t xml:space="preserve"> </w:t>
+      </w:r>
+      <w:r>
+        <w:rPr>
+          <w:rStyle w:val="VerbatimChar"/>
+        </w:rPr>
+        <w:t xml:space="preserve">float64</w:t>
+      </w:r>
+      <w:r>
+        <w:t xml:space="preserve">, and total area must remain finite.</w:t>
+      </w:r>
+    </w:p>
+    <w:bookmarkEnd w:id="105"/>
+    <w:bookmarkStart w:id="106" w:name="postconditions-1"/>
+    <w:p>
+      <w:pPr>
+        <w:pStyle w:val="Heading3"/>
+      </w:pPr>
+      <w:r>
+        <w:t xml:space="preserve">Postconditions</w:t>
+      </w:r>
+    </w:p>
+    <w:p>
+      <w:pPr>
+        <w:pStyle w:val="FirstParagraph"/>
+      </w:pPr>
+      <w:r>
+        <w:t xml:space="preserve">The result reports the area-weighted center in metres and the center-of-mass</w:t>
+      </w:r>
+      <w:r>
+        <w:t xml:space="preserve"> </w:t>
+      </w:r>
+      <w:r>
+        <w:t xml:space="preserve">inertia tensor in kg m² for the declared lamina. It also reports total</w:t>
+      </w:r>
+      <w:r>
+        <w:t xml:space="preserve"> </w:t>
+      </w:r>
+      <w:r>
+        <w:t xml:space="preserve">unsigned area, zero-area face count, exact coincident positive-area face count,</w:t>
+      </w:r>
+      <w:r>
+        <w:t xml:space="preserve"> </w:t>
+      </w:r>
+      <w:r>
+        <w:t xml:space="preserve">and indexed boundary/nonmanifold edge counts. The duplicate diagnostic counts</w:t>
+      </w:r>
+      <w:r>
+        <w:t xml:space="preserve"> </w:t>
+      </w:r>
+      <w:r>
+        <w:t xml:space="preserve">each repeated coordinate face beyond its first occurrence. The compatible</w:t>
+      </w:r>
+      <w:r>
+        <w:t xml:space="preserve"> </w:t>
+      </w:r>
+      <w:r>
+        <w:rPr>
+          <w:rStyle w:val="VerbatimChar"/>
+        </w:rPr>
+        <w:t xml:space="preserve">InertiaResult</w:t>
+      </w:r>
+      <w:r>
+        <w:t xml:space="preserve"> </w:t>
+      </w:r>
+      <w:r>
+        <w:t xml:space="preserve">uses</w:t>
+      </w:r>
+      <w:r>
+        <w:t xml:space="preserve"> </w:t>
+      </w:r>
+      <w:r>
+        <w:rPr>
+          <w:rStyle w:val="VerbatimChar"/>
+        </w:rPr>
+        <w:t xml:space="preserve">volume=0</w:t>
+      </w:r>
+      <w:r>
+        <w:t xml:space="preserve">,</w:t>
+      </w:r>
+      <w:r>
+        <w:t xml:space="preserve"> </w:t>
+      </w:r>
+      <w:r>
+        <w:rPr>
+          <w:rStyle w:val="VerbatimChar"/>
+        </w:rPr>
+        <w:t xml:space="preserve">was_watertight=False</w:t>
+      </w:r>
+      <w:r>
+        <w:t xml:space="preserve">, and the distinct</w:t>
+      </w:r>
+      <w:r>
+        <w:t xml:space="preserve"> </w:t>
+      </w:r>
+      <w:r>
+        <w:rPr>
+          <w:rStyle w:val="VerbatimChar"/>
+        </w:rPr>
+        <w:t xml:space="preserve">triangle_multiset_lamina_mass</w:t>
+      </w:r>
+      <w:r>
+        <w:t xml:space="preserve"> </w:t>
+      </w:r>
+      <w:r>
+        <w:t xml:space="preserve">mode so it cannot imply a closed solid.</w:t>
+      </w:r>
+    </w:p>
+    <w:bookmarkEnd w:id="106"/>
+    <w:bookmarkStart w:id="107" w:name="invariants-1"/>
+    <w:p>
+      <w:pPr>
+        <w:pStyle w:val="Heading3"/>
+      </w:pPr>
+      <w:r>
+        <w:t xml:space="preserve">Invariants</w:t>
+      </w:r>
+    </w:p>
+    <w:p>
+      <w:pPr>
+        <w:pStyle w:val="FirstParagraph"/>
+      </w:pPr>
+      <w:r>
+        <w:t xml:space="preserve">Reordering faces, translating the complete geometry, or applying a proper</w:t>
+      </w:r>
+      <w:r>
+        <w:t xml:space="preserve"> </w:t>
+      </w:r>
+      <w:r>
+        <w:t xml:space="preserve">rigid rotation preserves mass and scalar invariants; translation changes the</w:t>
+      </w:r>
+      <w:r>
+        <w:t xml:space="preserve"> </w:t>
+      </w:r>
+      <w:r>
+        <w:t xml:space="preserve">center by the same translation and does not change central inertia. Scaling</w:t>
+      </w:r>
+      <w:r>
+        <w:t xml:space="preserve"> </w:t>
+      </w:r>
+      <w:r>
+        <w:t xml:space="preserve">coordinates by a positive factor scales area by its square, preserves the</w:t>
+      </w:r>
+      <w:r>
+        <w:t xml:space="preserve"> </w:t>
+      </w:r>
+      <w:r>
+        <w:t xml:space="preserve">area fractions, and scales inertia by the square when total mass is held fixed.</w:t>
+      </w:r>
+      <w:r>
+        <w:t xml:space="preserve"> </w:t>
+      </w:r>
+      <w:r>
+        <w:t xml:space="preserve">Subdivision that preserves the geometric surface and area measure preserves</w:t>
+      </w:r>
+      <w:r>
+        <w:t xml:space="preserve"> </w:t>
+      </w:r>
+      <w:r>
+        <w:t xml:space="preserve">the moments within numerical tolerance. A repeated positive-area face retains</w:t>
+      </w:r>
+      <w:r>
+        <w:t xml:space="preserve"> </w:t>
+      </w:r>
+      <w:r>
+        <w:t xml:space="preserve">its multiplicity in both mass allocation and the diagnostic count.</w:t>
+      </w:r>
+    </w:p>
+    <w:bookmarkEnd w:id="107"/>
+    <w:bookmarkEnd w:id="108"/>
+    <w:bookmarkStart w:id="112" w:name="coordinates-frames-and-time-1"/>
+    <w:p>
+      <w:pPr>
+        <w:pStyle w:val="Heading2"/>
+      </w:pPr>
+      <w:r>
+        <w:t xml:space="preserve">Coordinates, Frames, and Time</w:t>
+      </w:r>
+    </w:p>
+    <w:bookmarkStart w:id="109" w:name="coordinate-frames-1"/>
+    <w:p>
+      <w:pPr>
+        <w:pStyle w:val="Heading3"/>
+      </w:pPr>
+      <w:r>
+        <w:t xml:space="preserve">Coordinate Frames</w:t>
+      </w:r>
+    </w:p>
+    <w:p>
+      <w:pPr>
+        <w:pStyle w:val="FirstParagraph"/>
+      </w:pPr>
+      <w:r>
+        <w:t xml:space="preserve">The function accepts coordinates in the caller’s existing frame and performs</w:t>
+      </w:r>
+      <w:r>
+        <w:t xml:space="preserve"> </w:t>
+      </w:r>
+      <w:r>
+        <w:t xml:space="preserve">no frame transform. All vertices must use the same origin, axes, handedness,</w:t>
+      </w:r>
+      <w:r>
+        <w:t xml:space="preserve"> </w:t>
+      </w:r>
+      <w:r>
+        <w:t xml:space="preserve">and scale. No source-frame identifier is present in this numerical API; a</w:t>
+      </w:r>
+      <w:r>
+        <w:t xml:space="preserve"> </w:t>
+      </w:r>
+      <w:r>
+        <w:t xml:space="preserve">consumer that needs provenance or a native body frame must bind that separately</w:t>
+      </w:r>
+      <w:r>
+        <w:t xml:space="preserve"> </w:t>
+      </w:r>
+      <w:r>
+        <w:t xml:space="preserve">before calling it.</w:t>
+      </w:r>
+    </w:p>
+    <w:bookmarkEnd w:id="109"/>
+    <w:bookmarkStart w:id="110" w:name="axis-and-handedness-1"/>
+    <w:p>
+      <w:pPr>
+        <w:pStyle w:val="Heading3"/>
+      </w:pPr>
+      <w:r>
+        <w:t xml:space="preserve">Axis and Handedness</w:t>
+      </w:r>
+    </w:p>
+    <w:p>
+      <w:pPr>
+        <w:pStyle w:val="FirstParagraph"/>
+      </w:pPr>
+      <w:r>
+        <w:t xml:space="preserve">The covariance and inertia formulas use Euclidean three-dimensional vectors.</w:t>
+      </w:r>
+      <w:r>
+        <w:t xml:space="preserve"> </w:t>
+      </w:r>
+      <w:r>
+        <w:t xml:space="preserve">They are invariant to proper orthogonal basis rotation when both inputs and</w:t>
+      </w:r>
+      <w:r>
+        <w:t xml:space="preserve"> </w:t>
+      </w:r>
+      <w:r>
+        <w:t xml:space="preserve">outputs are transformed consistently. Triangle winding does not select a</w:t>
+      </w:r>
+      <w:r>
+        <w:t xml:space="preserve"> </w:t>
+      </w:r>
+      <w:r>
+        <w:t xml:space="preserve">normal or sign: area is unsigned and the represented surface has no orientation</w:t>
+      </w:r>
+      <w:r>
+        <w:t xml:space="preserve"> </w:t>
+      </w:r>
+      <w:r>
+        <w:t xml:space="preserve">semantics.</w:t>
+      </w:r>
+    </w:p>
+    <w:bookmarkEnd w:id="110"/>
+    <w:bookmarkStart w:id="111" w:name="time-convention-1"/>
+    <w:p>
+      <w:pPr>
+        <w:pStyle w:val="Heading3"/>
+      </w:pPr>
+      <w:r>
+        <w:t xml:space="preserve">Time Convention</w:t>
+      </w:r>
+    </w:p>
+    <w:p>
+      <w:pPr>
+        <w:pStyle w:val="FirstParagraph"/>
+      </w:pPr>
+      <w:r>
+        <w:t xml:space="preserve">This is a static geometry calculation and has no time, interpolation, or</w:t>
+      </w:r>
+      <w:r>
+        <w:t xml:space="preserve"> </w:t>
+      </w:r>
+      <w:r>
+        <w:t xml:space="preserve">integration policy. It cannot be used to infer a time-varying body shape.</w:t>
+      </w:r>
+    </w:p>
+    <w:bookmarkEnd w:id="111"/>
+    <w:bookmarkEnd w:id="112"/>
+    <w:bookmarkStart w:id="115" w:name="units-and-dimensions-1"/>
+    <w:p>
+      <w:pPr>
+        <w:pStyle w:val="Heading2"/>
+      </w:pPr>
+      <w:r>
+        <w:t xml:space="preserve">Units and Dimensions</w:t>
+      </w:r>
+    </w:p>
+    <w:bookmarkStart w:id="113" w:name="symbol-and-unit-table-1"/>
+    <w:p>
+      <w:pPr>
+        <w:pStyle w:val="Heading3"/>
+      </w:pPr>
+      <w:r>
+        <w:t xml:space="preserve">Symbol and Unit Table</w:t>
+      </w:r>
+    </w:p>
+    <w:tbl>
+      <w:tblPr>
+        <w:tblStyle w:val="Table"/>
+        <w:tblW w:type="pct" w:w="5000"/>
+        <w:tblLayout w:type="fixed"/>
+        <w:tblLook w:firstRow="1" w:lastRow="0" w:firstColumn="0" w:lastColumn="0" w:noHBand="0" w:noVBand="0" w:val="0020"/>
+      </w:tblPr>
+      <w:tblGrid>
+        <w:gridCol w:w="2640"/>
+        <w:gridCol w:w="2640"/>
+        <w:gridCol w:w="2640"/>
+      </w:tblGrid>
+      <w:tr>
+        <w:trPr>
+          <w:tblHeader w:val="on"/>
+        </w:trPr>
+        <w:tc>
+          <w:tcPr/>
+          <w:p>
+            <w:pPr>
+              <w:pStyle w:val="Compact"/>
+            </w:pPr>
+            <w:r>
+              <w:t xml:space="preserve">Symbol or field</w:t>
+            </w:r>
+          </w:p>
+        </w:tc>
+        <w:tc>
+          <w:tcPr/>
+          <w:p>
+            <w:pPr>
+              <w:pStyle w:val="Compact"/>
+            </w:pPr>
+            <w:r>
+              <w:t xml:space="preserve">Meaning</w:t>
+            </w:r>
+          </w:p>
+        </w:tc>
+        <w:tc>
+          <w:tcPr/>
+          <w:p>
+            <w:pPr>
+              <w:pStyle w:val="Compact"/>
+            </w:pPr>
+            <w:r>
+              <w:t xml:space="preserve">Unit</w:t>
+            </w:r>
+          </w:p>
+        </w:tc>
+      </w:tr>
+      <w:tr>
+        <w:tc>
+          <w:tcPr/>
+          <w:p>
+            <w:pPr>
+              <w:pStyle w:val="Compact"/>
+            </w:pPr>
+            <m:oMath>
+              <m:r>
+                <m:rPr>
+                  <m:sty m:val="b"/>
+                </m:rPr>
+                <m:t>x</m:t>
+              </m:r>
+            </m:oMath>
+            <w:r>
+              <w:t xml:space="preserve">, triangle vertices</w:t>
+            </w:r>
+          </w:p>
+        </w:tc>
+        <w:tc>
+          <w:tcPr/>
+          <w:p>
+            <w:pPr>
+              <w:pStyle w:val="Compact"/>
+            </w:pPr>
+            <w:r>
+              <w:t xml:space="preserve">Position in the common input frame</w:t>
+            </w:r>
+          </w:p>
+        </w:tc>
+        <w:tc>
+          <w:tcPr/>
+          <w:p>
+            <w:pPr>
+              <w:pStyle w:val="Compact"/>
+            </w:pPr>
+            <w:r>
+              <w:t xml:space="preserve">m</w:t>
+            </w:r>
+          </w:p>
+        </w:tc>
+      </w:tr>
+      <w:tr>
+        <w:tc>
+          <w:tcPr/>
+          <w:p>
+            <w:pPr>
+              <w:pStyle w:val="Compact"/>
+            </w:pPr>
+            <m:oMath>
+              <m:sSub>
+                <m:e>
+                  <m:r>
+                    <m:t>A</m:t>
+                  </m:r>
+                </m:e>
+                <m:sub>
+                  <m:r>
+                    <m:t>i</m:t>
+                  </m:r>
+                </m:sub>
+              </m:sSub>
+            </m:oMath>
+            <w:r>
+              <w:t xml:space="preserve">,</w:t>
+            </w:r>
+            <w:r>
+              <w:t xml:space="preserve"> </w:t>
+            </w:r>
+            <m:oMath>
+              <m:r>
+                <m:t>A</m:t>
+              </m:r>
+            </m:oMath>
+          </w:p>
+        </w:tc>
+        <w:tc>
+          <w:tcPr/>
+          <w:p>
+            <w:pPr>
+              <w:pStyle w:val="Compact"/>
+            </w:pPr>
+            <w:r>
+              <w:t xml:space="preserve">Triangle area and total multiset area</w:t>
+            </w:r>
+          </w:p>
+        </w:tc>
+        <w:tc>
+          <w:tcPr/>
+          <w:p>
+            <w:pPr>
+              <w:pStyle w:val="Compact"/>
+            </w:pPr>
+            <w:r>
+              <w:t xml:space="preserve">m²</w:t>
+            </w:r>
+          </w:p>
+        </w:tc>
+      </w:tr>
+      <w:tr>
+        <w:tc>
+          <w:tcPr/>
+          <w:p>
+            <w:pPr>
+              <w:pStyle w:val="Compact"/>
+            </w:pPr>
+            <m:oMath>
+              <m:sSub>
+                <m:e>
+                  <m:r>
+                    <m:t>w</m:t>
+                  </m:r>
+                </m:e>
+                <m:sub>
+                  <m:r>
+                    <m:t>i</m:t>
+                  </m:r>
+                </m:sub>
+              </m:sSub>
+            </m:oMath>
+          </w:p>
+        </w:tc>
+        <w:tc>
+          <w:tcPr/>
+          <w:p>
+            <w:pPr>
+              <w:pStyle w:val="Compact"/>
+            </w:pPr>
+            <w:r>
+              <w:t xml:space="preserve">Triangle area fraction</w:t>
+            </w:r>
+          </w:p>
+        </w:tc>
+        <w:tc>
+          <w:tcPr/>
+          <w:p>
+            <w:pPr>
+              <w:pStyle w:val="Compact"/>
+            </w:pPr>
+            <w:r>
+              <w:t xml:space="preserve">1</w:t>
+            </w:r>
+          </w:p>
+        </w:tc>
+      </w:tr>
+      <w:tr>
+        <w:tc>
+          <w:tcPr/>
+          <w:p>
+            <w:pPr>
+              <w:pStyle w:val="Compact"/>
+            </w:pPr>
+            <m:oMath>
+              <m:r>
+                <m:t>m</m:t>
+              </m:r>
+            </m:oMath>
+          </w:p>
+        </w:tc>
+        <w:tc>
+          <w:tcPr/>
+          <w:p>
+            <w:pPr>
+              <w:pStyle w:val="Compact"/>
+            </w:pPr>
+            <w:r>
+              <w:t xml:space="preserve">Caller-specified total lamina mass</w:t>
+            </w:r>
+          </w:p>
+        </w:tc>
+        <w:tc>
+          <w:tcPr/>
+          <w:p>
+            <w:pPr>
+              <w:pStyle w:val="Compact"/>
+            </w:pPr>
+            <w:r>
+              <w:t xml:space="preserve">kg</w:t>
+            </w:r>
+          </w:p>
+        </w:tc>
+      </w:tr>
+      <w:tr>
+        <w:tc>
+          <w:tcPr/>
+          <w:p>
+            <w:pPr>
+              <w:pStyle w:val="Compact"/>
+            </w:pPr>
+            <m:oMath>
+              <m:r>
+                <m:rPr>
+                  <m:sty m:val="b"/>
+                </m:rPr>
+                <m:t>c</m:t>
+              </m:r>
+            </m:oMath>
+          </w:p>
+        </w:tc>
+        <w:tc>
+          <w:tcPr/>
+          <w:p>
+            <w:pPr>
+              <w:pStyle w:val="Compact"/>
+            </w:pPr>
+            <w:r>
+              <w:t xml:space="preserve">Area-weighted center of mass</w:t>
+            </w:r>
+          </w:p>
+        </w:tc>
+        <w:tc>
+          <w:tcPr/>
+          <w:p>
+            <w:pPr>
+              <w:pStyle w:val="Compact"/>
+            </w:pPr>
+            <w:r>
+              <w:t xml:space="preserve">m</w:t>
+            </w:r>
+          </w:p>
+        </w:tc>
+      </w:tr>
+      <w:tr>
+        <w:tc>
+          <w:tcPr/>
+          <w:p>
+            <w:pPr>
+              <w:pStyle w:val="Compact"/>
+            </w:pPr>
+            <m:oMath>
+              <m:r>
+                <m:rPr>
+                  <m:sty m:val="b"/>
+                </m:rPr>
+                <m:t>C</m:t>
+              </m:r>
+            </m:oMath>
+          </w:p>
+        </w:tc>
+        <w:tc>
+          <w:tcPr/>
+          <w:p>
+            <w:pPr>
+              <w:pStyle w:val="Compact"/>
+            </w:pPr>
+            <w:r>
+              <w:t xml:space="preserve">Mass-normalized central covariance</w:t>
+            </w:r>
+          </w:p>
+        </w:tc>
+        <w:tc>
+          <w:tcPr/>
+          <w:p>
+            <w:pPr>
+              <w:pStyle w:val="Compact"/>
+            </w:pPr>
+            <w:r>
+              <w:t xml:space="preserve">m²</w:t>
+            </w:r>
+          </w:p>
+        </w:tc>
+      </w:tr>
+      <w:tr>
+        <w:tc>
+          <w:tcPr/>
+          <w:p>
+            <w:pPr>
+              <w:pStyle w:val="Compact"/>
+            </w:pPr>
+            <m:oMath>
+              <m:r>
+                <m:rPr>
+                  <m:sty m:val="b"/>
+                </m:rPr>
+                <m:t>I</m:t>
+              </m:r>
+            </m:oMath>
+          </w:p>
+        </w:tc>
+        <w:tc>
+          <w:tcPr/>
+          <w:p>
+            <w:pPr>
+              <w:pStyle w:val="Compact"/>
+            </w:pPr>
+            <w:r>
+              <w:t xml:space="preserve">Central inertia tensor</w:t>
+            </w:r>
+          </w:p>
+        </w:tc>
+        <w:tc>
+          <w:tcPr/>
+          <w:p>
+            <w:pPr>
+              <w:pStyle w:val="Compact"/>
+            </w:pPr>
+            <w:r>
+              <w:t xml:space="preserve">kg m²</w:t>
+            </w:r>
+          </w:p>
+        </w:tc>
+      </w:tr>
+    </w:tbl>
+    <w:bookmarkEnd w:id="113"/>
+    <w:bookmarkStart w:id="114" w:name="dimensional-checks-1"/>
+    <w:p>
+      <w:pPr>
+        <w:pStyle w:val="Heading3"/>
+      </w:pPr>
+      <w:r>
+        <w:t xml:space="preserve">Dimensional Checks</w:t>
+      </w:r>
+    </w:p>
+    <w:p>
+      <w:pPr>
+        <w:pStyle w:val="FirstParagraph"/>
+      </w:pPr>
+      <w:r>
+        <w:t xml:space="preserve">Area fractions are dimensionless. Nonzero areas and normalized face fractions</w:t>
+      </w:r>
+      <w:r>
+        <w:t xml:space="preserve"> </w:t>
+      </w:r>
+      <w:r>
+        <w:t xml:space="preserve">that underflow to zero in</w:t>
+      </w:r>
+      <w:r>
+        <w:t xml:space="preserve"> </w:t>
+      </w:r>
+      <w:r>
+        <w:rPr>
+          <w:rStyle w:val="VerbatimChar"/>
+        </w:rPr>
+        <w:t xml:space="preserve">float64</w:t>
+      </w:r>
+      <w:r>
+        <w:t xml:space="preserve"> </w:t>
+      </w:r>
+      <w:r>
+        <w:t xml:space="preserve">are rejected, not assigned zero mass or</w:t>
+      </w:r>
+      <w:r>
+        <w:t xml:space="preserve"> </w:t>
+      </w:r>
+      <w:r>
+        <w:t xml:space="preserve">reported as degenerate. No geometric area epsilon is used. The covariance has</w:t>
+      </w:r>
+      <w:r>
+        <w:t xml:space="preserve"> </w:t>
+      </w:r>
+      <w:r>
+        <w:t xml:space="preserve">units m² because it is an</w:t>
+      </w:r>
+      <w:r>
+        <w:t xml:space="preserve"> </w:t>
+      </w:r>
+      <w:r>
+        <w:t xml:space="preserve">area-weighted second central moment divided by total area. Multiplication by</w:t>
+      </w:r>
+      <w:r>
+        <w:t xml:space="preserve"> </w:t>
+      </w:r>
+      <w:r>
+        <w:t xml:space="preserve">mass yields kg m². The zero-thickness convention sets reported volume to 0 m³;</w:t>
+      </w:r>
+      <w:r>
+        <w:t xml:space="preserve"> </w:t>
+      </w:r>
+      <w:r>
+        <w:t xml:space="preserve">it is not an estimated enclosed volume.</w:t>
+      </w:r>
+    </w:p>
+    <w:bookmarkEnd w:id="114"/>
+    <w:bookmarkEnd w:id="115"/>
+    <w:bookmarkStart w:id="120" w:name="derivation-and-assumptions-1"/>
+    <w:p>
+      <w:pPr>
+        <w:pStyle w:val="Heading2"/>
+      </w:pPr>
+      <w:r>
+        <w:t xml:space="preserve">Derivation and Assumptions</w:t>
+      </w:r>
+    </w:p>
+    <w:bookmarkStart w:id="116" w:name="assumptions-1"/>
+    <w:p>
+      <w:pPr>
+        <w:pStyle w:val="Heading3"/>
+      </w:pPr>
+      <w:r>
+        <w:t xml:space="preserve">Assumptions</w:t>
+      </w:r>
+    </w:p>
+    <w:p>
+      <w:pPr>
+        <w:pStyle w:val="FirstParagraph"/>
+      </w:pPr>
+      <w:r>
+        <w:t xml:space="preserve">Each triangle carries uniform surface density, with one shared areal density</w:t>
+      </w:r>
+      <w:r>
+        <w:t xml:space="preserve"> </w:t>
+      </w:r>
+      <m:oMath>
+        <m:r>
+          <m:t>σ</m:t>
+        </m:r>
+        <m:r>
+          <m:rPr>
+            <m:sty m:val="p"/>
+          </m:rPr>
+          <m:t>=</m:t>
+        </m:r>
+        <m:r>
+          <m:t>m</m:t>
+        </m:r>
+        <m:r>
+          <m:rPr>
+            <m:sty m:val="p"/>
+          </m:rPr>
+          <m:t>/</m:t>
+        </m:r>
+        <m:r>
+          <m:t>A</m:t>
+        </m:r>
+      </m:oMath>
+      <w:r>
+        <w:t xml:space="preserve"> </w:t>
+      </w:r>
+      <w:r>
+        <w:t xml:space="preserve">over the entire input multiset. Mass is apportioned by unsigned</w:t>
+      </w:r>
+      <w:r>
+        <w:t xml:space="preserve"> </w:t>
+      </w:r>
+      <w:r>
+        <w:t xml:space="preserve">area. Triangles may be disconnected, overlap, coincide, or have inconsistent</w:t>
+      </w:r>
+      <w:r>
+        <w:t xml:space="preserve"> </w:t>
+      </w:r>
+      <w:r>
+        <w:t xml:space="preserve">winding; overlap is not removed. Degenerate zero-area triangles contribute no</w:t>
+      </w:r>
+      <w:r>
+        <w:t xml:space="preserve"> </w:t>
+      </w:r>
+      <w:r>
+        <w:t xml:space="preserve">mass and are reported separately. The derivation assumes ordinary Euclidean</w:t>
+      </w:r>
+      <w:r>
+        <w:t xml:space="preserve"> </w:t>
+      </w:r>
+      <w:r>
+        <w:t xml:space="preserve">coordinates and no thickness or volumetric contribution.</w:t>
+      </w:r>
+    </w:p>
+    <w:bookmarkEnd w:id="116"/>
+    <w:bookmarkStart w:id="119" w:name="derivation-1"/>
+    <w:p>
+      <w:pPr>
+        <w:pStyle w:val="Heading3"/>
+      </w:pPr>
+      <w:r>
+        <w:t xml:space="preserve">Derivation</w:t>
+      </w:r>
+    </w:p>
+    <w:p>
+      <w:pPr>
+        <w:pStyle w:val="FirstParagraph"/>
+      </w:pPr>
+      <w:r>
+        <w:t xml:space="preserve">For triangle vertices</w:t>
+      </w:r>
+      <w:r>
+        <w:t xml:space="preserve"> </w:t>
+      </w:r>
+      <m:oMath>
+        <m:sSub>
+          <m:e>
+            <m:r>
+              <m:rPr>
+                <m:sty m:val="b"/>
+              </m:rPr>
+              <m:t>v</m:t>
+            </m:r>
+          </m:e>
+          <m:sub>
+            <m:r>
+              <m:t>i</m:t>
+            </m:r>
+            <m:r>
+              <m:t>1</m:t>
+            </m:r>
+          </m:sub>
+        </m:sSub>
+        <m:r>
+          <m:rPr>
+            <m:sty m:val="p"/>
+          </m:rPr>
+          <m:t>,</m:t>
+        </m:r>
+        <m:sSub>
+          <m:e>
+            <m:r>
+              <m:rPr>
+                <m:sty m:val="b"/>
+              </m:rPr>
+              <m:t>v</m:t>
+            </m:r>
+          </m:e>
+          <m:sub>
+            <m:r>
+              <m:t>i</m:t>
+            </m:r>
+            <m:r>
+              <m:t>2</m:t>
+            </m:r>
+          </m:sub>
+        </m:sSub>
+        <m:r>
+          <m:rPr>
+            <m:sty m:val="p"/>
+          </m:rPr>
+          <m:t>,</m:t>
+        </m:r>
+        <m:sSub>
+          <m:e>
+            <m:r>
+              <m:rPr>
+                <m:sty m:val="b"/>
+              </m:rPr>
+              <m:t>v</m:t>
+            </m:r>
+          </m:e>
+          <m:sub>
+            <m:r>
+              <m:t>i</m:t>
+            </m:r>
+            <m:r>
+              <m:t>3</m:t>
+            </m:r>
+          </m:sub>
+        </m:sSub>
+      </m:oMath>
+      <w:r>
+        <w:t xml:space="preserve">,</w:t>
+      </w:r>
+    </w:p>
+    <w:p>
+      <w:pPr>
+        <w:pStyle w:val="BodyText"/>
+      </w:pPr>
+      <m:oMathPara>
+        <m:oMathParaPr>
+          <m:jc m:val="center"/>
+        </m:oMathParaPr>
+        <m:oMath>
+          <m:sSub>
+            <m:e>
+              <m:r>
+                <m:t>A</m:t>
+              </m:r>
+            </m:e>
+            <m:sub>
+              <m:r>
+                <m:t>i</m:t>
+              </m:r>
+            </m:sub>
+          </m:sSub>
+          <m:r>
+            <m:rPr>
+              <m:sty m:val="p"/>
+            </m:rPr>
+            <m:t>=</m:t>
+          </m:r>
+          <m:f>
+            <m:fPr>
+              <m:type m:val="bar"/>
+            </m:fPr>
+            <m:num>
+              <m:r>
+                <m:t>1</m:t>
+              </m:r>
+            </m:num>
+            <m:den>
+              <m:r>
+                <m:t>2</m:t>
+              </m:r>
+            </m:den>
+          </m:f>
+          <m:d>
+            <m:dPr>
+              <m:begChr m:val="∥"/>
+              <m:sepChr m:val=""/>
+              <m:endChr m:val="∥"/>
+              <m:grow/>
+            </m:dPr>
+            <m:e>
+              <m:r>
+                <m:rPr>
+                  <m:sty m:val="p"/>
+                </m:rPr>
+                <m:t>(</m:t>
+              </m:r>
+              <m:sSub>
+                <m:e>
+                  <m:r>
+                    <m:rPr>
+                      <m:sty m:val="b"/>
+                    </m:rPr>
+                    <m:t>v</m:t>
+                  </m:r>
+                </m:e>
+                <m:sub>
+                  <m:r>
+                    <m:t>i</m:t>
+                  </m:r>
+                  <m:r>
+                    <m:t>2</m:t>
+                  </m:r>
+                </m:sub>
+              </m:sSub>
+              <m:r>
+                <m:rPr>
+                  <m:sty m:val="p"/>
+                </m:rPr>
+                <m:t>−</m:t>
+              </m:r>
+              <m:sSub>
+                <m:e>
+                  <m:r>
+                    <m:rPr>
+                      <m:sty m:val="b"/>
+                    </m:rPr>
+                    <m:t>v</m:t>
+                  </m:r>
+                </m:e>
+                <m:sub>
+                  <m:r>
+                    <m:t>i</m:t>
+                  </m:r>
+                  <m:r>
+                    <m:t>1</m:t>
+                  </m:r>
+                </m:sub>
+              </m:sSub>
+              <m:r>
+                <m:rPr>
+                  <m:sty m:val="p"/>
+                </m:rPr>
+                <m:t>)</m:t>
+              </m:r>
+              <m:r>
+                <m:rPr>
+                  <m:sty m:val="p"/>
+                </m:rPr>
+                <m:t>×</m:t>
+              </m:r>
+              <m:r>
+                <m:rPr>
+                  <m:sty m:val="p"/>
+                </m:rPr>
+                <m:t>(</m:t>
+              </m:r>
+              <m:sSub>
+                <m:e>
+                  <m:r>
+                    <m:rPr>
+                      <m:sty m:val="b"/>
+                    </m:rPr>
+                    <m:t>v</m:t>
+                  </m:r>
+                </m:e>
+                <m:sub>
+                  <m:r>
+                    <m:t>i</m:t>
+                  </m:r>
+                  <m:r>
+                    <m:t>3</m:t>
+                  </m:r>
+                </m:sub>
+              </m:sSub>
+              <m:r>
+                <m:rPr>
+                  <m:sty m:val="p"/>
+                </m:rPr>
+                <m:t>−</m:t>
+              </m:r>
+              <m:sSub>
+                <m:e>
+                  <m:r>
+                    <m:rPr>
+                      <m:sty m:val="b"/>
+                    </m:rPr>
+                    <m:t>v</m:t>
+                  </m:r>
+                </m:e>
+                <m:sub>
+                  <m:r>
+                    <m:t>i</m:t>
+                  </m:r>
+                  <m:r>
+                    <m:t>1</m:t>
+                  </m:r>
+                </m:sub>
+              </m:sSub>
+              <m:r>
+                <m:rPr>
+                  <m:sty m:val="p"/>
+                </m:rPr>
+                <m:t>)</m:t>
+              </m:r>
+            </m:e>
+          </m:d>
+          <m:r>
+            <m:rPr>
+              <m:sty m:val="p"/>
+            </m:rPr>
+            <m:t>,</m:t>
+          </m:r>
+          <m:r>
+            <m:t>  </m:t>
+          </m:r>
+          <m:r>
+            <m:t>A</m:t>
+          </m:r>
+          <m:r>
+            <m:rPr>
+              <m:sty m:val="p"/>
+            </m:rPr>
+            <m:t>=</m:t>
+          </m:r>
+          <m:nary>
+            <m:naryPr>
+              <m:chr m:val="∑"/>
+              <m:limLoc m:val="undOvr"/>
+              <m:subHide m:val="off"/>
+              <m:supHide m:val="on"/>
+            </m:naryPr>
+            <m:sub>
+              <m:r>
+                <m:t>i</m:t>
+              </m:r>
+            </m:sub>
+            <m:sup>
+              <m:r>
+                <m:t>​</m:t>
+              </m:r>
+            </m:sup>
+            <m:e>
+              <m:sSub>
+                <m:e>
+                  <m:r>
+                    <m:t>A</m:t>
+                  </m:r>
+                </m:e>
+                <m:sub>
+                  <m:r>
+                    <m:t>i</m:t>
+                  </m:r>
+                </m:sub>
+              </m:sSub>
+            </m:e>
+          </m:nary>
+          <m:r>
+            <m:rPr>
+              <m:sty m:val="p"/>
+            </m:rPr>
+            <m:t>,</m:t>
+          </m:r>
+          <m:r>
+            <m:t>  </m:t>
+          </m:r>
+          <m:sSub>
+            <m:e>
+              <m:r>
+                <m:t>w</m:t>
+              </m:r>
+            </m:e>
+            <m:sub>
+              <m:r>
+                <m:t>i</m:t>
+              </m:r>
+            </m:sub>
+          </m:sSub>
+          <m:r>
+            <m:rPr>
+              <m:sty m:val="p"/>
+            </m:rPr>
+            <m:t>=</m:t>
+          </m:r>
+          <m:f>
+            <m:fPr>
+              <m:type m:val="bar"/>
+            </m:fPr>
+            <m:num>
+              <m:sSub>
+                <m:e>
+                  <m:r>
+                    <m:t>A</m:t>
+                  </m:r>
+                </m:e>
+                <m:sub>
+                  <m:r>
+                    <m:t>i</m:t>
+                  </m:r>
+                </m:sub>
+              </m:sSub>
+            </m:num>
+            <m:den>
+              <m:r>
+                <m:t>A</m:t>
+              </m:r>
+            </m:den>
+          </m:f>
+          <m:r>
+            <m:rPr>
+              <m:sty m:val="p"/>
+            </m:rPr>
+            <m:t>.</m:t>
+          </m:r>
+        </m:oMath>
+      </m:oMathPara>
+    </w:p>
+    <w:p>
+      <w:pPr>
+        <w:pStyle w:val="FirstParagraph"/>
+      </w:pPr>
+      <w:r>
+        <w:t xml:space="preserve">The triangle centroid is</w:t>
+      </w:r>
+      <w:r>
+        <w:t xml:space="preserve"> </w:t>
+      </w:r>
+      <m:oMath>
+        <m:sSub>
+          <m:e>
+            <m:r>
+              <m:rPr>
+                <m:sty m:val="b"/>
+              </m:rPr>
+              <m:t>c</m:t>
+            </m:r>
+          </m:e>
+          <m:sub>
+            <m:r>
+              <m:t>i</m:t>
+            </m:r>
+          </m:sub>
+        </m:sSub>
+        <m:r>
+          <m:rPr>
+            <m:sty m:val="p"/>
+          </m:rPr>
+          <m:t>=</m:t>
+        </m:r>
+        <m:r>
+          <m:rPr>
+            <m:sty m:val="p"/>
+          </m:rPr>
+          <m:t>(</m:t>
+        </m:r>
+        <m:sSub>
+          <m:e>
+            <m:r>
+              <m:rPr>
+                <m:sty m:val="b"/>
+              </m:rPr>
+              <m:t>v</m:t>
+            </m:r>
+          </m:e>
+          <m:sub>
+            <m:r>
+              <m:t>i</m:t>
+            </m:r>
+            <m:r>
+              <m:t>1</m:t>
+            </m:r>
+          </m:sub>
+        </m:sSub>
+        <m:r>
+          <m:rPr>
+            <m:sty m:val="p"/>
+          </m:rPr>
+          <m:t>+</m:t>
+        </m:r>
+        <m:sSub>
+          <m:e>
+            <m:r>
+              <m:rPr>
+                <m:sty m:val="b"/>
+              </m:rPr>
+              <m:t>v</m:t>
+            </m:r>
+          </m:e>
+          <m:sub>
+            <m:r>
+              <m:t>i</m:t>
+            </m:r>
+            <m:r>
+              <m:t>2</m:t>
+            </m:r>
+          </m:sub>
+        </m:sSub>
+        <m:r>
+          <m:rPr>
+            <m:sty m:val="p"/>
+          </m:rPr>
+          <m:t>+</m:t>
+        </m:r>
+        <m:sSub>
+          <m:e>
+            <m:r>
+              <m:rPr>
+                <m:sty m:val="b"/>
+              </m:rPr>
+              <m:t>v</m:t>
+            </m:r>
+          </m:e>
+          <m:sub>
+            <m:r>
+              <m:t>i</m:t>
+            </m:r>
+            <m:r>
+              <m:t>3</m:t>
+            </m:r>
+          </m:sub>
+        </m:sSub>
+        <m:r>
+          <m:rPr>
+            <m:sty m:val="p"/>
+          </m:rPr>
+          <m:t>)</m:t>
+        </m:r>
+        <m:r>
+          <m:rPr>
+            <m:sty m:val="p"/>
+          </m:rPr>
+          <m:t>/</m:t>
+        </m:r>
+        <m:r>
+          <m:t>3</m:t>
+        </m:r>
+      </m:oMath>
+      <w:r>
+        <w:t xml:space="preserve">, and the lamina center is</w:t>
+      </w:r>
+      <w:r>
+        <w:t xml:space="preserve"> </w:t>
+      </w:r>
+      <m:oMath>
+        <m:r>
+          <m:rPr>
+            <m:sty m:val="b"/>
+          </m:rPr>
+          <m:t>c</m:t>
+        </m:r>
+        <m:r>
+          <m:rPr>
+            <m:sty m:val="p"/>
+          </m:rPr>
+          <m:t>=</m:t>
+        </m:r>
+        <m:nary>
+          <m:naryPr>
+            <m:chr m:val="∑"/>
+            <m:limLoc m:val="undOvr"/>
+            <m:subHide m:val="off"/>
+            <m:supHide m:val="on"/>
+          </m:naryPr>
+          <m:sub>
+            <m:r>
+              <m:t>i</m:t>
+            </m:r>
+          </m:sub>
+          <m:sup>
+            <m:r>
+              <m:t>​</m:t>
+            </m:r>
+          </m:sup>
+          <m:e>
+            <m:sSub>
+              <m:e>
+                <m:r>
+                  <m:t>w</m:t>
+                </m:r>
+              </m:e>
+              <m:sub>
+                <m:r>
+                  <m:t>i</m:t>
+                </m:r>
+              </m:sub>
+            </m:sSub>
+          </m:e>
+        </m:nary>
+        <m:sSub>
+          <m:e>
+            <m:r>
+              <m:rPr>
+                <m:sty m:val="b"/>
+              </m:rPr>
+              <m:t>c</m:t>
+            </m:r>
+          </m:e>
+          <m:sub>
+            <m:r>
+              <m:t>i</m:t>
+            </m:r>
+          </m:sub>
+        </m:sSub>
+      </m:oMath>
+      <w:r>
+        <w:t xml:space="preserve">. Uniform barycentric coordinates on one</w:t>
+      </w:r>
+      <w:r>
+        <w:t xml:space="preserve"> </w:t>
+      </w:r>
+      <w:r>
+        <w:t xml:space="preserve">triangle have covariance</w:t>
+      </w:r>
+    </w:p>
+    <w:p>
+      <w:pPr>
+        <w:pStyle w:val="BodyText"/>
+      </w:pPr>
+      <m:oMathPara>
+        <m:oMathParaPr>
+          <m:jc m:val="center"/>
+        </m:oMathParaPr>
+        <m:oMath>
+          <m:sSub>
+            <m:e>
+              <m:r>
+                <m:rPr>
+                  <m:sty m:val="b"/>
+                </m:rPr>
+                <m:t>C</m:t>
+              </m:r>
+            </m:e>
+            <m:sub>
+              <m:r>
+                <m:t>i</m:t>
+              </m:r>
+            </m:sub>
+          </m:sSub>
+          <m:r>
+            <m:rPr>
+              <m:sty m:val="p"/>
+            </m:rPr>
+            <m:t>=</m:t>
+          </m:r>
+          <m:f>
+            <m:fPr>
+              <m:type m:val="bar"/>
+            </m:fPr>
+            <m:num>
+              <m:r>
+                <m:t>1</m:t>
+              </m:r>
+            </m:num>
+            <m:den>
+              <m:r>
+                <m:t>12</m:t>
+              </m:r>
+            </m:den>
+          </m:f>
+          <m:nary>
+            <m:naryPr>
+              <m:chr m:val="∑"/>
+              <m:limLoc m:val="undOvr"/>
+              <m:subHide m:val="off"/>
+              <m:supHide m:val="off"/>
+            </m:naryPr>
+            <m:sub>
+              <m:r>
+                <m:t>k</m:t>
+              </m:r>
+              <m:r>
+                <m:rPr>
+                  <m:sty m:val="p"/>
+                </m:rPr>
+                <m:t>=</m:t>
+              </m:r>
+              <m:r>
+                <m:t>1</m:t>
+              </m:r>
+            </m:sub>
+            <m:sup>
+              <m:r>
+                <m:t>3</m:t>
+              </m:r>
+            </m:sup>
+            <m:e>
+              <m:r>
+                <m:rPr>
+                  <m:sty m:val="p"/>
+                </m:rPr>
+                <m:t>(</m:t>
+              </m:r>
+            </m:e>
+          </m:nary>
+          <m:sSub>
+            <m:e>
+              <m:r>
+                <m:rPr>
+                  <m:sty m:val="b"/>
+                </m:rPr>
+                <m:t>v</m:t>
+              </m:r>
+            </m:e>
+            <m:sub>
+              <m:r>
+                <m:t>i</m:t>
+              </m:r>
+              <m:r>
+                <m:t>k</m:t>
+              </m:r>
+            </m:sub>
+          </m:sSub>
+          <m:r>
+            <m:rPr>
+              <m:sty m:val="p"/>
+            </m:rPr>
+            <m:t>−</m:t>
+          </m:r>
+          <m:sSub>
+            <m:e>
+              <m:r>
+                <m:rPr>
+                  <m:sty m:val="b"/>
+                </m:rPr>
+                <m:t>c</m:t>
+              </m:r>
+            </m:e>
+            <m:sub>
+              <m:r>
+                <m:t>i</m:t>
+              </m:r>
+            </m:sub>
+          </m:sSub>
+          <m:r>
+            <m:rPr>
+              <m:sty m:val="p"/>
+            </m:rPr>
+            <m:t>)</m:t>
+          </m:r>
+          <m:r>
+            <m:rPr>
+              <m:sty m:val="p"/>
+            </m:rPr>
+            <m:t>(</m:t>
+          </m:r>
+          <m:sSub>
+            <m:e>
+              <m:r>
+                <m:rPr>
+                  <m:sty m:val="b"/>
+                </m:rPr>
+                <m:t>v</m:t>
+              </m:r>
+            </m:e>
+            <m:sub>
+              <m:r>
+                <m:t>i</m:t>
+              </m:r>
+              <m:r>
+                <m:t>k</m:t>
+              </m:r>
+            </m:sub>
+          </m:sSub>
+          <m:r>
+            <m:rPr>
+              <m:sty m:val="p"/>
+            </m:rPr>
+            <m:t>−</m:t>
+          </m:r>
+          <m:sSub>
+            <m:e>
+              <m:r>
+                <m:rPr>
+                  <m:sty m:val="b"/>
+                </m:rPr>
+                <m:t>c</m:t>
+              </m:r>
+            </m:e>
+            <m:sub>
+              <m:r>
+                <m:t>i</m:t>
+              </m:r>
+            </m:sub>
+          </m:sSub>
+          <m:sSup>
+            <m:e>
+              <m:r>
+                <m:rPr>
+                  <m:sty m:val="p"/>
+                </m:rPr>
+                <m:t>)</m:t>
+              </m:r>
+            </m:e>
+            <m:sup>
+              <m:r>
+                <m:t>T</m:t>
+              </m:r>
+            </m:sup>
+          </m:sSup>
+          <m:r>
+            <m:rPr>
+              <m:sty m:val="p"/>
+            </m:rPr>
+            <m:t>.</m:t>
+          </m:r>
+        </m:oMath>
+      </m:oMathPara>
+    </w:p>
+    <w:p>
+      <w:pPr>
+        <w:pStyle w:val="FirstParagraph"/>
+      </w:pPr>
+      <w:r>
+        <w:t xml:space="preserve">Applying the law of total covariance over triangle identity and within-triangle</w:t>
+      </w:r>
+      <w:r>
+        <w:t xml:space="preserve"> </w:t>
+      </w:r>
+      <w:r>
+        <w:t xml:space="preserve">position gives</w:t>
+      </w:r>
+    </w:p>
+    <w:p>
+      <w:pPr>
+        <w:pStyle w:val="BodyText"/>
+      </w:pPr>
+      <w:bookmarkStart w:id="117" w:name="triangle-lamina-covariance"/>
+      <w:bookmarkEnd w:id="117"/>
+    </w:p>
+    <w:p>
+      <w:pPr>
+        <w:pStyle w:val="BodyText"/>
+      </w:pPr>
+      <m:oMathPara>
+        <m:oMathParaPr>
+          <m:jc m:val="center"/>
+        </m:oMathParaPr>
+        <m:oMath>
+          <m:r>
+            <m:rPr>
+              <m:sty m:val="b"/>
+            </m:rPr>
+            <m:t>C</m:t>
+          </m:r>
+          <m:r>
+            <m:rPr>
+              <m:sty m:val="p"/>
+            </m:rPr>
+            <m:t>=</m:t>
+          </m:r>
+          <m:nary>
+            <m:naryPr>
+              <m:chr m:val="∑"/>
+              <m:limLoc m:val="undOvr"/>
+              <m:subHide m:val="off"/>
+              <m:supHide m:val="on"/>
+            </m:naryPr>
+            <m:sub>
+              <m:r>
+                <m:t>i</m:t>
+              </m:r>
+            </m:sub>
+            <m:sup>
+              <m:r>
+                <m:t>​</m:t>
+              </m:r>
+            </m:sup>
+            <m:e>
+              <m:sSub>
+                <m:e>
+                  <m:r>
+                    <m:t>w</m:t>
+                  </m:r>
+                </m:e>
+                <m:sub>
+                  <m:r>
+                    <m:t>i</m:t>
+                  </m:r>
+                </m:sub>
+              </m:sSub>
+            </m:e>
+          </m:nary>
+          <m:d>
+            <m:dPr>
+              <m:begChr m:val="["/>
+              <m:sepChr m:val=""/>
+              <m:endChr m:val="]"/>
+              <m:grow/>
+            </m:dPr>
+            <m:e>
+              <m:sSub>
+                <m:e>
+                  <m:r>
+                    <m:rPr>
+                      <m:sty m:val="b"/>
+                    </m:rPr>
+                    <m:t>C</m:t>
+                  </m:r>
+                </m:e>
+                <m:sub>
+                  <m:r>
+                    <m:t>i</m:t>
+                  </m:r>
+                </m:sub>
+              </m:sSub>
+              <m:r>
+                <m:rPr>
+                  <m:sty m:val="p"/>
+                </m:rPr>
+                <m:t>+</m:t>
+              </m:r>
+              <m:r>
+                <m:rPr>
+                  <m:sty m:val="p"/>
+                </m:rPr>
+                <m:t>(</m:t>
+              </m:r>
+              <m:sSub>
+                <m:e>
+                  <m:r>
+                    <m:rPr>
+                      <m:sty m:val="b"/>
+                    </m:rPr>
+                    <m:t>c</m:t>
+                  </m:r>
+                </m:e>
+                <m:sub>
+                  <m:r>
+                    <m:t>i</m:t>
+                  </m:r>
+                </m:sub>
+              </m:sSub>
+              <m:r>
+                <m:rPr>
+                  <m:sty m:val="p"/>
+                </m:rPr>
+                <m:t>−</m:t>
+              </m:r>
+              <m:r>
+                <m:rPr>
+                  <m:sty m:val="b"/>
+                </m:rPr>
+                <m:t>c</m:t>
+              </m:r>
+              <m:r>
+                <m:rPr>
+                  <m:sty m:val="p"/>
+                </m:rPr>
+                <m:t>)</m:t>
+              </m:r>
+              <m:r>
+                <m:rPr>
+                  <m:sty m:val="p"/>
+                </m:rPr>
+                <m:t>(</m:t>
+              </m:r>
+              <m:sSub>
+                <m:e>
+                  <m:r>
+                    <m:rPr>
+                      <m:sty m:val="b"/>
+                    </m:rPr>
+                    <m:t>c</m:t>
+                  </m:r>
+                </m:e>
+                <m:sub>
+                  <m:r>
+                    <m:t>i</m:t>
+                  </m:r>
+                </m:sub>
+              </m:sSub>
+              <m:r>
+                <m:rPr>
+                  <m:sty m:val="p"/>
+                </m:rPr>
+                <m:t>−</m:t>
+              </m:r>
+              <m:r>
+                <m:rPr>
+                  <m:sty m:val="b"/>
+                </m:rPr>
+                <m:t>c</m:t>
+              </m:r>
+              <m:sSup>
+                <m:e>
+                  <m:r>
+                    <m:rPr>
+                      <m:sty m:val="p"/>
+                    </m:rPr>
+                    <m:t>)</m:t>
+                  </m:r>
+                </m:e>
+                <m:sup>
+                  <m:r>
+                    <m:t>T</m:t>
+                  </m:r>
+                </m:sup>
+              </m:sSup>
+            </m:e>
+          </m:d>
+          <m:r>
+            <m:rPr>
+              <m:sty m:val="p"/>
+            </m:rPr>
+            <m:t>.</m:t>
+          </m:r>
+        </m:oMath>
+      </m:oMathPara>
+    </w:p>
+    <w:p>
+      <w:pPr>
+        <w:pStyle w:val="FirstParagraph"/>
+      </w:pPr>
+      <w:r>
+        <w:t xml:space="preserve">For a mass distribution with central covariance</w:t>
+      </w:r>
+      <w:r>
+        <w:t xml:space="preserve"> </w:t>
+      </w:r>
+      <m:oMath>
+        <m:r>
+          <m:rPr>
+            <m:sty m:val="b"/>
+          </m:rPr>
+          <m:t>C</m:t>
+        </m:r>
+      </m:oMath>
+      <w:r>
+        <w:t xml:space="preserve">,</w:t>
+      </w:r>
+    </w:p>
+    <w:p>
+      <w:pPr>
+        <w:pStyle w:val="BodyText"/>
+      </w:pPr>
+      <w:bookmarkStart w:id="118" w:name="triangle-lamina-inertia"/>
+      <w:bookmarkEnd w:id="118"/>
+    </w:p>
+    <w:p>
+      <w:pPr>
+        <w:pStyle w:val="BodyText"/>
+      </w:pPr>
+      <m:oMathPara>
+        <m:oMathParaPr>
+          <m:jc m:val="center"/>
+        </m:oMathParaPr>
+        <m:oMath>
+          <m:r>
+            <m:rPr>
+              <m:sty m:val="b"/>
+            </m:rPr>
+            <m:t>I</m:t>
+          </m:r>
+          <m:r>
+            <m:rPr>
+              <m:sty m:val="p"/>
+            </m:rPr>
+            <m:t>=</m:t>
+          </m:r>
+          <m:r>
+            <m:t>m</m:t>
+          </m:r>
+          <m:d>
+            <m:dPr>
+              <m:begChr m:val="["/>
+              <m:sepChr m:val=""/>
+              <m:endChr m:val="]"/>
+              <m:grow/>
+            </m:dPr>
+            <m:e>
+              <m:r>
+                <m:rPr>
+                  <m:sty m:val="p"/>
+                </m:rPr>
+                <m:t>tr</m:t>
+              </m:r>
+              <m:r>
+                <m:rPr>
+                  <m:sty m:val="p"/>
+                </m:rPr>
+                <m:t>(</m:t>
+              </m:r>
+              <m:r>
+                <m:rPr>
+                  <m:sty m:val="b"/>
+                </m:rPr>
+                <m:t>C</m:t>
+              </m:r>
+              <m:r>
+                <m:rPr>
+                  <m:sty m:val="p"/>
+                </m:rPr>
+                <m:t>)</m:t>
+              </m:r>
+              <m:sSub>
+                <m:e>
+                  <m:r>
+                    <m:rPr>
+                      <m:sty m:val="b"/>
+                    </m:rPr>
+                    <m:t>1</m:t>
+                  </m:r>
+                </m:e>
+                <m:sub>
+                  <m:r>
+                    <m:t>3</m:t>
+                  </m:r>
+                </m:sub>
+              </m:sSub>
+              <m:r>
+                <m:rPr>
+                  <m:sty m:val="p"/>
+                </m:rPr>
+                <m:t>−</m:t>
+              </m:r>
+              <m:r>
+                <m:rPr>
+                  <m:sty m:val="b"/>
+                </m:rPr>
+                <m:t>C</m:t>
+              </m:r>
+            </m:e>
+          </m:d>
+          <m:r>
+            <m:rPr>
+              <m:sty m:val="p"/>
+            </m:rPr>
+            <m:t>.</m:t>
+          </m:r>
+        </m:oMath>
+      </m:oMathPara>
+    </w:p>
+    <w:p>
+      <w:pPr>
+        <w:pStyle w:val="FirstParagraph"/>
+      </w:pPr>
+      <w:r>
+        <w:t xml:space="preserve">This formula returns the standard inertia tensor, including signed</w:t>
+      </w:r>
+      <w:r>
+        <w:t xml:space="preserve"> </w:t>
+      </w:r>
+      <w:r>
+        <w:t xml:space="preserve">off-diagonal tensor components.</w:t>
+      </w:r>
+      <w:r>
+        <w:t xml:space="preserve"> </w:t>
+      </w:r>
+      <w:r>
+        <w:rPr>
+          <w:rStyle w:val="VerbatimChar"/>
+        </w:rPr>
+        <w:t xml:space="preserve">InertiaResult.as_urdf_dict()</w:t>
+      </w:r>
+      <w:r>
+        <w:t xml:space="preserve"> </w:t>
+      </w:r>
+      <w:r>
+        <w:t xml:space="preserve">exports those</w:t>
+      </w:r>
+      <w:r>
+        <w:t xml:space="preserve"> </w:t>
+      </w:r>
+      <w:r>
+        <w:t xml:space="preserve">same symmetric tensor entries as URDF</w:t>
+      </w:r>
+      <w:r>
+        <w:t xml:space="preserve"> </w:t>
+      </w:r>
+      <w:r>
+        <w:rPr>
+          <w:rStyle w:val="VerbatimChar"/>
+        </w:rPr>
+        <w:t xml:space="preserve">ixy</w:t>
+      </w:r>
+      <w:r>
+        <w:t xml:space="preserve">,</w:t>
+      </w:r>
+      <w:r>
+        <w:t xml:space="preserve"> </w:t>
+      </w:r>
+      <w:r>
+        <w:rPr>
+          <w:rStyle w:val="VerbatimChar"/>
+        </w:rPr>
+        <w:t xml:space="preserve">ixz</w:t>
+      </w:r>
+      <w:r>
+        <w:t xml:space="preserve">, and</w:t>
+      </w:r>
+      <w:r>
+        <w:t xml:space="preserve"> </w:t>
+      </w:r>
+      <w:r>
+        <w:rPr>
+          <w:rStyle w:val="VerbatimChar"/>
+        </w:rPr>
+        <w:t xml:space="preserve">iyz</w:t>
+      </w:r>
+      <w:r>
+        <w:t xml:space="preserve"> </w:t>
+      </w:r>
+      <w:r>
+        <w:t xml:space="preserve">coefficients.</w:t>
+      </w:r>
+      <w:r>
+        <w:t xml:space="preserve"> </w:t>
+      </w:r>
+      <w:r>
+        <w:t xml:space="preserve">The exporter does not negate them: an actual MuJoCo URDF loadback test checks</w:t>
+      </w:r>
+      <w:r>
+        <w:t xml:space="preserve"> </w:t>
+      </w:r>
+      <w:r>
+        <w:t xml:space="preserve">the reconstructed native tensor and kinetic energy for an asymmetric inertia.</w:t>
+      </w:r>
+      <w:r>
+        <w:t xml:space="preserve"> </w:t>
+      </w:r>
+      <w:r>
+        <w:t xml:space="preserve">This verifies that particular exporter/consumer path, not every URDF parser or</w:t>
+      </w:r>
+      <w:r>
+        <w:t xml:space="preserve"> </w:t>
+      </w:r>
+      <w:r>
+        <w:t xml:space="preserve">native engine.</w:t>
+      </w:r>
+    </w:p>
+    <w:bookmarkEnd w:id="119"/>
+    <w:bookmarkEnd w:id="120"/>
+    <w:bookmarkStart w:id="124" w:name="algorithm-1"/>
+    <w:p>
+      <w:pPr>
+        <w:pStyle w:val="Heading2"/>
+      </w:pPr>
+      <w:r>
+        <w:t xml:space="preserve">Algorithm</w:t>
+      </w:r>
+    </w:p>
+    <w:bookmarkStart w:id="121" w:name="inputs-1"/>
+    <w:p>
+      <w:pPr>
+        <w:pStyle w:val="Heading3"/>
+      </w:pPr>
+      <w:r>
+        <w:t xml:space="preserve">Inputs</w:t>
+      </w:r>
+    </w:p>
+    <w:p>
+      <w:pPr>
+        <w:pStyle w:val="FirstParagraph"/>
+      </w:pPr>
+      <w:r>
+        <w:t xml:space="preserve">The public function</w:t>
+      </w:r>
+      <w:r>
+        <w:t xml:space="preserve"> </w:t>
+      </w:r>
+      <w:r>
+        <w:rPr>
+          <w:rStyle w:val="VerbatimChar"/>
+        </w:rPr>
+        <w:t xml:space="preserve">compute_triangle_lamina(vertices, faces, mass)</w:t>
+      </w:r>
+      <w:r>
+        <w:t xml:space="preserve"> </w:t>
+      </w:r>
+      <w:r>
+        <w:t xml:space="preserve">consumes</w:t>
+      </w:r>
+      <w:r>
+        <w:t xml:space="preserve"> </w:t>
+      </w:r>
+      <w:r>
+        <w:t xml:space="preserve">only the arrays and scalar above. It does not consume a path, mesh object,</w:t>
+      </w:r>
+      <w:r>
+        <w:t xml:space="preserve"> </w:t>
+      </w:r>
+      <w:r>
+        <w:t xml:space="preserve">transform, frame label, density, thickness, or native model.</w:t>
+      </w:r>
+    </w:p>
+    <w:bookmarkEnd w:id="121"/>
+    <w:bookmarkStart w:id="122" w:name="procedure-1"/>
+    <w:p>
+      <w:pPr>
+        <w:pStyle w:val="Heading3"/>
+      </w:pPr>
+      <w:r>
+        <w:t xml:space="preserve">Procedure</w:t>
+      </w:r>
+    </w:p>
+    <w:p>
+      <w:pPr>
+        <w:pStyle w:val="Compact"/>
+        <w:numPr>
+          <w:ilvl w:val="0"/>
+          <w:numId w:val="1004"/>
+        </w:numPr>
+      </w:pPr>
+      <w:r>
+        <w:t xml:space="preserve">Validate the mass and array shapes, finiteness, face dtype, and index bounds.</w:t>
+      </w:r>
+    </w:p>
+    <w:p>
+      <w:pPr>
+        <w:pStyle w:val="Compact"/>
+        <w:numPr>
+          <w:ilvl w:val="0"/>
+          <w:numId w:val="1004"/>
+        </w:numPr>
+      </w:pPr>
+      <w:r>
+        <w:t xml:space="preserve">Gather indexed triangles and compute unsigned area weights.</w:t>
+      </w:r>
+    </w:p>
+    <w:p>
+      <w:pPr>
+        <w:pStyle w:val="Compact"/>
+        <w:numPr>
+          <w:ilvl w:val="0"/>
+          <w:numId w:val="1004"/>
+        </w:numPr>
+      </w:pPr>
+      <w:r>
+        <w:t xml:space="preserve">Reject nonpositive or nonfinite total area; omit only exactly zero-area</w:t>
+      </w:r>
+      <w:r>
+        <w:t xml:space="preserve"> </w:t>
+      </w:r>
+      <w:r>
+        <w:t xml:space="preserve">triangles from moment/topology accumulation.</w:t>
+      </w:r>
+    </w:p>
+    <w:p>
+      <w:pPr>
+        <w:pStyle w:val="Compact"/>
+        <w:numPr>
+          <w:ilvl w:val="0"/>
+          <w:numId w:val="1004"/>
+        </w:numPr>
+      </w:pPr>
+      <w:r>
+        <w:t xml:space="preserve">Choose the first vertex of a maximum-area face as a local origin, then</w:t>
+      </w:r>
+      <w:r>
+        <w:t xml:space="preserve"> </w:t>
+      </w:r>
+      <w:r>
+        <w:t xml:space="preserve">compute weighted center and central covariance in that translated frame.</w:t>
+      </w:r>
+    </w:p>
+    <w:p>
+      <w:pPr>
+        <w:pStyle w:val="Compact"/>
+        <w:numPr>
+          <w:ilvl w:val="0"/>
+          <w:numId w:val="1004"/>
+        </w:numPr>
+      </w:pPr>
+      <w:r>
+        <w:t xml:space="preserve">Convert covariance to inertia and reject nonfinite center or tensor values.</w:t>
+      </w:r>
+    </w:p>
+    <w:p>
+      <w:pPr>
+        <w:pStyle w:val="Compact"/>
+        <w:numPr>
+          <w:ilvl w:val="0"/>
+          <w:numId w:val="1004"/>
+        </w:numPr>
+      </w:pPr>
+      <w:r>
+        <w:t xml:space="preserve">Count exact duplicate positive-area coordinate triangles independent of</w:t>
+      </w:r>
+      <w:r>
+        <w:t xml:space="preserve"> </w:t>
+      </w:r>
+      <w:r>
+        <w:t xml:space="preserve">winding, and count edge degree using source vertex indices.</w:t>
+      </w:r>
+    </w:p>
+    <w:p>
+      <w:pPr>
+        <w:pStyle w:val="Compact"/>
+        <w:numPr>
+          <w:ilvl w:val="0"/>
+          <w:numId w:val="1004"/>
+        </w:numPr>
+      </w:pPr>
+      <w:r>
+        <w:t xml:space="preserve">Return a distinct lamina mode and explicit diagnostics without repairing or</w:t>
+      </w:r>
+      <w:r>
+        <w:t xml:space="preserve"> </w:t>
+      </w:r>
+      <w:r>
+        <w:t xml:space="preserve">modifying source arrays.</w:t>
+      </w:r>
+    </w:p>
+    <w:p>
+      <w:pPr>
+        <w:pStyle w:val="FirstParagraph"/>
+      </w:pPr>
+      <w:r>
+        <w:t xml:space="preserve">The numerical arrays are vectorized over faces. Working memory is linear in</w:t>
+      </w:r>
+      <w:r>
+        <w:t xml:space="preserve"> </w:t>
+      </w:r>
+      <w:r>
+        <w:t xml:space="preserve">the number of input faces; uniqueness diagnostics sort/compare face and edge</w:t>
+      </w:r>
+      <w:r>
+        <w:t xml:space="preserve"> </w:t>
+      </w:r>
+      <w:r>
+        <w:t xml:space="preserve">records and are not a streaming algorithm.</w:t>
+      </w:r>
+    </w:p>
+    <w:bookmarkEnd w:id="122"/>
+    <w:bookmarkStart w:id="123" w:name="outputs-1"/>
+    <w:p>
+      <w:pPr>
+        <w:pStyle w:val="Heading3"/>
+      </w:pPr>
+      <w:r>
+        <w:t xml:space="preserve">Outputs</w:t>
+      </w:r>
+    </w:p>
+    <w:p>
+      <w:pPr>
+        <w:pStyle w:val="FirstParagraph"/>
+      </w:pPr>
+      <w:r>
+        <w:rPr>
+          <w:rStyle w:val="VerbatimChar"/>
+        </w:rPr>
+        <w:t xml:space="preserve">TriangleLaminaResult</w:t>
+      </w:r>
+      <w:r>
+        <w:t xml:space="preserve"> </w:t>
+      </w:r>
+      <w:r>
+        <w:t xml:space="preserve">contains an</w:t>
+      </w:r>
+      <w:r>
+        <w:t xml:space="preserve"> </w:t>
+      </w:r>
+      <w:r>
+        <w:rPr>
+          <w:rStyle w:val="VerbatimChar"/>
+        </w:rPr>
+        <w:t xml:space="preserve">InertiaResult</w:t>
+      </w:r>
+      <w:r>
+        <w:t xml:space="preserve">, total area, zero-area face</w:t>
+      </w:r>
+      <w:r>
+        <w:t xml:space="preserve"> </w:t>
+      </w:r>
+      <w:r>
+        <w:t xml:space="preserve">count, duplicate positive-area coordinate-face count, indexed boundary-edge</w:t>
+      </w:r>
+      <w:r>
+        <w:t xml:space="preserve"> </w:t>
+      </w:r>
+      <w:r>
+        <w:t xml:space="preserve">count, and indexed nonmanifold-edge count. The embedded legacy result object</w:t>
+      </w:r>
+      <w:r>
+        <w:t xml:space="preserve"> </w:t>
+      </w:r>
+      <w:r>
+        <w:t xml:space="preserve">remains mutable for compatibility. Counts are diagnostics, not mesh validation.</w:t>
+      </w:r>
+    </w:p>
+    <w:bookmarkEnd w:id="123"/>
+    <w:bookmarkEnd w:id="124"/>
+    <w:bookmarkStart w:id="127" w:name="implementation-symbols-1"/>
+    <w:p>
+      <w:pPr>
+        <w:pStyle w:val="Heading2"/>
+      </w:pPr>
+      <w:r>
+        <w:t xml:space="preserve">Implementation Symbols</w:t>
+      </w:r>
+    </w:p>
+    <w:bookmarkStart w:id="125" w:name="public-symbols-1"/>
+    <w:p>
+      <w:pPr>
+        <w:pStyle w:val="Heading3"/>
+      </w:pPr>
+      <w:r>
+        <w:t xml:space="preserve">Public Symbols</w:t>
+      </w:r>
+    </w:p>
+    <w:p>
+      <w:pPr>
+        <w:pStyle w:val="FirstParagraph"/>
+      </w:pPr>
+      <w:r>
+        <w:rPr>
+          <w:rStyle w:val="VerbatimChar"/>
+        </w:rPr>
+        <w:t xml:space="preserve">compute_triangle_lamina</w:t>
+      </w:r>
+      <w:r>
+        <w:t xml:space="preserve"> </w:t>
+      </w:r>
+      <w:r>
+        <w:t xml:space="preserve">and</w:t>
+      </w:r>
+      <w:r>
+        <w:t xml:space="preserve"> </w:t>
+      </w:r>
+      <w:r>
+        <w:rPr>
+          <w:rStyle w:val="VerbatimChar"/>
+        </w:rPr>
+        <w:t xml:space="preserve">TriangleLaminaResult</w:t>
+      </w:r>
+      <w:r>
+        <w:t xml:space="preserve"> </w:t>
+      </w:r>
+      <w:r>
+        <w:t xml:space="preserve">are defined in</w:t>
+      </w:r>
+      <w:r>
+        <w:t xml:space="preserve"> </w:t>
+      </w:r>
+      <w:r>
+        <w:rPr>
+          <w:rStyle w:val="VerbatimChar"/>
+        </w:rPr>
+        <w:t xml:space="preserve">src/shared/python/humanoid_character_builder/mesh/triangle_lamina.py</w:t>
+      </w:r>
+      <w:r>
+        <w:t xml:space="preserve">.</w:t>
+      </w:r>
+      <w:r>
+        <w:t xml:space="preserve"> </w:t>
+      </w:r>
+      <w:r>
+        <w:rPr>
+          <w:rStyle w:val="VerbatimChar"/>
+        </w:rPr>
+        <w:t xml:space="preserve">InertiaMode.TRIANGLE_MULTISET_LAMINA_MASS</w:t>
+      </w:r>
+      <w:r>
+        <w:t xml:space="preserve"> </w:t>
+      </w:r>
+      <w:r>
+        <w:t xml:space="preserve">and the compatible</w:t>
+      </w:r>
+      <w:r>
+        <w:t xml:space="preserve"> </w:t>
+      </w:r>
+      <w:r>
+        <w:rPr>
+          <w:rStyle w:val="VerbatimChar"/>
+        </w:rPr>
+        <w:t xml:space="preserve">InertiaResult</w:t>
+      </w:r>
+      <w:r>
+        <w:t xml:space="preserve"> </w:t>
+      </w:r>
+      <w:r>
+        <w:t xml:space="preserve">representation are defined in</w:t>
+      </w:r>
+      <w:r>
+        <w:t xml:space="preserve"> </w:t>
+      </w:r>
+      <w:r>
+        <w:rPr>
+          <w:rStyle w:val="VerbatimChar"/>
+        </w:rPr>
+        <w:t xml:space="preserve">src/shared/python/humanoid_character_builder/mesh/inertia_calculator.py</w:t>
+      </w:r>
+      <w:r>
+        <w:t xml:space="preserve">.</w:t>
+      </w:r>
+      <w:r>
+        <w:t xml:space="preserve"> </w:t>
+      </w:r>
+      <w:r>
+        <w:t xml:space="preserve">This note does not assert that the module is a stable published consumer API.</w:t>
+      </w:r>
+    </w:p>
+    <w:bookmarkEnd w:id="125"/>
+    <w:bookmarkStart w:id="126" w:name="source-mapping-1"/>
+    <w:p>
+      <w:pPr>
+        <w:pStyle w:val="Heading3"/>
+      </w:pPr>
+      <w:r>
+        <w:t xml:space="preserve">Source Mapping</w:t>
+      </w:r>
+    </w:p>
+    <w:p>
+      <w:pPr>
+        <w:pStyle w:val="FirstParagraph"/>
+      </w:pPr>
+      <w:r>
+        <w:t xml:space="preserve">The method maps to</w:t>
+      </w:r>
+      <w:r>
+        <w:t xml:space="preserve"> </w:t>
+      </w:r>
+      <w:r>
+        <w:rPr>
+          <w:rStyle w:val="VerbatimChar"/>
+        </w:rPr>
+        <w:t xml:space="preserve">_area_weights</w:t>
+      </w:r>
+      <w:r>
+        <w:t xml:space="preserve">,</w:t>
+      </w:r>
+      <w:r>
+        <w:t xml:space="preserve"> </w:t>
+      </w:r>
+      <w:r>
+        <w:rPr>
+          <w:rStyle w:val="VerbatimChar"/>
+        </w:rPr>
+        <w:t xml:space="preserve">_centered_moments</w:t>
+      </w:r>
+      <w:r>
+        <w:t xml:space="preserve">, and</w:t>
+      </w:r>
+      <w:r>
+        <w:t xml:space="preserve"> </w:t>
+      </w:r>
+      <w:r>
+        <w:rPr>
+          <w:rStyle w:val="VerbatimChar"/>
+        </w:rPr>
+        <w:t xml:space="preserve">compute_triangle_lamina</w:t>
+      </w:r>
+      <w:r>
+        <w:t xml:space="preserve"> </w:t>
+      </w:r>
+      <w:r>
+        <w:t xml:space="preserve">in</w:t>
+      </w:r>
+      <w:r>
+        <w:t xml:space="preserve"> </w:t>
+      </w:r>
+      <w:r>
+        <w:rPr>
+          <w:rStyle w:val="VerbatimChar"/>
+        </w:rPr>
+        <w:t xml:space="preserve">triangle_lamina.py</w:t>
+      </w:r>
+      <w:r>
+        <w:t xml:space="preserve">; mode identity is mapped in</w:t>
+      </w:r>
+      <w:r>
+        <w:t xml:space="preserve"> </w:t>
+      </w:r>
+      <w:r>
+        <w:rPr>
+          <w:rStyle w:val="VerbatimChar"/>
+        </w:rPr>
+        <w:t xml:space="preserve">inertia_calculator.py</w:t>
+      </w:r>
+      <w:r>
+        <w:t xml:space="preserve">. Analytic and metamorphic checks are in</w:t>
+      </w:r>
+      <w:r>
+        <w:t xml:space="preserve"> </w:t>
+      </w:r>
+      <w:r>
+        <w:rPr>
+          <w:rStyle w:val="VerbatimChar"/>
+        </w:rPr>
+        <w:t xml:space="preserve">src/shared/python/humanoid_character_builder/tests/test_triangle_lamina.py</w:t>
+      </w:r>
+      <w:r>
+        <w:t xml:space="preserve">.</w:t>
+      </w:r>
+      <w:r>
+        <w:t xml:space="preserve"> </w:t>
+      </w:r>
+      <w:r>
+        <w:t xml:space="preserve">This kernel is separate from</w:t>
+      </w:r>
+      <w:r>
+        <w:t xml:space="preserve"> </w:t>
+      </w:r>
+      <w:r>
+        <w:rPr>
+          <w:rStyle w:val="VerbatimChar"/>
+        </w:rPr>
+        <w:t xml:space="preserve">MeshInertiaCalculator</w:t>
+      </w:r>
+      <w:r>
+        <w:t xml:space="preserve">, which derives solid</w:t>
+      </w:r>
+      <w:r>
+        <w:t xml:space="preserve"> </w:t>
+      </w:r>
+      <w:r>
+        <w:t xml:space="preserve">properties from volume-mesh processing and watertightness policy.</w:t>
+      </w:r>
+    </w:p>
+    <w:bookmarkEnd w:id="126"/>
+    <w:bookmarkEnd w:id="127"/>
+    <w:bookmarkStart w:id="130" w:name="error-and-failure-semantics-1"/>
+    <w:p>
+      <w:pPr>
+        <w:pStyle w:val="Heading2"/>
+      </w:pPr>
+      <w:r>
+        <w:t xml:space="preserve">Error and Failure Semantics</w:t>
+      </w:r>
+    </w:p>
+    <w:bookmarkStart w:id="128" w:name="error-conditions-1"/>
+    <w:p>
+      <w:pPr>
+        <w:pStyle w:val="Heading3"/>
+      </w:pPr>
+      <w:r>
+        <w:t xml:space="preserve">Error Conditions</w:t>
+      </w:r>
+    </w:p>
+    <w:p>
+      <w:pPr>
+        <w:pStyle w:val="FirstParagraph"/>
+      </w:pPr>
+      <w:r>
+        <w:t xml:space="preserve">Wrong scalar kind or noninteger face indices raise</w:t>
+      </w:r>
+      <w:r>
+        <w:t xml:space="preserve"> </w:t>
+      </w:r>
+      <w:r>
+        <w:rPr>
+          <w:rStyle w:val="VerbatimChar"/>
+        </w:rPr>
+        <w:t xml:space="preserve">TypeError</w:t>
+      </w:r>
+      <w:r>
+        <w:t xml:space="preserve">. Invalid scalar</w:t>
+      </w:r>
+      <w:r>
+        <w:t xml:space="preserve"> </w:t>
+      </w:r>
+      <w:r>
+        <w:t xml:space="preserve">range, malformed/nonfinite vertices, face shape or bounds, no positive finite</w:t>
+      </w:r>
+      <w:r>
+        <w:t xml:space="preserve"> </w:t>
+      </w:r>
+      <w:r>
+        <w:t xml:space="preserve">total area, and nonfinite output moments raise</w:t>
+      </w:r>
+      <w:r>
+        <w:t xml:space="preserve"> </w:t>
+      </w:r>
+      <w:r>
+        <w:rPr>
+          <w:rStyle w:val="VerbatimChar"/>
+        </w:rPr>
+        <w:t xml:space="preserve">ValueError</w:t>
+      </w:r>
+      <w:r>
+        <w:t xml:space="preserve">. The function does</w:t>
+      </w:r>
+      <w:r>
+        <w:t xml:space="preserve"> </w:t>
+      </w:r>
+      <w:r>
+        <w:t xml:space="preserve">not repair malformed topology or substitute default mass/geometry.</w:t>
+      </w:r>
+    </w:p>
+    <w:bookmarkEnd w:id="128"/>
+    <w:bookmarkStart w:id="129" w:name="recovery-and-cancellation-1"/>
+    <w:p>
+      <w:pPr>
+        <w:pStyle w:val="Heading3"/>
+      </w:pPr>
+      <w:r>
+        <w:t xml:space="preserve">Recovery and Cancellation</w:t>
+      </w:r>
+    </w:p>
+    <w:p>
+      <w:pPr>
+        <w:pStyle w:val="FirstParagraph"/>
+      </w:pPr>
+      <w:r>
+        <w:t xml:space="preserve">The caller must correct source inputs and resubmit. There is no partial result,</w:t>
+      </w:r>
+      <w:r>
+        <w:t xml:space="preserve"> </w:t>
+      </w:r>
+      <w:r>
+        <w:t xml:space="preserve">fallback solid calculation, or cancellation callback. Large inputs are bounded</w:t>
+      </w:r>
+      <w:r>
+        <w:t xml:space="preserve"> </w:t>
+      </w:r>
+      <w:r>
+        <w:t xml:space="preserve">only by caller-provided memory and face count; this API provides no resource</w:t>
+      </w:r>
+      <w:r>
+        <w:t xml:space="preserve"> </w:t>
+      </w:r>
+      <w:r>
+        <w:t xml:space="preserve">budget or streaming cancellation guarantee.</w:t>
+      </w:r>
+    </w:p>
+    <w:bookmarkEnd w:id="129"/>
+    <w:bookmarkEnd w:id="130"/>
+    <w:bookmarkStart w:id="133" w:name="uncertainty-and-sensitivity-1"/>
+    <w:p>
+      <w:pPr>
+        <w:pStyle w:val="Heading2"/>
+      </w:pPr>
+      <w:r>
+        <w:t xml:space="preserve">Uncertainty and Sensitivity</w:t>
+      </w:r>
+    </w:p>
+    <w:bookmarkStart w:id="131" w:name="uncertainty-sources-1"/>
+    <w:p>
+      <w:pPr>
+        <w:pStyle w:val="Heading3"/>
+      </w:pPr>
+      <w:r>
+        <w:t xml:space="preserve">Uncertainty Sources</w:t>
+      </w:r>
+    </w:p>
+    <w:p>
+      <w:pPr>
+        <w:pStyle w:val="FirstParagraph"/>
+      </w:pPr>
+      <w:r>
+        <w:t xml:space="preserve">This kernel propagates no uncertainty distribution. Its values depend on</w:t>
+      </w:r>
+      <w:r>
+        <w:t xml:space="preserve"> </w:t>
+      </w:r>
+      <w:r>
+        <w:t xml:space="preserve">caller-selected coordinates, mesh sampling, face multiplicity, declared mass,</w:t>
+      </w:r>
+      <w:r>
+        <w:t xml:space="preserve"> </w:t>
+      </w:r>
+      <w:r>
+        <w:t xml:space="preserve">and the unverified assumption of uniform area density. It does not determine</w:t>
+      </w:r>
+      <w:r>
+        <w:t xml:space="preserve"> </w:t>
+      </w:r>
+      <w:r>
+        <w:t xml:space="preserve">whether those assumptions are appropriate for an object or body segment.</w:t>
+      </w:r>
+    </w:p>
+    <w:bookmarkEnd w:id="131"/>
+    <w:bookmarkStart w:id="132" w:name="sensitivity-1"/>
+    <w:p>
+      <w:pPr>
+        <w:pStyle w:val="Heading3"/>
+      </w:pPr>
+      <w:r>
+        <w:t xml:space="preserve">Sensitivity</w:t>
+      </w:r>
+    </w:p>
+    <w:p>
+      <w:pPr>
+        <w:pStyle w:val="FirstParagraph"/>
+      </w:pPr>
+      <w:r>
+        <w:t xml:space="preserve">Area and second moments are sensitive to coordinate perturbations and changes</w:t>
+      </w:r>
+      <w:r>
+        <w:t xml:space="preserve"> </w:t>
+      </w:r>
+      <w:r>
+        <w:t xml:space="preserve">in tessellation or face multiplicity. Very small representable positive areas</w:t>
+      </w:r>
+      <w:r>
+        <w:t xml:space="preserve"> </w:t>
+      </w:r>
+      <w:r>
+        <w:t xml:space="preserve">remain in the calculation; no tolerance silently removes them. Nonzero areas</w:t>
+      </w:r>
+      <w:r>
+        <w:t xml:space="preserve"> </w:t>
+      </w:r>
+      <w:r>
+        <w:t xml:space="preserve">or fractions not representable as positive</w:t>
+      </w:r>
+      <w:r>
+        <w:t xml:space="preserve"> </w:t>
+      </w:r>
+      <w:r>
+        <w:rPr>
+          <w:rStyle w:val="VerbatimChar"/>
+        </w:rPr>
+        <w:t xml:space="preserve">float64</w:t>
+      </w:r>
+      <w:r>
+        <w:t xml:space="preserve"> </w:t>
+      </w:r>
+      <w:r>
+        <w:t xml:space="preserve">are rejected. Summation</w:t>
+      </w:r>
+      <w:r>
+        <w:t xml:space="preserve"> </w:t>
+      </w:r>
+      <w:r>
+        <w:t xml:space="preserve">and floating-point rounding still affect results. The local-origin accumulation</w:t>
+      </w:r>
+      <w:r>
+        <w:t xml:space="preserve"> </w:t>
+      </w:r>
+      <w:r>
+        <w:t xml:space="preserve">reduces avoidable cancellation for translated geometry but does not provide an</w:t>
+      </w:r>
+      <w:r>
+        <w:t xml:space="preserve"> </w:t>
+      </w:r>
+      <w:r>
+        <w:t xml:space="preserve">error bound for every scale or conditioning regime.</w:t>
+      </w:r>
+    </w:p>
+    <w:bookmarkEnd w:id="132"/>
+    <w:bookmarkEnd w:id="133"/>
+    <w:bookmarkStart w:id="136" w:name="verification-and-validation-1"/>
+    <w:p>
+      <w:pPr>
+        <w:pStyle w:val="Heading2"/>
+      </w:pPr>
+      <w:r>
+        <w:t xml:space="preserve">Verification and Validation</w:t>
+      </w:r>
+    </w:p>
+    <w:bookmarkStart w:id="134" w:name="test-evidence-1"/>
+    <w:p>
+      <w:pPr>
+        <w:pStyle w:val="Heading3"/>
+      </w:pPr>
+      <w:r>
+        <w:t xml:space="preserve">Test Evidence</w:t>
+      </w:r>
+    </w:p>
+    <w:p>
+      <w:pPr>
+        <w:pStyle w:val="FirstParagraph"/>
+      </w:pPr>
+      <w:r>
+        <w:rPr>
+          <w:rStyle w:val="VerbatimChar"/>
+        </w:rPr>
+        <w:t xml:space="preserve">test_triangle_analytic_mass_com_and_off_diagonal</w:t>
+      </w:r>
+      <w:r>
+        <w:t xml:space="preserve"> </w:t>
+      </w:r>
+      <w:r>
+        <w:t xml:space="preserve">checks the exact triangular</w:t>
+      </w:r>
+      <w:r>
+        <w:t xml:space="preserve"> </w:t>
+      </w:r>
+      <w:r>
+        <w:t xml:space="preserve">lamina result. Other tests check a rectangular plate and subdivision, an</w:t>
+      </w:r>
+      <w:r>
+        <w:t xml:space="preserve"> </w:t>
+      </w:r>
+      <w:r>
+        <w:t xml:space="preserve">analytic cube shell, rigid transforms/scaling/input immutability, duplicate</w:t>
+      </w:r>
+      <w:r>
+        <w:t xml:space="preserve"> </w:t>
+      </w:r>
+      <w:r>
+        <w:t xml:space="preserve">and degenerate faces, remote negligible-area faces, small representable and</w:t>
+      </w:r>
+      <w:r>
+        <w:t xml:space="preserve"> </w:t>
+      </w:r>
+      <w:r>
+        <w:t xml:space="preserve">unrepresentable areas, complex-coordinate rejection, and invalid input classes.</w:t>
+      </w:r>
+      <w:r>
+        <w:t xml:space="preserve"> </w:t>
+      </w:r>
+      <w:r>
+        <w:t xml:space="preserve">These are independent synthetic analytic or metamorphic tests; they are not</w:t>
+      </w:r>
+      <w:r>
+        <w:t xml:space="preserve"> </w:t>
+      </w:r>
+      <w:r>
+        <w:t xml:space="preserve">validation against a measured object or biomechanical segment.</w:t>
+      </w:r>
+    </w:p>
+    <w:bookmarkEnd w:id="134"/>
+    <w:bookmarkStart w:id="135" w:name="acceptance-criteria-1"/>
+    <w:p>
+      <w:pPr>
+        <w:pStyle w:val="Heading3"/>
+      </w:pPr>
+      <w:r>
+        <w:t xml:space="preserve">Acceptance Criteria</w:t>
+      </w:r>
+    </w:p>
+    <w:p>
+      <w:pPr>
+        <w:pStyle w:val="FirstParagraph"/>
+      </w:pPr>
+      <w:r>
+        <w:t xml:space="preserve">Numerical kernel acceptance requires finite typed inputs, correct analytic</w:t>
+      </w:r>
+      <w:r>
+        <w:t xml:space="preserve"> </w:t>
+      </w:r>
+      <w:r>
+        <w:t xml:space="preserve">moments, expected rigid-transform and subdivision invariants, explicit</w:t>
+      </w:r>
+      <w:r>
+        <w:t xml:space="preserve"> </w:t>
+      </w:r>
+      <w:r>
+        <w:t xml:space="preserve">degeneracy diagnostics, and fail-closed invalid-input behavior. Those criteria</w:t>
+      </w:r>
+      <w:r>
+        <w:t xml:space="preserve"> </w:t>
+      </w:r>
+      <w:r>
+        <w:t xml:space="preserve">do not establish source asset provenance, unit/frame correctness of a producer,</w:t>
+      </w:r>
+      <w:r>
+        <w:t xml:space="preserve"> </w:t>
+      </w:r>
+      <w:r>
+        <w:t xml:space="preserve">partial-overlap handling, biological mass distribution, or native-model</w:t>
+      </w:r>
+      <w:r>
+        <w:t xml:space="preserve"> </w:t>
+      </w:r>
+      <w:r>
+        <w:t xml:space="preserve">admission. The calculation freshness generator currently executes only the</w:t>
+      </w:r>
+      <w:r>
+        <w:t xml:space="preserve"> </w:t>
+      </w:r>
+      <w:r>
+        <w:t xml:space="preserve">D-plane pathway; this note therefore remains outside the registered calculation</w:t>
+      </w:r>
+      <w:r>
+        <w:t xml:space="preserve"> </w:t>
+      </w:r>
+      <w:r>
+        <w:t xml:space="preserve">set and cannot be represented as freshness-verified or exemplar-verified.</w:t>
+      </w:r>
+    </w:p>
+    <w:bookmarkEnd w:id="135"/>
+    <w:bookmarkEnd w:id="136"/>
+    <w:bookmarkStart w:id="139" w:name="limits-and-applicability-1"/>
+    <w:p>
+      <w:pPr>
+        <w:pStyle w:val="Heading2"/>
+      </w:pPr>
+      <w:r>
+        <w:t xml:space="preserve">Limits and Applicability</w:t>
+      </w:r>
+    </w:p>
+    <w:bookmarkStart w:id="137" w:name="validity-range-1"/>
+    <w:p>
+      <w:pPr>
+        <w:pStyle w:val="Heading3"/>
+      </w:pPr>
+      <w:r>
+        <w:t xml:space="preserve">Validity Range</w:t>
+      </w:r>
+    </w:p>
+    <w:p>
+      <w:pPr>
+        <w:pStyle w:val="FirstParagraph"/>
+      </w:pPr>
+      <w:r>
+        <w:t xml:space="preserve">The equations apply to a finite positive-area triangle multiset in one</w:t>
+      </w:r>
+      <w:r>
+        <w:t xml:space="preserve"> </w:t>
+      </w:r>
+      <w:r>
+        <w:t xml:space="preserve">orthonormal Euclidean metre frame with a positive finite caller-owned total</w:t>
+      </w:r>
+      <w:r>
+        <w:t xml:space="preserve"> </w:t>
+      </w:r>
+      <w:r>
+        <w:t xml:space="preserve">mass. Degenerate faces may be present but contribute no area or mass. No</w:t>
+      </w:r>
+      <w:r>
+        <w:t xml:space="preserve"> </w:t>
+      </w:r>
+      <w:r>
+        <w:t xml:space="preserve">evidence here establishes useful geometric scales beyond representable,</w:t>
+      </w:r>
+      <w:r>
+        <w:t xml:space="preserve"> </w:t>
+      </w:r>
+      <w:r>
+        <w:t xml:space="preserve">finite floating-point inputs.</w:t>
+      </w:r>
+    </w:p>
+    <w:bookmarkEnd w:id="137"/>
+    <w:bookmarkStart w:id="138" w:name="known-limitations-1"/>
+    <w:p>
+      <w:pPr>
+        <w:pStyle w:val="Heading3"/>
+      </w:pPr>
+      <w:r>
+        <w:t xml:space="preserve">Known Limitations</w:t>
+      </w:r>
+    </w:p>
+    <w:p>
+      <w:pPr>
+        <w:pStyle w:val="FirstParagraph"/>
+      </w:pPr>
+      <w:r>
+        <w:t xml:space="preserve">Coincident triangles retain multiplicity; partial overlap is neither detected</w:t>
+      </w:r>
+      <w:r>
+        <w:t xml:space="preserve"> </w:t>
+      </w:r>
+      <w:r>
+        <w:t xml:space="preserve">nor corrected. Duplicate detection is exact-coordinate and ignores winding,</w:t>
+      </w:r>
+      <w:r>
+        <w:t xml:space="preserve"> </w:t>
+      </w:r>
+      <w:r>
+        <w:t xml:space="preserve">whereas edge topology uses vertex indices. Indexed boundary/nonmanifold counts</w:t>
+      </w:r>
+      <w:r>
+        <w:t xml:space="preserve"> </w:t>
+      </w:r>
+      <w:r>
+        <w:t xml:space="preserve">do not prove surface closure, manifoldness, or self-intersection absence. No</w:t>
+      </w:r>
+      <w:r>
+        <w:t xml:space="preserve"> </w:t>
+      </w:r>
+      <w:r>
+        <w:t xml:space="preserve">volume, thickness, density field, material, anatomy, frame transform, native</w:t>
+      </w:r>
+      <w:r>
+        <w:t xml:space="preserve"> </w:t>
+      </w:r>
+      <w:r>
+        <w:t xml:space="preserve">asset loader, downstream consumer or physical acceptance is included. The</w:t>
+      </w:r>
+      <w:r>
+        <w:t xml:space="preserve"> </w:t>
+      </w:r>
+      <w:r>
+        <w:t xml:space="preserve">registered calculation, freshness workflow, source asset producer and any</w:t>
+      </w:r>
+      <w:r>
+        <w:t xml:space="preserve"> </w:t>
+      </w:r>
+      <w:r>
+        <w:t xml:space="preserve">engineering-use approval remain blocked.</w:t>
+      </w:r>
+    </w:p>
+    <w:bookmarkEnd w:id="138"/>
+    <w:bookmarkEnd w:id="139"/>
+    <w:bookmarkStart w:id="142" w:name="worked-examples-1"/>
+    <w:p>
+      <w:pPr>
+        <w:pStyle w:val="Heading2"/>
+      </w:pPr>
+      <w:r>
+        <w:t xml:space="preserve">Worked Examples</w:t>
+      </w:r>
+    </w:p>
+    <w:bookmarkStart w:id="140" w:name="example-inputs-1"/>
+    <w:p>
+      <w:pPr>
+        <w:pStyle w:val="Heading3"/>
+      </w:pPr>
+      <w:r>
+        <w:t xml:space="preserve">Example Inputs</w:t>
+      </w:r>
+    </w:p>
+    <w:p>
+      <w:pPr>
+        <w:pStyle w:val="FirstParagraph"/>
+      </w:pPr>
+      <w:r>
+        <w:t xml:space="preserve">Use vertices</w:t>
+      </w:r>
+      <w:r>
+        <w:t xml:space="preserve"> </w:t>
+      </w:r>
+      <m:oMath>
+        <m:r>
+          <m:rPr>
+            <m:sty m:val="p"/>
+          </m:rPr>
+          <m:t>(</m:t>
+        </m:r>
+        <m:r>
+          <m:t>0</m:t>
+        </m:r>
+        <m:r>
+          <m:rPr>
+            <m:sty m:val="p"/>
+          </m:rPr>
+          <m:t>,</m:t>
+        </m:r>
+        <m:r>
+          <m:t>0</m:t>
+        </m:r>
+        <m:r>
+          <m:rPr>
+            <m:sty m:val="p"/>
+          </m:rPr>
+          <m:t>,</m:t>
+        </m:r>
+        <m:r>
+          <m:t>0</m:t>
+        </m:r>
+        <m:r>
+          <m:rPr>
+            <m:sty m:val="p"/>
+          </m:rPr>
+          <m:t>)</m:t>
+        </m:r>
+      </m:oMath>
+      <w:r>
+        <w:t xml:space="preserve">,</w:t>
+      </w:r>
+      <w:r>
+        <w:t xml:space="preserve"> </w:t>
+      </w:r>
+      <m:oMath>
+        <m:r>
+          <m:rPr>
+            <m:sty m:val="p"/>
+          </m:rPr>
+          <m:t>(</m:t>
+        </m:r>
+        <m:r>
+          <m:t>3</m:t>
+        </m:r>
+        <m:r>
+          <m:rPr>
+            <m:sty m:val="p"/>
+          </m:rPr>
+          <m:t>,</m:t>
+        </m:r>
+        <m:r>
+          <m:t>0</m:t>
+        </m:r>
+        <m:r>
+          <m:rPr>
+            <m:sty m:val="p"/>
+          </m:rPr>
+          <m:t>,</m:t>
+        </m:r>
+        <m:r>
+          <m:t>0</m:t>
+        </m:r>
+        <m:r>
+          <m:rPr>
+            <m:sty m:val="p"/>
+          </m:rPr>
+          <m:t>)</m:t>
+        </m:r>
+      </m:oMath>
+      <w:r>
+        <w:t xml:space="preserve">, and</w:t>
+      </w:r>
+      <w:r>
+        <w:t xml:space="preserve"> </w:t>
+      </w:r>
+      <m:oMath>
+        <m:r>
+          <m:rPr>
+            <m:sty m:val="p"/>
+          </m:rPr>
+          <m:t>(</m:t>
+        </m:r>
+        <m:r>
+          <m:t>0</m:t>
+        </m:r>
+        <m:r>
+          <m:rPr>
+            <m:sty m:val="p"/>
+          </m:rPr>
+          <m:t>,</m:t>
+        </m:r>
+        <m:r>
+          <m:t>6</m:t>
+        </m:r>
+        <m:r>
+          <m:rPr>
+            <m:sty m:val="p"/>
+          </m:rPr>
+          <m:t>,</m:t>
+        </m:r>
+        <m:r>
+          <m:t>0</m:t>
+        </m:r>
+        <m:r>
+          <m:rPr>
+            <m:sty m:val="p"/>
+          </m:rPr>
+          <m:t>)</m:t>
+        </m:r>
+      </m:oMath>
+      <w:r>
+        <w:t xml:space="preserve"> </w:t>
+      </w:r>
+      <w:r>
+        <w:t xml:space="preserve">metres, one face with indices</w:t>
+      </w:r>
+      <w:r>
+        <w:t xml:space="preserve"> </w:t>
+      </w:r>
+      <m:oMath>
+        <m:r>
+          <m:rPr>
+            <m:sty m:val="p"/>
+          </m:rPr>
+          <m:t>(</m:t>
+        </m:r>
+        <m:r>
+          <m:t>0</m:t>
+        </m:r>
+        <m:r>
+          <m:rPr>
+            <m:sty m:val="p"/>
+          </m:rPr>
+          <m:t>,</m:t>
+        </m:r>
+        <m:r>
+          <m:t>1</m:t>
+        </m:r>
+        <m:r>
+          <m:rPr>
+            <m:sty m:val="p"/>
+          </m:rPr>
+          <m:t>,</m:t>
+        </m:r>
+        <m:r>
+          <m:t>2</m:t>
+        </m:r>
+        <m:r>
+          <m:rPr>
+            <m:sty m:val="p"/>
+          </m:rPr>
+          <m:t>)</m:t>
+        </m:r>
+      </m:oMath>
+      <w:r>
+        <w:t xml:space="preserve">, and total mass</w:t>
+      </w:r>
+      <w:r>
+        <w:t xml:space="preserve"> </w:t>
+      </w:r>
+      <m:oMath>
+        <m:r>
+          <m:t>2</m:t>
+        </m:r>
+      </m:oMath>
+      <w:r>
+        <w:t xml:space="preserve"> </w:t>
+      </w:r>
+      <w:r>
+        <w:t xml:space="preserve">kg. The triangle area is</w:t>
+      </w:r>
+      <w:r>
+        <w:t xml:space="preserve"> </w:t>
+      </w:r>
+      <m:oMath>
+        <m:r>
+          <m:t>9</m:t>
+        </m:r>
+      </m:oMath>
+      <w:r>
+        <w:t xml:space="preserve"> </w:t>
+      </w:r>
+      <w:r>
+        <w:t xml:space="preserve">m² and the face</w:t>
+      </w:r>
+      <w:r>
+        <w:t xml:space="preserve"> </w:t>
+      </w:r>
+      <w:r>
+        <w:t xml:space="preserve">receives all of the declared mass.</w:t>
+      </w:r>
+    </w:p>
+    <w:bookmarkEnd w:id="140"/>
+    <w:bookmarkStart w:id="141" w:name="example-results-1"/>
+    <w:p>
+      <w:pPr>
+        <w:pStyle w:val="Heading3"/>
+      </w:pPr>
+      <w:r>
+        <w:t xml:space="preserve">Example Results</w:t>
+      </w:r>
+    </w:p>
+    <w:p>
+      <w:pPr>
+        <w:pStyle w:val="FirstParagraph"/>
+      </w:pPr>
+      <w:r>
+        <w:t xml:space="preserve">The centroid is</w:t>
+      </w:r>
+      <w:r>
+        <w:t xml:space="preserve"> </w:t>
+      </w:r>
+      <m:oMath>
+        <m:r>
+          <m:rPr>
+            <m:sty m:val="p"/>
+          </m:rPr>
+          <m:t>(</m:t>
+        </m:r>
+        <m:r>
+          <m:t>1</m:t>
+        </m:r>
+        <m:r>
+          <m:rPr>
+            <m:sty m:val="p"/>
+          </m:rPr>
+          <m:t>,</m:t>
+        </m:r>
+        <m:r>
+          <m:t>2</m:t>
+        </m:r>
+        <m:r>
+          <m:rPr>
+            <m:sty m:val="p"/>
+          </m:rPr>
+          <m:t>,</m:t>
+        </m:r>
+        <m:r>
+          <m:t>0</m:t>
+        </m:r>
+        <m:r>
+          <m:rPr>
+            <m:sty m:val="p"/>
+          </m:rPr>
+          <m:t>)</m:t>
+        </m:r>
+      </m:oMath>
+      <w:r>
+        <w:t xml:space="preserve"> </w:t>
+      </w:r>
+      <w:r>
+        <w:t xml:space="preserve">m. Integrating the uniform triangular area gives</w:t>
+      </w:r>
+      <w:r>
+        <w:t xml:space="preserve"> </w:t>
+      </w:r>
+      <m:oMath>
+        <m:r>
+          <m:rPr>
+            <m:sty m:val="b"/>
+          </m:rPr>
+          <m:t>C</m:t>
+        </m:r>
+        <m:r>
+          <m:rPr>
+            <m:sty m:val="p"/>
+          </m:rPr>
+          <m:t>=</m:t>
+        </m:r>
+        <m:d>
+          <m:dPr>
+            <m:begChr m:val="["/>
+            <m:sepChr m:val=""/>
+            <m:endChr m:val="]"/>
+            <m:grow/>
+          </m:dPr>
+          <m:e>
+            <m:m>
+              <m:mPr>
+                <m:baseJc m:val="center"/>
+                <m:plcHide m:val="on"/>
+                <m:mcs>
+                  <m:mc>
+                    <m:mcPr>
+                      <m:mcJc m:val="center"/>
+                      <m:count m:val="1"/>
+                    </m:mcPr>
+                  </m:mc>
+                  <m:mc>
+                    <m:mcPr>
+                      <m:mcJc m:val="center"/>
+                      <m:count m:val="1"/>
+                    </m:mcPr>
+                  </m:mc>
+                  <m:mc>
+                    <m:mcPr>
+                      <m:mcJc m:val="center"/>
+                      <m:count m:val="1"/>
+                    </m:mcPr>
+                  </m:mc>
+                </m:mcs>
+              </m:mPr>
+              <m:mr>
+                <m:e>
+                  <m:r>
+                    <m:t>1</m:t>
+                  </m:r>
+                  <m:r>
+                    <m:rPr>
+                      <m:sty m:val="p"/>
+                    </m:rPr>
+                    <m:t>/</m:t>
+                  </m:r>
+                  <m:r>
+                    <m:t>2</m:t>
+                  </m:r>
+                </m:e>
+                <m:e>
+                  <m:r>
+                    <m:rPr>
+                      <m:sty m:val="p"/>
+                    </m:rPr>
+                    <m:t>−</m:t>
+                  </m:r>
+                  <m:r>
+                    <m:t>1</m:t>
+                  </m:r>
+                  <m:r>
+                    <m:rPr>
+                      <m:sty m:val="p"/>
+                    </m:rPr>
+                    <m:t>/</m:t>
+                  </m:r>
+                  <m:r>
+                    <m:t>2</m:t>
+                  </m:r>
+                </m:e>
+                <m:e>
+                  <m:r>
+                    <m:t>0</m:t>
+                  </m:r>
+                </m:e>
+              </m:mr>
+              <m:mr>
+                <m:e>
+                  <m:r>
+                    <m:rPr>
+                      <m:sty m:val="p"/>
+                    </m:rPr>
+                    <m:t>−</m:t>
+                  </m:r>
+                  <m:r>
+                    <m:t>1</m:t>
+                  </m:r>
+                  <m:r>
+                    <m:rPr>
+                      <m:sty m:val="p"/>
+                    </m:rPr>
+                    <m:t>/</m:t>
+                  </m:r>
+                  <m:r>
+                    <m:t>2</m:t>
+                  </m:r>
+                </m:e>
+                <m:e>
+                  <m:r>
+                    <m:t>2</m:t>
+                  </m:r>
+                </m:e>
+                <m:e>
+                  <m:r>
+                    <m:t>0</m:t>
+                  </m:r>
+                </m:e>
+              </m:mr>
+              <m:mr>
+                <m:e>
+                  <m:r>
+                    <m:t>0</m:t>
+                  </m:r>
+                </m:e>
+                <m:e>
+                  <m:r>
+                    <m:t>0</m:t>
+                  </m:r>
+                </m:e>
+                <m:e>
+                  <m:r>
+                    <m:t>0</m:t>
+                  </m:r>
+                </m:e>
+              </m:mr>
+            </m:m>
+          </m:e>
+        </m:d>
+      </m:oMath>
+      <w:r>
+        <w:t xml:space="preserve"> </w:t>
+      </w:r>
+      <w:r>
+        <w:t xml:space="preserve">m².</w:t>
+      </w:r>
+      <w:r>
+        <w:t xml:space="preserve"> </w:t>
+      </w:r>
+      <w:r>
+        <w:t xml:space="preserve">The returned inertia matrix is</w:t>
+      </w:r>
+      <w:r>
+        <w:t xml:space="preserve"> </w:t>
+      </w:r>
+      <m:oMath>
+        <m:r>
+          <m:rPr>
+            <m:sty m:val="b"/>
+          </m:rPr>
+          <m:t>I</m:t>
+        </m:r>
+        <m:r>
+          <m:rPr>
+            <m:sty m:val="p"/>
+          </m:rPr>
+          <m:t>=</m:t>
+        </m:r>
+        <m:d>
+          <m:dPr>
+            <m:begChr m:val="["/>
+            <m:sepChr m:val=""/>
+            <m:endChr m:val="]"/>
+            <m:grow/>
+          </m:dPr>
+          <m:e>
+            <m:m>
+              <m:mPr>
+                <m:baseJc m:val="center"/>
+                <m:plcHide m:val="on"/>
+                <m:mcs>
+                  <m:mc>
+                    <m:mcPr>
+                      <m:mcJc m:val="center"/>
+                      <m:count m:val="1"/>
+                    </m:mcPr>
+                  </m:mc>
+                  <m:mc>
+                    <m:mcPr>
+                      <m:mcJc m:val="center"/>
+                      <m:count m:val="1"/>
+                    </m:mcPr>
+                  </m:mc>
+                  <m:mc>
+                    <m:mcPr>
+                      <m:mcJc m:val="center"/>
+                      <m:count m:val="1"/>
+                    </m:mcPr>
+                  </m:mc>
+                </m:mcs>
+              </m:mPr>
+              <m:mr>
+                <m:e>
+                  <m:r>
+                    <m:t>4</m:t>
+                  </m:r>
+                </m:e>
+                <m:e>
+                  <m:r>
+                    <m:t>1</m:t>
+                  </m:r>
+                </m:e>
+                <m:e>
+                  <m:r>
+                    <m:t>0</m:t>
+                  </m:r>
+                </m:e>
+              </m:mr>
+              <m:mr>
+                <m:e>
+                  <m:r>
+                    <m:t>1</m:t>
+                  </m:r>
+                </m:e>
+                <m:e>
+                  <m:r>
+                    <m:t>1</m:t>
+                  </m:r>
+                </m:e>
+                <m:e>
+                  <m:r>
+                    <m:t>0</m:t>
+                  </m:r>
+                </m:e>
+              </m:mr>
+              <m:mr>
+                <m:e>
+                  <m:r>
+                    <m:t>0</m:t>
+                  </m:r>
+                </m:e>
+                <m:e>
+                  <m:r>
+                    <m:t>0</m:t>
+                  </m:r>
+                </m:e>
+                <m:e>
+                  <m:r>
+                    <m:t>5</m:t>
+                  </m:r>
+                </m:e>
+              </m:mr>
+            </m:m>
+          </m:e>
+        </m:d>
+      </m:oMath>
+      <w:r>
+        <w:t xml:space="preserve"> </w:t>
+      </w:r>
+      <w:r>
+        <w:t xml:space="preserve">kg m², with</w:t>
+      </w:r>
+      <w:r>
+        <w:t xml:space="preserve"> </w:t>
+      </w:r>
+      <w:r>
+        <w:t xml:space="preserve">all three indexed edges counted as boundary edges. The example verifies the</w:t>
+      </w:r>
+      <w:r>
+        <w:t xml:space="preserve"> </w:t>
+      </w:r>
+      <w:r>
+        <w:t xml:space="preserve">kernel’s declared lamina equations; it is not an asset-backed exemplar or</w:t>
+      </w:r>
+      <w:r>
+        <w:t xml:space="preserve"> </w:t>
+      </w:r>
+      <w:r>
+        <w:t xml:space="preserve">evidence about a physical segment.</w:t>
+      </w:r>
+    </w:p>
+    <w:bookmarkEnd w:id="141"/>
+    <w:bookmarkEnd w:id="142"/>
+    <w:bookmarkStart w:id="147" w:name="references-and-provenance-1"/>
+    <w:p>
+      <w:pPr>
+        <w:pStyle w:val="Heading2"/>
+      </w:pPr>
+      <w:r>
+        <w:t xml:space="preserve">References and Provenance</w:t>
+      </w:r>
+    </w:p>
+    <w:bookmarkStart w:id="145" w:name="references-2"/>
+    <w:p>
+      <w:pPr>
+        <w:pStyle w:val="Heading3"/>
+      </w:pPr>
+      <w:r>
+        <w:t xml:space="preserve">References</w:t>
+      </w:r>
+    </w:p>
+    <w:p>
+      <w:pPr>
+        <w:pStyle w:val="Compact"/>
+        <w:numPr>
+          <w:ilvl w:val="0"/>
+          <w:numId w:val="1005"/>
+        </w:numPr>
+      </w:pPr>
+      <w:r>
+        <w:rPr>
+          <w:rStyle w:val="VerbatimChar"/>
+        </w:rPr>
+        <w:t xml:space="preserve">src/shared/python/humanoid_character_builder/mesh/triangle_lamina.py</w:t>
+      </w:r>
+      <w:r>
+        <w:t xml:space="preserve"> </w:t>
+      </w:r>
+      <w:r>
+        <w:t xml:space="preserve">—</w:t>
+      </w:r>
+      <w:r>
+        <w:t xml:space="preserve"> </w:t>
+      </w:r>
+      <w:r>
+        <w:t xml:space="preserve">implementation of the triangle-multiset weighting and moments.</w:t>
+      </w:r>
+    </w:p>
+    <w:p>
+      <w:pPr>
+        <w:pStyle w:val="Compact"/>
+        <w:numPr>
+          <w:ilvl w:val="0"/>
+          <w:numId w:val="1005"/>
+        </w:numPr>
+      </w:pPr>
+      <w:r>
+        <w:rPr>
+          <w:rStyle w:val="VerbatimChar"/>
+        </w:rPr>
+        <w:t xml:space="preserve">src/shared/python/humanoid_character_builder/mesh/inertia_calculator.py</w:t>
+      </w:r>
+      <w:r>
+        <w:t xml:space="preserve"> </w:t>
+      </w:r>
+      <w:r>
+        <w:t xml:space="preserve">—</w:t>
+      </w:r>
+      <w:r>
+        <w:t xml:space="preserve"> </w:t>
+      </w:r>
+      <w:r>
+        <w:t xml:space="preserve">compatible result/mode definitions and separate solid-mesh pathway.</w:t>
+      </w:r>
+    </w:p>
+    <w:p>
+      <w:pPr>
+        <w:pStyle w:val="Compact"/>
+        <w:numPr>
+          <w:ilvl w:val="0"/>
+          <w:numId w:val="1005"/>
+        </w:numPr>
+      </w:pPr>
+      <w:r>
+        <w:rPr>
+          <w:rStyle w:val="VerbatimChar"/>
+        </w:rPr>
+        <w:t xml:space="preserve">src/shared/python/humanoid_character_builder/tests/test_triangle_lamina.py</w:t>
+      </w:r>
+      <w:r>
+        <w:t xml:space="preserve"> </w:t>
+      </w:r>
+      <w:r>
+        <w:t xml:space="preserve">—</w:t>
+      </w:r>
+      <w:r>
+        <w:t xml:space="preserve"> </w:t>
+      </w:r>
+      <w:r>
+        <w:t xml:space="preserve">analytic and metamorphic synthetic tests.</w:t>
+      </w:r>
+    </w:p>
+    <w:p>
+      <w:pPr>
+        <w:pStyle w:val="Compact"/>
+        <w:numPr>
+          <w:ilvl w:val="0"/>
+          <w:numId w:val="1005"/>
+        </w:numPr>
+      </w:pPr>
+      <w:r>
+        <w:rPr>
+          <w:rStyle w:val="VerbatimChar"/>
+        </w:rPr>
+        <w:t xml:space="preserve">src/shared/python/humanoid_character_builder/tests/test_urdf_inertia_export.py</w:t>
+      </w:r>
+      <w:r>
+        <w:t xml:space="preserve"> </w:t>
+      </w:r>
+      <w:r>
+        <w:t xml:space="preserve">—</w:t>
+      </w:r>
+      <w:r>
+        <w:t xml:space="preserve"> </w:t>
+      </w:r>
+      <w:r>
+        <w:t xml:space="preserve">symmetric-entry round-trip and an actual MuJoCo tensor/kinetic-energy readback.</w:t>
+      </w:r>
+    </w:p>
+    <w:p>
+      <w:pPr>
+        <w:pStyle w:val="Compact"/>
+        <w:numPr>
+          <w:ilvl w:val="0"/>
+          <w:numId w:val="1005"/>
+        </w:numPr>
+      </w:pPr>
+      <w:hyperlink r:id="rId143">
+        <w:r>
+          <w:rPr>
+            <w:rStyle w:val="Hyperlink"/>
+          </w:rPr>
+          <w:t xml:space="preserve">Inertia tensor of a triangle in barycentric coordinates</w:t>
+        </w:r>
+      </w:hyperlink>
+      <w:r>
+        <w:t xml:space="preserve"> </w:t>
+      </w:r>
+      <w:r>
+        <w:t xml:space="preserve">— independent</w:t>
+      </w:r>
+      <w:r>
+        <w:t xml:space="preserve"> </w:t>
+      </w:r>
+      <w:r>
+        <w:t xml:space="preserve">derivation reference for triangle area moments.</w:t>
+      </w:r>
+    </w:p>
+    <w:p>
+      <w:pPr>
+        <w:pStyle w:val="Compact"/>
+        <w:numPr>
+          <w:ilvl w:val="0"/>
+          <w:numId w:val="1005"/>
+        </w:numPr>
+      </w:pPr>
+      <w:hyperlink r:id="rId144">
+        <w:r>
+          <w:rPr>
+            <w:rStyle w:val="Hyperlink"/>
+          </w:rPr>
+          <w:t xml:space="preserve">ROS 2 KDL URDF parser</w:t>
+        </w:r>
+      </w:hyperlink>
+      <w:r>
+        <w:t xml:space="preserve"> </w:t>
+      </w:r>
+      <w:r>
+        <w:t xml:space="preserve">—</w:t>
+      </w:r>
+      <w:r>
+        <w:t xml:space="preserve"> </w:t>
+      </w:r>
+      <w:r>
+        <w:t xml:space="preserve">primary consumer source for the direct tensor-coefficient interpretation</w:t>
+      </w:r>
+      <w:r>
+        <w:t xml:space="preserve"> </w:t>
+      </w:r>
+      <w:r>
+        <w:t xml:space="preserve">tested by the exporter regression.</w:t>
+      </w:r>
+    </w:p>
+    <w:bookmarkEnd w:id="145"/>
+    <w:bookmarkStart w:id="146" w:name="provenance-1"/>
+    <w:p>
+      <w:pPr>
+        <w:pStyle w:val="Heading3"/>
+      </w:pPr>
+      <w:r>
+        <w:t xml:space="preserve">Provenance</w:t>
+      </w:r>
+    </w:p>
+    <w:p>
+      <w:pPr>
+        <w:pStyle w:val="FirstParagraph"/>
+      </w:pPr>
+      <w:r>
+        <w:t xml:space="preserve">This chapter is a provisional technical note for Tools #5503/#5504. The exact</w:t>
+      </w:r>
+      <w:r>
+        <w:t xml:space="preserve"> </w:t>
+      </w:r>
+      <w:r>
+        <w:t xml:space="preserve">source and tests are tracked in the same development change. The canonical</w:t>
+      </w:r>
+      <w:r>
+        <w:t xml:space="preserve"> </w:t>
+      </w:r>
+      <w:r>
+        <w:t xml:space="preserve">module inventory is regenerated, but executable freshness support beyond the</w:t>
+      </w:r>
+      <w:r>
+        <w:t xml:space="preserve"> </w:t>
+      </w:r>
+      <w:r>
+        <w:t xml:space="preserve">D-plane calculation, governed calculation registration, source geometry</w:t>
+      </w:r>
+      <w:r>
+        <w:t xml:space="preserve"> </w:t>
+      </w:r>
+      <w:r>
+        <w:t xml:space="preserve">producer, anatomical consumer traceability, external scientific review,</w:t>
+      </w:r>
+      <w:r>
+        <w:t xml:space="preserve"> </w:t>
+      </w:r>
+      <w:r>
+        <w:t xml:space="preserve">artifact/page review, and human approval are not complete. The MuJoCo check is</w:t>
+      </w:r>
+      <w:r>
+        <w:t xml:space="preserve"> </w:t>
+      </w:r>
+      <w:r>
+        <w:t xml:space="preserve">limited to an analytic asymmetric URDF fixture and does not establish</w:t>
+      </w:r>
+      <w:r>
+        <w:t xml:space="preserve"> </w:t>
+      </w:r>
+      <w:r>
+        <w:t xml:space="preserve">all-engine parity. No private mesh or capture data is used or reproduced here.</w:t>
+      </w:r>
+    </w:p>
+    <w:bookmarkEnd w:id="146"/>
+    <w:bookmarkEnd w:id="147"/>
+    <w:bookmarkStart w:id="154" w:name="revision-history-1"/>
+    <w:p>
+      <w:pPr>
+        <w:pStyle w:val="Heading2"/>
+      </w:pPr>
+      <w:r>
+        <w:t xml:space="preserve">Revision History</w:t>
+      </w:r>
+    </w:p>
+    <w:bookmarkStart w:id="153" w:name="revision-record-1"/>
+    <w:p>
+      <w:pPr>
+        <w:pStyle w:val="Heading3"/>
+      </w:pPr>
+      <w:r>
+        <w:t xml:space="preserve">Revision Record</w:t>
+      </w:r>
+    </w:p>
+    <w:p>
+      <w:pPr>
+        <w:pStyle w:val="Compact"/>
+        <w:numPr>
+          <w:ilvl w:val="0"/>
+          <w:numId w:val="1006"/>
+        </w:numPr>
+      </w:pPr>
+      <w:r>
+        <w:t xml:space="preserve">0.1.0 (2026-10-10): Document the provisional triangle-multiset lamina</w:t>
+      </w:r>
+      <w:r>
+        <w:t xml:space="preserve"> </w:t>
+      </w:r>
+      <w:r>
+        <w:t xml:space="preserve">kernel and its analytic/synthetic evidence; keep governed registration and</w:t>
+      </w:r>
+      <w:r>
+        <w:t xml:space="preserve"> </w:t>
+      </w:r>
+      <w:r>
+        <w:t xml:space="preserve">all source/consumer/engineering qualification blocked.</w:t>
+      </w:r>
+    </w:p>
+    <w:bookmarkStart w:id="152" w:name="refs"/>
+    <w:bookmarkStart w:id="149" w:name="ref-pandoc-manual"/>
     <w:p>
       <w:pPr>
         <w:pStyle w:val="Bibliography"/>
@@ -7244,7 +11323,7 @@
       <w:r>
         <w:t xml:space="preserve"> </w:t>
       </w:r>
-      <w:hyperlink r:id="rId102">
+      <w:hyperlink r:id="rId148">
         <w:r>
           <w:rPr>
             <w:rStyle w:val="Hyperlink"/>
@@ -7256,8 +11335,8 @@
         <w:t xml:space="preserve">.</w:t>
       </w:r>
     </w:p>
-    <w:bookmarkEnd w:id="103"/>
-    <w:bookmarkStart w:id="105" w:name="ref-quarto-guide"/>
+    <w:bookmarkEnd w:id="149"/>
+    <w:bookmarkStart w:id="151" w:name="ref-quarto-guide"/>
     <w:p>
       <w:pPr>
         <w:pStyle w:val="Bibliography"/>
@@ -7281,7 +11360,7 @@
       <w:r>
         <w:t xml:space="preserve"> </w:t>
       </w:r>
-      <w:hyperlink r:id="rId104">
+      <w:hyperlink r:id="rId150">
         <w:r>
           <w:rPr>
             <w:rStyle w:val="Hyperlink"/>
@@ -7293,10 +11372,11 @@
         <w:t xml:space="preserve">.</w:t>
       </w:r>
     </w:p>
-    <w:bookmarkEnd w:id="105"/>
-    <w:bookmarkEnd w:id="106"/>
-    <w:bookmarkEnd w:id="107"/>
-    <w:bookmarkEnd w:id="108"/>
+    <w:bookmarkEnd w:id="151"/>
+    <w:bookmarkEnd w:id="152"/>
+    <w:bookmarkEnd w:id="153"/>
+    <w:bookmarkEnd w:id="154"/>
+    <w:bookmarkEnd w:id="155"/>
     <w:sectPr>
       <w:headerReference r:id="rId9" w:type="default"/>
       <w:footerReference r:id="rId10" w:type="default"/>
@@ -7892,6 +11972,42 @@
     <w:lvlOverride w:ilvl="8">
       <w:startOverride w:val="1"/>
     </w:lvlOverride>
+  </w:num>
+  <w:num w:numId="1004">
+    <w:abstractNumId w:val="99411"/>
+    <w:lvlOverride w:ilvl="0">
+      <w:startOverride w:val="1"/>
+    </w:lvlOverride>
+    <w:lvlOverride w:ilvl="1">
+      <w:startOverride w:val="1"/>
+    </w:lvlOverride>
+    <w:lvlOverride w:ilvl="2">
+      <w:startOverride w:val="1"/>
+    </w:lvlOverride>
+    <w:lvlOverride w:ilvl="3">
+      <w:startOverride w:val="1"/>
+    </w:lvlOverride>
+    <w:lvlOverride w:ilvl="4">
+      <w:startOverride w:val="1"/>
+    </w:lvlOverride>
+    <w:lvlOverride w:ilvl="5">
+      <w:startOverride w:val="1"/>
+    </w:lvlOverride>
+    <w:lvlOverride w:ilvl="6">
+      <w:startOverride w:val="1"/>
+    </w:lvlOverride>
+    <w:lvlOverride w:ilvl="7">
+      <w:startOverride w:val="1"/>
+    </w:lvlOverride>
+    <w:lvlOverride w:ilvl="8">
+      <w:startOverride w:val="1"/>
+    </w:lvlOverride>
+  </w:num>
+  <w:num w:numId="1005">
+    <w:abstractNumId w:val="991"/>
+  </w:num>
+  <w:num w:numId="1006">
+    <w:abstractNumId w:val="991"/>
   </w:num>
 </w:numbering>
 </file>

</xml_diff>

<commit_message>
feat(mesh): triangle-lamina mass moments and URDF inertia export (#5510)
* fix(mesh): correct lamina moments and URDF inertia signs (#5503 #5504)

* docs(mesh): document lamina kernel and URDF export evidence (#5503 #5504)

* docs(mesh): record lamina mass delivery handoff (#5503 #5504)

* docs: correct lamina handoff commit reference

* fix(mesh): type lamina center tuple explicitly

* docs(mesh): bind lamina handoff to published source

* test(manual): include blocked lamina chapter contracts

---------

Co-authored-by: codex-scheduled <codex-scheduled@users.noreply.github.com>
</commit_message>
<xml_diff>
--- a/manuals/tools/dist/tools-engineering-design-manual.docx
+++ b/manuals/tools/dist/tools-engineering-design-manual.docx
@@ -50,7 +50,19 @@
         <w:t xml:space="preserve"> </w:t>
       </w:r>
       <w:r>
-        <w:t xml:space="preserve">denominator. TOOLS-D4 registers one model-conditioned D-plane calculation and</w:t>
+        <w:t xml:space="preserve">denominator; it is awaiting regeneration for the #5503 source additions and is</w:t>
+      </w:r>
+      <w:r>
+        <w:t xml:space="preserve"> </w:t>
+      </w:r>
+      <w:r>
+        <w:t xml:space="preserve">not treated as current for this change. TOOLS-D4 registers one</w:t>
+      </w:r>
+      <w:r>
+        <w:t xml:space="preserve"> </w:t>
+      </w:r>
+      <w:r>
+        <w:t xml:space="preserve">model-conditioned D-plane calculation and</w:t>
       </w:r>
       <w:r>
         <w:t xml:space="preserve"> </w:t>
@@ -93,6 +105,32 @@
       </w:r>
       <w:r>
         <w:t xml:space="preserve">but none is approved for publication or engineering use.</w:t>
+      </w:r>
+    </w:p>
+    <w:p>
+      <w:pPr>
+        <w:pStyle w:val="BodyText"/>
+      </w:pPr>
+      <w:r>
+        <w:t xml:space="preserve">Chapter 06 is an included, unregistered numerical-kernel note for</w:t>
+      </w:r>
+      <w:r>
+        <w:t xml:space="preserve"> </w:t>
+      </w:r>
+      <w:r>
+        <w:t xml:space="preserve">triangle-multiset lamina moments. It is not a governed calculation or exemplar:</w:t>
+      </w:r>
+      <w:r>
+        <w:t xml:space="preserve"> </w:t>
+      </w:r>
+      <w:r>
+        <w:t xml:space="preserve">the current freshness generator does not execute this pathway, and no source</w:t>
+      </w:r>
+      <w:r>
+        <w:t xml:space="preserve"> </w:t>
+      </w:r>
+      <w:r>
+        <w:t xml:space="preserve">mesh/consumer admission or scientific review is supplied.</w:t>
       </w:r>
     </w:p>
     <w:bookmarkEnd w:id="19"/>
@@ -6612,7 +6650,7 @@
     <w:bookmarkEnd w:id="91"/>
     <w:bookmarkEnd w:id="92"/>
     <w:bookmarkEnd w:id="93"/>
-    <w:bookmarkStart w:id="108" w:name="Xf38ac95301459e28f388688aee8c1cf941b78a4"/>
+    <w:bookmarkStart w:id="103" w:name="Xf38ac95301459e28f388688aee8c1cf941b78a4"/>
     <w:p>
       <w:pPr>
         <w:pStyle w:val="Heading1"/>
@@ -7162,7 +7200,7 @@
       </w:r>
     </w:p>
     <w:bookmarkEnd w:id="99"/>
-    <w:bookmarkStart w:id="107" w:name="primary-references"/>
+    <w:bookmarkStart w:id="102" w:name="primary-references"/>
     <w:p>
       <w:pPr>
         <w:pStyle w:val="Heading2"/>
@@ -7219,8 +7257,4049 @@
         <w:t xml:space="preserve">claims require separate actual execution evidence from UpstreamDrift.</w:t>
       </w:r>
     </w:p>
-    <w:bookmarkStart w:id="106" w:name="refs"/>
-    <w:bookmarkStart w:id="103" w:name="ref-pandoc-manual"/>
+    <w:p>
+      <w:r>
+        <w:br w:type="page"/>
+      </w:r>
+    </w:p>
+    <w:bookmarkEnd w:id="102"/>
+    <w:bookmarkEnd w:id="103"/>
+    <w:bookmarkStart w:id="155" w:name="triangle-multiset-lamina-mass-moments"/>
+    <w:p>
+      <w:pPr>
+        <w:pStyle w:val="Heading1"/>
+      </w:pPr>
+      <w:r>
+        <w:t xml:space="preserve">Triangle-Multiset Lamina Mass Moments</w:t>
+      </w:r>
+    </w:p>
+    <w:bookmarkStart w:id="104" w:name="purpose-and-scope-1"/>
+    <w:p>
+      <w:pPr>
+        <w:pStyle w:val="Heading2"/>
+      </w:pPr>
+      <w:r>
+        <w:t xml:space="preserve">Purpose and Scope</w:t>
+      </w:r>
+    </w:p>
+    <w:p>
+      <w:pPr>
+        <w:pStyle w:val="FirstParagraph"/>
+      </w:pPr>
+      <w:r>
+        <w:t xml:space="preserve">This note describes the numerical kernel introduced for Tools #5503. Given</w:t>
+      </w:r>
+      <w:r>
+        <w:t xml:space="preserve"> </w:t>
+      </w:r>
+      <w:r>
+        <w:t xml:space="preserve">triangles already expressed in one orthonormal metre frame and one positive</w:t>
+      </w:r>
+      <w:r>
+        <w:t xml:space="preserve"> </w:t>
+      </w:r>
+      <w:r>
+        <w:t xml:space="preserve">total mass, it computes the center of mass and inertia tensor of a zero-thickness</w:t>
+      </w:r>
+      <w:r>
+        <w:t xml:space="preserve"> </w:t>
+      </w:r>
+      <w:r>
+        <w:t xml:space="preserve">lamina whose surface-mass density is proportional to unsigned triangle area.</w:t>
+      </w:r>
+      <w:r>
+        <w:t xml:space="preserve"> </w:t>
+      </w:r>
+      <w:r>
+        <w:t xml:space="preserve">The source is a triangle</w:t>
+      </w:r>
+      <w:r>
+        <w:t xml:space="preserve"> </w:t>
+      </w:r>
+      <w:r>
+        <w:rPr>
+          <w:b/>
+          <w:bCs/>
+        </w:rPr>
+        <w:t xml:space="preserve">multiset</w:t>
+      </w:r>
+      <w:r>
+        <w:t xml:space="preserve">: repeated faces count repeatedly. The</w:t>
+      </w:r>
+      <w:r>
+        <w:t xml:space="preserve"> </w:t>
+      </w:r>
+      <w:r>
+        <w:t xml:space="preserve">kernel is included in the manual for transparent review but is not yet a</w:t>
+      </w:r>
+      <w:r>
+        <w:t xml:space="preserve"> </w:t>
+      </w:r>
+      <w:r>
+        <w:t xml:space="preserve">registered or approved calculation. It does not load or admit a geometry asset,</w:t>
+      </w:r>
+      <w:r>
+        <w:t xml:space="preserve"> </w:t>
+      </w:r>
+      <w:r>
+        <w:t xml:space="preserve">establish frame authority, infer tissue ownership, model volume or thickness,</w:t>
+      </w:r>
+      <w:r>
+        <w:t xml:space="preserve"> </w:t>
+      </w:r>
+      <w:r>
+        <w:t xml:space="preserve">or qualify a native humanoid/body model.</w:t>
+      </w:r>
+    </w:p>
+    <w:bookmarkEnd w:id="104"/>
+    <w:bookmarkStart w:id="108" w:name="design-by-contract-1"/>
+    <w:p>
+      <w:pPr>
+        <w:pStyle w:val="Heading2"/>
+      </w:pPr>
+      <w:r>
+        <w:t xml:space="preserve">Design by Contract</w:t>
+      </w:r>
+    </w:p>
+    <w:bookmarkStart w:id="105" w:name="preconditions-1"/>
+    <w:p>
+      <w:pPr>
+        <w:pStyle w:val="Heading3"/>
+      </w:pPr>
+      <w:r>
+        <w:t xml:space="preserve">Preconditions</w:t>
+      </w:r>
+    </w:p>
+    <w:p>
+      <w:pPr>
+        <w:pStyle w:val="FirstParagraph"/>
+      </w:pPr>
+      <w:r>
+        <w:rPr>
+          <w:rStyle w:val="VerbatimChar"/>
+        </w:rPr>
+        <w:t xml:space="preserve">vertices</w:t>
+      </w:r>
+      <w:r>
+        <w:t xml:space="preserve"> </w:t>
+      </w:r>
+      <w:r>
+        <w:t xml:space="preserve">must convert to a finite</w:t>
+      </w:r>
+      <w:r>
+        <w:t xml:space="preserve"> </w:t>
+      </w:r>
+      <w:r>
+        <w:rPr>
+          <w:rStyle w:val="VerbatimChar"/>
+        </w:rPr>
+        <w:t xml:space="preserve">float64</w:t>
+      </w:r>
+      <w:r>
+        <w:t xml:space="preserve"> </w:t>
+      </w:r>
+      <w:r>
+        <w:t xml:space="preserve">array of shape</w:t>
+      </w:r>
+      <w:r>
+        <w:t xml:space="preserve"> </w:t>
+      </w:r>
+      <w:r>
+        <w:rPr>
+          <w:rStyle w:val="VerbatimChar"/>
+        </w:rPr>
+        <w:t xml:space="preserve">(N, 3)</w:t>
+      </w:r>
+      <w:r>
+        <w:t xml:space="preserve">.</w:t>
+      </w:r>
+      <w:r>
+        <w:t xml:space="preserve"> </w:t>
+      </w:r>
+      <w:r>
+        <w:rPr>
+          <w:rStyle w:val="VerbatimChar"/>
+        </w:rPr>
+        <w:t xml:space="preserve">faces</w:t>
+      </w:r>
+      <w:r>
+        <w:t xml:space="preserve"> </w:t>
+      </w:r>
+      <w:r>
+        <w:t xml:space="preserve">is an integer array of shape</w:t>
+      </w:r>
+      <w:r>
+        <w:t xml:space="preserve"> </w:t>
+      </w:r>
+      <w:r>
+        <w:rPr>
+          <w:rStyle w:val="VerbatimChar"/>
+        </w:rPr>
+        <w:t xml:space="preserve">(T, 3)</w:t>
+      </w:r>
+      <w:r>
+        <w:t xml:space="preserve"> </w:t>
+      </w:r>
+      <w:r>
+        <w:t xml:space="preserve">whose indices lie in</w:t>
+      </w:r>
+      <w:r>
+        <w:t xml:space="preserve"> </w:t>
+      </w:r>
+      <w:r>
+        <w:rPr>
+          <w:rStyle w:val="VerbatimChar"/>
+        </w:rPr>
+        <w:t xml:space="preserve">[0, N)</w:t>
+      </w:r>
+      <w:r>
+        <w:t xml:space="preserve">.</w:t>
+      </w:r>
+      <w:r>
+        <w:t xml:space="preserve"> </w:t>
+      </w:r>
+      <w:r>
+        <w:rPr>
+          <w:rStyle w:val="VerbatimChar"/>
+        </w:rPr>
+        <w:t xml:space="preserve">mass</w:t>
+      </w:r>
+      <w:r>
+        <w:t xml:space="preserve"> </w:t>
+      </w:r>
+      <w:r>
+        <w:t xml:space="preserve">is a positive, finite, non-boolean scalar in kilograms. All vertex</w:t>
+      </w:r>
+      <w:r>
+        <w:t xml:space="preserve"> </w:t>
+      </w:r>
+      <w:r>
+        <w:t xml:space="preserve">coordinates are metres in one caller-declared orthonormal coordinate frame.</w:t>
+      </w:r>
+      <w:r>
+        <w:t xml:space="preserve"> </w:t>
+      </w:r>
+      <w:r>
+        <w:t xml:space="preserve">At least one input triangle must have positive representable area; each</w:t>
+      </w:r>
+      <w:r>
+        <w:t xml:space="preserve"> </w:t>
+      </w:r>
+      <w:r>
+        <w:t xml:space="preserve">nonzero area and its normalized fraction must be representable as a positive</w:t>
+      </w:r>
+      <w:r>
+        <w:t xml:space="preserve"> </w:t>
+      </w:r>
+      <w:r>
+        <w:rPr>
+          <w:rStyle w:val="VerbatimChar"/>
+        </w:rPr>
+        <w:t xml:space="preserve">float64</w:t>
+      </w:r>
+      <w:r>
+        <w:t xml:space="preserve">, and total area must remain finite.</w:t>
+      </w:r>
+    </w:p>
+    <w:bookmarkEnd w:id="105"/>
+    <w:bookmarkStart w:id="106" w:name="postconditions-1"/>
+    <w:p>
+      <w:pPr>
+        <w:pStyle w:val="Heading3"/>
+      </w:pPr>
+      <w:r>
+        <w:t xml:space="preserve">Postconditions</w:t>
+      </w:r>
+    </w:p>
+    <w:p>
+      <w:pPr>
+        <w:pStyle w:val="FirstParagraph"/>
+      </w:pPr>
+      <w:r>
+        <w:t xml:space="preserve">The result reports the area-weighted center in metres and the center-of-mass</w:t>
+      </w:r>
+      <w:r>
+        <w:t xml:space="preserve"> </w:t>
+      </w:r>
+      <w:r>
+        <w:t xml:space="preserve">inertia tensor in kg m² for the declared lamina. It also reports total</w:t>
+      </w:r>
+      <w:r>
+        <w:t xml:space="preserve"> </w:t>
+      </w:r>
+      <w:r>
+        <w:t xml:space="preserve">unsigned area, zero-area face count, exact coincident positive-area face count,</w:t>
+      </w:r>
+      <w:r>
+        <w:t xml:space="preserve"> </w:t>
+      </w:r>
+      <w:r>
+        <w:t xml:space="preserve">and indexed boundary/nonmanifold edge counts. The duplicate diagnostic counts</w:t>
+      </w:r>
+      <w:r>
+        <w:t xml:space="preserve"> </w:t>
+      </w:r>
+      <w:r>
+        <w:t xml:space="preserve">each repeated coordinate face beyond its first occurrence. The compatible</w:t>
+      </w:r>
+      <w:r>
+        <w:t xml:space="preserve"> </w:t>
+      </w:r>
+      <w:r>
+        <w:rPr>
+          <w:rStyle w:val="VerbatimChar"/>
+        </w:rPr>
+        <w:t xml:space="preserve">InertiaResult</w:t>
+      </w:r>
+      <w:r>
+        <w:t xml:space="preserve"> </w:t>
+      </w:r>
+      <w:r>
+        <w:t xml:space="preserve">uses</w:t>
+      </w:r>
+      <w:r>
+        <w:t xml:space="preserve"> </w:t>
+      </w:r>
+      <w:r>
+        <w:rPr>
+          <w:rStyle w:val="VerbatimChar"/>
+        </w:rPr>
+        <w:t xml:space="preserve">volume=0</w:t>
+      </w:r>
+      <w:r>
+        <w:t xml:space="preserve">,</w:t>
+      </w:r>
+      <w:r>
+        <w:t xml:space="preserve"> </w:t>
+      </w:r>
+      <w:r>
+        <w:rPr>
+          <w:rStyle w:val="VerbatimChar"/>
+        </w:rPr>
+        <w:t xml:space="preserve">was_watertight=False</w:t>
+      </w:r>
+      <w:r>
+        <w:t xml:space="preserve">, and the distinct</w:t>
+      </w:r>
+      <w:r>
+        <w:t xml:space="preserve"> </w:t>
+      </w:r>
+      <w:r>
+        <w:rPr>
+          <w:rStyle w:val="VerbatimChar"/>
+        </w:rPr>
+        <w:t xml:space="preserve">triangle_multiset_lamina_mass</w:t>
+      </w:r>
+      <w:r>
+        <w:t xml:space="preserve"> </w:t>
+      </w:r>
+      <w:r>
+        <w:t xml:space="preserve">mode so it cannot imply a closed solid.</w:t>
+      </w:r>
+    </w:p>
+    <w:bookmarkEnd w:id="106"/>
+    <w:bookmarkStart w:id="107" w:name="invariants-1"/>
+    <w:p>
+      <w:pPr>
+        <w:pStyle w:val="Heading3"/>
+      </w:pPr>
+      <w:r>
+        <w:t xml:space="preserve">Invariants</w:t>
+      </w:r>
+    </w:p>
+    <w:p>
+      <w:pPr>
+        <w:pStyle w:val="FirstParagraph"/>
+      </w:pPr>
+      <w:r>
+        <w:t xml:space="preserve">Reordering faces, translating the complete geometry, or applying a proper</w:t>
+      </w:r>
+      <w:r>
+        <w:t xml:space="preserve"> </w:t>
+      </w:r>
+      <w:r>
+        <w:t xml:space="preserve">rigid rotation preserves mass and scalar invariants; translation changes the</w:t>
+      </w:r>
+      <w:r>
+        <w:t xml:space="preserve"> </w:t>
+      </w:r>
+      <w:r>
+        <w:t xml:space="preserve">center by the same translation and does not change central inertia. Scaling</w:t>
+      </w:r>
+      <w:r>
+        <w:t xml:space="preserve"> </w:t>
+      </w:r>
+      <w:r>
+        <w:t xml:space="preserve">coordinates by a positive factor scales area by its square, preserves the</w:t>
+      </w:r>
+      <w:r>
+        <w:t xml:space="preserve"> </w:t>
+      </w:r>
+      <w:r>
+        <w:t xml:space="preserve">area fractions, and scales inertia by the square when total mass is held fixed.</w:t>
+      </w:r>
+      <w:r>
+        <w:t xml:space="preserve"> </w:t>
+      </w:r>
+      <w:r>
+        <w:t xml:space="preserve">Subdivision that preserves the geometric surface and area measure preserves</w:t>
+      </w:r>
+      <w:r>
+        <w:t xml:space="preserve"> </w:t>
+      </w:r>
+      <w:r>
+        <w:t xml:space="preserve">the moments within numerical tolerance. A repeated positive-area face retains</w:t>
+      </w:r>
+      <w:r>
+        <w:t xml:space="preserve"> </w:t>
+      </w:r>
+      <w:r>
+        <w:t xml:space="preserve">its multiplicity in both mass allocation and the diagnostic count.</w:t>
+      </w:r>
+    </w:p>
+    <w:bookmarkEnd w:id="107"/>
+    <w:bookmarkEnd w:id="108"/>
+    <w:bookmarkStart w:id="112" w:name="coordinates-frames-and-time-1"/>
+    <w:p>
+      <w:pPr>
+        <w:pStyle w:val="Heading2"/>
+      </w:pPr>
+      <w:r>
+        <w:t xml:space="preserve">Coordinates, Frames, and Time</w:t>
+      </w:r>
+    </w:p>
+    <w:bookmarkStart w:id="109" w:name="coordinate-frames-1"/>
+    <w:p>
+      <w:pPr>
+        <w:pStyle w:val="Heading3"/>
+      </w:pPr>
+      <w:r>
+        <w:t xml:space="preserve">Coordinate Frames</w:t>
+      </w:r>
+    </w:p>
+    <w:p>
+      <w:pPr>
+        <w:pStyle w:val="FirstParagraph"/>
+      </w:pPr>
+      <w:r>
+        <w:t xml:space="preserve">The function accepts coordinates in the caller’s existing frame and performs</w:t>
+      </w:r>
+      <w:r>
+        <w:t xml:space="preserve"> </w:t>
+      </w:r>
+      <w:r>
+        <w:t xml:space="preserve">no frame transform. All vertices must use the same origin, axes, handedness,</w:t>
+      </w:r>
+      <w:r>
+        <w:t xml:space="preserve"> </w:t>
+      </w:r>
+      <w:r>
+        <w:t xml:space="preserve">and scale. No source-frame identifier is present in this numerical API; a</w:t>
+      </w:r>
+      <w:r>
+        <w:t xml:space="preserve"> </w:t>
+      </w:r>
+      <w:r>
+        <w:t xml:space="preserve">consumer that needs provenance or a native body frame must bind that separately</w:t>
+      </w:r>
+      <w:r>
+        <w:t xml:space="preserve"> </w:t>
+      </w:r>
+      <w:r>
+        <w:t xml:space="preserve">before calling it.</w:t>
+      </w:r>
+    </w:p>
+    <w:bookmarkEnd w:id="109"/>
+    <w:bookmarkStart w:id="110" w:name="axis-and-handedness-1"/>
+    <w:p>
+      <w:pPr>
+        <w:pStyle w:val="Heading3"/>
+      </w:pPr>
+      <w:r>
+        <w:t xml:space="preserve">Axis and Handedness</w:t>
+      </w:r>
+    </w:p>
+    <w:p>
+      <w:pPr>
+        <w:pStyle w:val="FirstParagraph"/>
+      </w:pPr>
+      <w:r>
+        <w:t xml:space="preserve">The covariance and inertia formulas use Euclidean three-dimensional vectors.</w:t>
+      </w:r>
+      <w:r>
+        <w:t xml:space="preserve"> </w:t>
+      </w:r>
+      <w:r>
+        <w:t xml:space="preserve">They are invariant to proper orthogonal basis rotation when both inputs and</w:t>
+      </w:r>
+      <w:r>
+        <w:t xml:space="preserve"> </w:t>
+      </w:r>
+      <w:r>
+        <w:t xml:space="preserve">outputs are transformed consistently. Triangle winding does not select a</w:t>
+      </w:r>
+      <w:r>
+        <w:t xml:space="preserve"> </w:t>
+      </w:r>
+      <w:r>
+        <w:t xml:space="preserve">normal or sign: area is unsigned and the represented surface has no orientation</w:t>
+      </w:r>
+      <w:r>
+        <w:t xml:space="preserve"> </w:t>
+      </w:r>
+      <w:r>
+        <w:t xml:space="preserve">semantics.</w:t>
+      </w:r>
+    </w:p>
+    <w:bookmarkEnd w:id="110"/>
+    <w:bookmarkStart w:id="111" w:name="time-convention-1"/>
+    <w:p>
+      <w:pPr>
+        <w:pStyle w:val="Heading3"/>
+      </w:pPr>
+      <w:r>
+        <w:t xml:space="preserve">Time Convention</w:t>
+      </w:r>
+    </w:p>
+    <w:p>
+      <w:pPr>
+        <w:pStyle w:val="FirstParagraph"/>
+      </w:pPr>
+      <w:r>
+        <w:t xml:space="preserve">This is a static geometry calculation and has no time, interpolation, or</w:t>
+      </w:r>
+      <w:r>
+        <w:t xml:space="preserve"> </w:t>
+      </w:r>
+      <w:r>
+        <w:t xml:space="preserve">integration policy. It cannot be used to infer a time-varying body shape.</w:t>
+      </w:r>
+    </w:p>
+    <w:bookmarkEnd w:id="111"/>
+    <w:bookmarkEnd w:id="112"/>
+    <w:bookmarkStart w:id="115" w:name="units-and-dimensions-1"/>
+    <w:p>
+      <w:pPr>
+        <w:pStyle w:val="Heading2"/>
+      </w:pPr>
+      <w:r>
+        <w:t xml:space="preserve">Units and Dimensions</w:t>
+      </w:r>
+    </w:p>
+    <w:bookmarkStart w:id="113" w:name="symbol-and-unit-table-1"/>
+    <w:p>
+      <w:pPr>
+        <w:pStyle w:val="Heading3"/>
+      </w:pPr>
+      <w:r>
+        <w:t xml:space="preserve">Symbol and Unit Table</w:t>
+      </w:r>
+    </w:p>
+    <w:tbl>
+      <w:tblPr>
+        <w:tblStyle w:val="Table"/>
+        <w:tblW w:type="pct" w:w="5000"/>
+        <w:tblLayout w:type="fixed"/>
+        <w:tblLook w:firstRow="1" w:lastRow="0" w:firstColumn="0" w:lastColumn="0" w:noHBand="0" w:noVBand="0" w:val="0020"/>
+      </w:tblPr>
+      <w:tblGrid>
+        <w:gridCol w:w="2640"/>
+        <w:gridCol w:w="2640"/>
+        <w:gridCol w:w="2640"/>
+      </w:tblGrid>
+      <w:tr>
+        <w:trPr>
+          <w:tblHeader w:val="on"/>
+        </w:trPr>
+        <w:tc>
+          <w:tcPr/>
+          <w:p>
+            <w:pPr>
+              <w:pStyle w:val="Compact"/>
+            </w:pPr>
+            <w:r>
+              <w:t xml:space="preserve">Symbol or field</w:t>
+            </w:r>
+          </w:p>
+        </w:tc>
+        <w:tc>
+          <w:tcPr/>
+          <w:p>
+            <w:pPr>
+              <w:pStyle w:val="Compact"/>
+            </w:pPr>
+            <w:r>
+              <w:t xml:space="preserve">Meaning</w:t>
+            </w:r>
+          </w:p>
+        </w:tc>
+        <w:tc>
+          <w:tcPr/>
+          <w:p>
+            <w:pPr>
+              <w:pStyle w:val="Compact"/>
+            </w:pPr>
+            <w:r>
+              <w:t xml:space="preserve">Unit</w:t>
+            </w:r>
+          </w:p>
+        </w:tc>
+      </w:tr>
+      <w:tr>
+        <w:tc>
+          <w:tcPr/>
+          <w:p>
+            <w:pPr>
+              <w:pStyle w:val="Compact"/>
+            </w:pPr>
+            <m:oMath>
+              <m:r>
+                <m:rPr>
+                  <m:sty m:val="b"/>
+                </m:rPr>
+                <m:t>x</m:t>
+              </m:r>
+            </m:oMath>
+            <w:r>
+              <w:t xml:space="preserve">, triangle vertices</w:t>
+            </w:r>
+          </w:p>
+        </w:tc>
+        <w:tc>
+          <w:tcPr/>
+          <w:p>
+            <w:pPr>
+              <w:pStyle w:val="Compact"/>
+            </w:pPr>
+            <w:r>
+              <w:t xml:space="preserve">Position in the common input frame</w:t>
+            </w:r>
+          </w:p>
+        </w:tc>
+        <w:tc>
+          <w:tcPr/>
+          <w:p>
+            <w:pPr>
+              <w:pStyle w:val="Compact"/>
+            </w:pPr>
+            <w:r>
+              <w:t xml:space="preserve">m</w:t>
+            </w:r>
+          </w:p>
+        </w:tc>
+      </w:tr>
+      <w:tr>
+        <w:tc>
+          <w:tcPr/>
+          <w:p>
+            <w:pPr>
+              <w:pStyle w:val="Compact"/>
+            </w:pPr>
+            <m:oMath>
+              <m:sSub>
+                <m:e>
+                  <m:r>
+                    <m:t>A</m:t>
+                  </m:r>
+                </m:e>
+                <m:sub>
+                  <m:r>
+                    <m:t>i</m:t>
+                  </m:r>
+                </m:sub>
+              </m:sSub>
+            </m:oMath>
+            <w:r>
+              <w:t xml:space="preserve">,</w:t>
+            </w:r>
+            <w:r>
+              <w:t xml:space="preserve"> </w:t>
+            </w:r>
+            <m:oMath>
+              <m:r>
+                <m:t>A</m:t>
+              </m:r>
+            </m:oMath>
+          </w:p>
+        </w:tc>
+        <w:tc>
+          <w:tcPr/>
+          <w:p>
+            <w:pPr>
+              <w:pStyle w:val="Compact"/>
+            </w:pPr>
+            <w:r>
+              <w:t xml:space="preserve">Triangle area and total multiset area</w:t>
+            </w:r>
+          </w:p>
+        </w:tc>
+        <w:tc>
+          <w:tcPr/>
+          <w:p>
+            <w:pPr>
+              <w:pStyle w:val="Compact"/>
+            </w:pPr>
+            <w:r>
+              <w:t xml:space="preserve">m²</w:t>
+            </w:r>
+          </w:p>
+        </w:tc>
+      </w:tr>
+      <w:tr>
+        <w:tc>
+          <w:tcPr/>
+          <w:p>
+            <w:pPr>
+              <w:pStyle w:val="Compact"/>
+            </w:pPr>
+            <m:oMath>
+              <m:sSub>
+                <m:e>
+                  <m:r>
+                    <m:t>w</m:t>
+                  </m:r>
+                </m:e>
+                <m:sub>
+                  <m:r>
+                    <m:t>i</m:t>
+                  </m:r>
+                </m:sub>
+              </m:sSub>
+            </m:oMath>
+          </w:p>
+        </w:tc>
+        <w:tc>
+          <w:tcPr/>
+          <w:p>
+            <w:pPr>
+              <w:pStyle w:val="Compact"/>
+            </w:pPr>
+            <w:r>
+              <w:t xml:space="preserve">Triangle area fraction</w:t>
+            </w:r>
+          </w:p>
+        </w:tc>
+        <w:tc>
+          <w:tcPr/>
+          <w:p>
+            <w:pPr>
+              <w:pStyle w:val="Compact"/>
+            </w:pPr>
+            <w:r>
+              <w:t xml:space="preserve">1</w:t>
+            </w:r>
+          </w:p>
+        </w:tc>
+      </w:tr>
+      <w:tr>
+        <w:tc>
+          <w:tcPr/>
+          <w:p>
+            <w:pPr>
+              <w:pStyle w:val="Compact"/>
+            </w:pPr>
+            <m:oMath>
+              <m:r>
+                <m:t>m</m:t>
+              </m:r>
+            </m:oMath>
+          </w:p>
+        </w:tc>
+        <w:tc>
+          <w:tcPr/>
+          <w:p>
+            <w:pPr>
+              <w:pStyle w:val="Compact"/>
+            </w:pPr>
+            <w:r>
+              <w:t xml:space="preserve">Caller-specified total lamina mass</w:t>
+            </w:r>
+          </w:p>
+        </w:tc>
+        <w:tc>
+          <w:tcPr/>
+          <w:p>
+            <w:pPr>
+              <w:pStyle w:val="Compact"/>
+            </w:pPr>
+            <w:r>
+              <w:t xml:space="preserve">kg</w:t>
+            </w:r>
+          </w:p>
+        </w:tc>
+      </w:tr>
+      <w:tr>
+        <w:tc>
+          <w:tcPr/>
+          <w:p>
+            <w:pPr>
+              <w:pStyle w:val="Compact"/>
+            </w:pPr>
+            <m:oMath>
+              <m:r>
+                <m:rPr>
+                  <m:sty m:val="b"/>
+                </m:rPr>
+                <m:t>c</m:t>
+              </m:r>
+            </m:oMath>
+          </w:p>
+        </w:tc>
+        <w:tc>
+          <w:tcPr/>
+          <w:p>
+            <w:pPr>
+              <w:pStyle w:val="Compact"/>
+            </w:pPr>
+            <w:r>
+              <w:t xml:space="preserve">Area-weighted center of mass</w:t>
+            </w:r>
+          </w:p>
+        </w:tc>
+        <w:tc>
+          <w:tcPr/>
+          <w:p>
+            <w:pPr>
+              <w:pStyle w:val="Compact"/>
+            </w:pPr>
+            <w:r>
+              <w:t xml:space="preserve">m</w:t>
+            </w:r>
+          </w:p>
+        </w:tc>
+      </w:tr>
+      <w:tr>
+        <w:tc>
+          <w:tcPr/>
+          <w:p>
+            <w:pPr>
+              <w:pStyle w:val="Compact"/>
+            </w:pPr>
+            <m:oMath>
+              <m:r>
+                <m:rPr>
+                  <m:sty m:val="b"/>
+                </m:rPr>
+                <m:t>C</m:t>
+              </m:r>
+            </m:oMath>
+          </w:p>
+        </w:tc>
+        <w:tc>
+          <w:tcPr/>
+          <w:p>
+            <w:pPr>
+              <w:pStyle w:val="Compact"/>
+            </w:pPr>
+            <w:r>
+              <w:t xml:space="preserve">Mass-normalized central covariance</w:t>
+            </w:r>
+          </w:p>
+        </w:tc>
+        <w:tc>
+          <w:tcPr/>
+          <w:p>
+            <w:pPr>
+              <w:pStyle w:val="Compact"/>
+            </w:pPr>
+            <w:r>
+              <w:t xml:space="preserve">m²</w:t>
+            </w:r>
+          </w:p>
+        </w:tc>
+      </w:tr>
+      <w:tr>
+        <w:tc>
+          <w:tcPr/>
+          <w:p>
+            <w:pPr>
+              <w:pStyle w:val="Compact"/>
+            </w:pPr>
+            <m:oMath>
+              <m:r>
+                <m:rPr>
+                  <m:sty m:val="b"/>
+                </m:rPr>
+                <m:t>I</m:t>
+              </m:r>
+            </m:oMath>
+          </w:p>
+        </w:tc>
+        <w:tc>
+          <w:tcPr/>
+          <w:p>
+            <w:pPr>
+              <w:pStyle w:val="Compact"/>
+            </w:pPr>
+            <w:r>
+              <w:t xml:space="preserve">Central inertia tensor</w:t>
+            </w:r>
+          </w:p>
+        </w:tc>
+        <w:tc>
+          <w:tcPr/>
+          <w:p>
+            <w:pPr>
+              <w:pStyle w:val="Compact"/>
+            </w:pPr>
+            <w:r>
+              <w:t xml:space="preserve">kg m²</w:t>
+            </w:r>
+          </w:p>
+        </w:tc>
+      </w:tr>
+    </w:tbl>
+    <w:bookmarkEnd w:id="113"/>
+    <w:bookmarkStart w:id="114" w:name="dimensional-checks-1"/>
+    <w:p>
+      <w:pPr>
+        <w:pStyle w:val="Heading3"/>
+      </w:pPr>
+      <w:r>
+        <w:t xml:space="preserve">Dimensional Checks</w:t>
+      </w:r>
+    </w:p>
+    <w:p>
+      <w:pPr>
+        <w:pStyle w:val="FirstParagraph"/>
+      </w:pPr>
+      <w:r>
+        <w:t xml:space="preserve">Area fractions are dimensionless. Nonzero areas and normalized face fractions</w:t>
+      </w:r>
+      <w:r>
+        <w:t xml:space="preserve"> </w:t>
+      </w:r>
+      <w:r>
+        <w:t xml:space="preserve">that underflow to zero in</w:t>
+      </w:r>
+      <w:r>
+        <w:t xml:space="preserve"> </w:t>
+      </w:r>
+      <w:r>
+        <w:rPr>
+          <w:rStyle w:val="VerbatimChar"/>
+        </w:rPr>
+        <w:t xml:space="preserve">float64</w:t>
+      </w:r>
+      <w:r>
+        <w:t xml:space="preserve"> </w:t>
+      </w:r>
+      <w:r>
+        <w:t xml:space="preserve">are rejected, not assigned zero mass or</w:t>
+      </w:r>
+      <w:r>
+        <w:t xml:space="preserve"> </w:t>
+      </w:r>
+      <w:r>
+        <w:t xml:space="preserve">reported as degenerate. No geometric area epsilon is used. The covariance has</w:t>
+      </w:r>
+      <w:r>
+        <w:t xml:space="preserve"> </w:t>
+      </w:r>
+      <w:r>
+        <w:t xml:space="preserve">units m² because it is an</w:t>
+      </w:r>
+      <w:r>
+        <w:t xml:space="preserve"> </w:t>
+      </w:r>
+      <w:r>
+        <w:t xml:space="preserve">area-weighted second central moment divided by total area. Multiplication by</w:t>
+      </w:r>
+      <w:r>
+        <w:t xml:space="preserve"> </w:t>
+      </w:r>
+      <w:r>
+        <w:t xml:space="preserve">mass yields kg m². The zero-thickness convention sets reported volume to 0 m³;</w:t>
+      </w:r>
+      <w:r>
+        <w:t xml:space="preserve"> </w:t>
+      </w:r>
+      <w:r>
+        <w:t xml:space="preserve">it is not an estimated enclosed volume.</w:t>
+      </w:r>
+    </w:p>
+    <w:bookmarkEnd w:id="114"/>
+    <w:bookmarkEnd w:id="115"/>
+    <w:bookmarkStart w:id="120" w:name="derivation-and-assumptions-1"/>
+    <w:p>
+      <w:pPr>
+        <w:pStyle w:val="Heading2"/>
+      </w:pPr>
+      <w:r>
+        <w:t xml:space="preserve">Derivation and Assumptions</w:t>
+      </w:r>
+    </w:p>
+    <w:bookmarkStart w:id="116" w:name="assumptions-1"/>
+    <w:p>
+      <w:pPr>
+        <w:pStyle w:val="Heading3"/>
+      </w:pPr>
+      <w:r>
+        <w:t xml:space="preserve">Assumptions</w:t>
+      </w:r>
+    </w:p>
+    <w:p>
+      <w:pPr>
+        <w:pStyle w:val="FirstParagraph"/>
+      </w:pPr>
+      <w:r>
+        <w:t xml:space="preserve">Each triangle carries uniform surface density, with one shared areal density</w:t>
+      </w:r>
+      <w:r>
+        <w:t xml:space="preserve"> </w:t>
+      </w:r>
+      <m:oMath>
+        <m:r>
+          <m:t>σ</m:t>
+        </m:r>
+        <m:r>
+          <m:rPr>
+            <m:sty m:val="p"/>
+          </m:rPr>
+          <m:t>=</m:t>
+        </m:r>
+        <m:r>
+          <m:t>m</m:t>
+        </m:r>
+        <m:r>
+          <m:rPr>
+            <m:sty m:val="p"/>
+          </m:rPr>
+          <m:t>/</m:t>
+        </m:r>
+        <m:r>
+          <m:t>A</m:t>
+        </m:r>
+      </m:oMath>
+      <w:r>
+        <w:t xml:space="preserve"> </w:t>
+      </w:r>
+      <w:r>
+        <w:t xml:space="preserve">over the entire input multiset. Mass is apportioned by unsigned</w:t>
+      </w:r>
+      <w:r>
+        <w:t xml:space="preserve"> </w:t>
+      </w:r>
+      <w:r>
+        <w:t xml:space="preserve">area. Triangles may be disconnected, overlap, coincide, or have inconsistent</w:t>
+      </w:r>
+      <w:r>
+        <w:t xml:space="preserve"> </w:t>
+      </w:r>
+      <w:r>
+        <w:t xml:space="preserve">winding; overlap is not removed. Degenerate zero-area triangles contribute no</w:t>
+      </w:r>
+      <w:r>
+        <w:t xml:space="preserve"> </w:t>
+      </w:r>
+      <w:r>
+        <w:t xml:space="preserve">mass and are reported separately. The derivation assumes ordinary Euclidean</w:t>
+      </w:r>
+      <w:r>
+        <w:t xml:space="preserve"> </w:t>
+      </w:r>
+      <w:r>
+        <w:t xml:space="preserve">coordinates and no thickness or volumetric contribution.</w:t>
+      </w:r>
+    </w:p>
+    <w:bookmarkEnd w:id="116"/>
+    <w:bookmarkStart w:id="119" w:name="derivation-1"/>
+    <w:p>
+      <w:pPr>
+        <w:pStyle w:val="Heading3"/>
+      </w:pPr>
+      <w:r>
+        <w:t xml:space="preserve">Derivation</w:t>
+      </w:r>
+    </w:p>
+    <w:p>
+      <w:pPr>
+        <w:pStyle w:val="FirstParagraph"/>
+      </w:pPr>
+      <w:r>
+        <w:t xml:space="preserve">For triangle vertices</w:t>
+      </w:r>
+      <w:r>
+        <w:t xml:space="preserve"> </w:t>
+      </w:r>
+      <m:oMath>
+        <m:sSub>
+          <m:e>
+            <m:r>
+              <m:rPr>
+                <m:sty m:val="b"/>
+              </m:rPr>
+              <m:t>v</m:t>
+            </m:r>
+          </m:e>
+          <m:sub>
+            <m:r>
+              <m:t>i</m:t>
+            </m:r>
+            <m:r>
+              <m:t>1</m:t>
+            </m:r>
+          </m:sub>
+        </m:sSub>
+        <m:r>
+          <m:rPr>
+            <m:sty m:val="p"/>
+          </m:rPr>
+          <m:t>,</m:t>
+        </m:r>
+        <m:sSub>
+          <m:e>
+            <m:r>
+              <m:rPr>
+                <m:sty m:val="b"/>
+              </m:rPr>
+              <m:t>v</m:t>
+            </m:r>
+          </m:e>
+          <m:sub>
+            <m:r>
+              <m:t>i</m:t>
+            </m:r>
+            <m:r>
+              <m:t>2</m:t>
+            </m:r>
+          </m:sub>
+        </m:sSub>
+        <m:r>
+          <m:rPr>
+            <m:sty m:val="p"/>
+          </m:rPr>
+          <m:t>,</m:t>
+        </m:r>
+        <m:sSub>
+          <m:e>
+            <m:r>
+              <m:rPr>
+                <m:sty m:val="b"/>
+              </m:rPr>
+              <m:t>v</m:t>
+            </m:r>
+          </m:e>
+          <m:sub>
+            <m:r>
+              <m:t>i</m:t>
+            </m:r>
+            <m:r>
+              <m:t>3</m:t>
+            </m:r>
+          </m:sub>
+        </m:sSub>
+      </m:oMath>
+      <w:r>
+        <w:t xml:space="preserve">,</w:t>
+      </w:r>
+    </w:p>
+    <w:p>
+      <w:pPr>
+        <w:pStyle w:val="BodyText"/>
+      </w:pPr>
+      <m:oMathPara>
+        <m:oMathParaPr>
+          <m:jc m:val="center"/>
+        </m:oMathParaPr>
+        <m:oMath>
+          <m:sSub>
+            <m:e>
+              <m:r>
+                <m:t>A</m:t>
+              </m:r>
+            </m:e>
+            <m:sub>
+              <m:r>
+                <m:t>i</m:t>
+              </m:r>
+            </m:sub>
+          </m:sSub>
+          <m:r>
+            <m:rPr>
+              <m:sty m:val="p"/>
+            </m:rPr>
+            <m:t>=</m:t>
+          </m:r>
+          <m:f>
+            <m:fPr>
+              <m:type m:val="bar"/>
+            </m:fPr>
+            <m:num>
+              <m:r>
+                <m:t>1</m:t>
+              </m:r>
+            </m:num>
+            <m:den>
+              <m:r>
+                <m:t>2</m:t>
+              </m:r>
+            </m:den>
+          </m:f>
+          <m:d>
+            <m:dPr>
+              <m:begChr m:val="∥"/>
+              <m:sepChr m:val=""/>
+              <m:endChr m:val="∥"/>
+              <m:grow/>
+            </m:dPr>
+            <m:e>
+              <m:r>
+                <m:rPr>
+                  <m:sty m:val="p"/>
+                </m:rPr>
+                <m:t>(</m:t>
+              </m:r>
+              <m:sSub>
+                <m:e>
+                  <m:r>
+                    <m:rPr>
+                      <m:sty m:val="b"/>
+                    </m:rPr>
+                    <m:t>v</m:t>
+                  </m:r>
+                </m:e>
+                <m:sub>
+                  <m:r>
+                    <m:t>i</m:t>
+                  </m:r>
+                  <m:r>
+                    <m:t>2</m:t>
+                  </m:r>
+                </m:sub>
+              </m:sSub>
+              <m:r>
+                <m:rPr>
+                  <m:sty m:val="p"/>
+                </m:rPr>
+                <m:t>−</m:t>
+              </m:r>
+              <m:sSub>
+                <m:e>
+                  <m:r>
+                    <m:rPr>
+                      <m:sty m:val="b"/>
+                    </m:rPr>
+                    <m:t>v</m:t>
+                  </m:r>
+                </m:e>
+                <m:sub>
+                  <m:r>
+                    <m:t>i</m:t>
+                  </m:r>
+                  <m:r>
+                    <m:t>1</m:t>
+                  </m:r>
+                </m:sub>
+              </m:sSub>
+              <m:r>
+                <m:rPr>
+                  <m:sty m:val="p"/>
+                </m:rPr>
+                <m:t>)</m:t>
+              </m:r>
+              <m:r>
+                <m:rPr>
+                  <m:sty m:val="p"/>
+                </m:rPr>
+                <m:t>×</m:t>
+              </m:r>
+              <m:r>
+                <m:rPr>
+                  <m:sty m:val="p"/>
+                </m:rPr>
+                <m:t>(</m:t>
+              </m:r>
+              <m:sSub>
+                <m:e>
+                  <m:r>
+                    <m:rPr>
+                      <m:sty m:val="b"/>
+                    </m:rPr>
+                    <m:t>v</m:t>
+                  </m:r>
+                </m:e>
+                <m:sub>
+                  <m:r>
+                    <m:t>i</m:t>
+                  </m:r>
+                  <m:r>
+                    <m:t>3</m:t>
+                  </m:r>
+                </m:sub>
+              </m:sSub>
+              <m:r>
+                <m:rPr>
+                  <m:sty m:val="p"/>
+                </m:rPr>
+                <m:t>−</m:t>
+              </m:r>
+              <m:sSub>
+                <m:e>
+                  <m:r>
+                    <m:rPr>
+                      <m:sty m:val="b"/>
+                    </m:rPr>
+                    <m:t>v</m:t>
+                  </m:r>
+                </m:e>
+                <m:sub>
+                  <m:r>
+                    <m:t>i</m:t>
+                  </m:r>
+                  <m:r>
+                    <m:t>1</m:t>
+                  </m:r>
+                </m:sub>
+              </m:sSub>
+              <m:r>
+                <m:rPr>
+                  <m:sty m:val="p"/>
+                </m:rPr>
+                <m:t>)</m:t>
+              </m:r>
+            </m:e>
+          </m:d>
+          <m:r>
+            <m:rPr>
+              <m:sty m:val="p"/>
+            </m:rPr>
+            <m:t>,</m:t>
+          </m:r>
+          <m:r>
+            <m:t>  </m:t>
+          </m:r>
+          <m:r>
+            <m:t>A</m:t>
+          </m:r>
+          <m:r>
+            <m:rPr>
+              <m:sty m:val="p"/>
+            </m:rPr>
+            <m:t>=</m:t>
+          </m:r>
+          <m:nary>
+            <m:naryPr>
+              <m:chr m:val="∑"/>
+              <m:limLoc m:val="undOvr"/>
+              <m:subHide m:val="off"/>
+              <m:supHide m:val="on"/>
+            </m:naryPr>
+            <m:sub>
+              <m:r>
+                <m:t>i</m:t>
+              </m:r>
+            </m:sub>
+            <m:sup>
+              <m:r>
+                <m:t>​</m:t>
+              </m:r>
+            </m:sup>
+            <m:e>
+              <m:sSub>
+                <m:e>
+                  <m:r>
+                    <m:t>A</m:t>
+                  </m:r>
+                </m:e>
+                <m:sub>
+                  <m:r>
+                    <m:t>i</m:t>
+                  </m:r>
+                </m:sub>
+              </m:sSub>
+            </m:e>
+          </m:nary>
+          <m:r>
+            <m:rPr>
+              <m:sty m:val="p"/>
+            </m:rPr>
+            <m:t>,</m:t>
+          </m:r>
+          <m:r>
+            <m:t>  </m:t>
+          </m:r>
+          <m:sSub>
+            <m:e>
+              <m:r>
+                <m:t>w</m:t>
+              </m:r>
+            </m:e>
+            <m:sub>
+              <m:r>
+                <m:t>i</m:t>
+              </m:r>
+            </m:sub>
+          </m:sSub>
+          <m:r>
+            <m:rPr>
+              <m:sty m:val="p"/>
+            </m:rPr>
+            <m:t>=</m:t>
+          </m:r>
+          <m:f>
+            <m:fPr>
+              <m:type m:val="bar"/>
+            </m:fPr>
+            <m:num>
+              <m:sSub>
+                <m:e>
+                  <m:r>
+                    <m:t>A</m:t>
+                  </m:r>
+                </m:e>
+                <m:sub>
+                  <m:r>
+                    <m:t>i</m:t>
+                  </m:r>
+                </m:sub>
+              </m:sSub>
+            </m:num>
+            <m:den>
+              <m:r>
+                <m:t>A</m:t>
+              </m:r>
+            </m:den>
+          </m:f>
+          <m:r>
+            <m:rPr>
+              <m:sty m:val="p"/>
+            </m:rPr>
+            <m:t>.</m:t>
+          </m:r>
+        </m:oMath>
+      </m:oMathPara>
+    </w:p>
+    <w:p>
+      <w:pPr>
+        <w:pStyle w:val="FirstParagraph"/>
+      </w:pPr>
+      <w:r>
+        <w:t xml:space="preserve">The triangle centroid is</w:t>
+      </w:r>
+      <w:r>
+        <w:t xml:space="preserve"> </w:t>
+      </w:r>
+      <m:oMath>
+        <m:sSub>
+          <m:e>
+            <m:r>
+              <m:rPr>
+                <m:sty m:val="b"/>
+              </m:rPr>
+              <m:t>c</m:t>
+            </m:r>
+          </m:e>
+          <m:sub>
+            <m:r>
+              <m:t>i</m:t>
+            </m:r>
+          </m:sub>
+        </m:sSub>
+        <m:r>
+          <m:rPr>
+            <m:sty m:val="p"/>
+          </m:rPr>
+          <m:t>=</m:t>
+        </m:r>
+        <m:r>
+          <m:rPr>
+            <m:sty m:val="p"/>
+          </m:rPr>
+          <m:t>(</m:t>
+        </m:r>
+        <m:sSub>
+          <m:e>
+            <m:r>
+              <m:rPr>
+                <m:sty m:val="b"/>
+              </m:rPr>
+              <m:t>v</m:t>
+            </m:r>
+          </m:e>
+          <m:sub>
+            <m:r>
+              <m:t>i</m:t>
+            </m:r>
+            <m:r>
+              <m:t>1</m:t>
+            </m:r>
+          </m:sub>
+        </m:sSub>
+        <m:r>
+          <m:rPr>
+            <m:sty m:val="p"/>
+          </m:rPr>
+          <m:t>+</m:t>
+        </m:r>
+        <m:sSub>
+          <m:e>
+            <m:r>
+              <m:rPr>
+                <m:sty m:val="b"/>
+              </m:rPr>
+              <m:t>v</m:t>
+            </m:r>
+          </m:e>
+          <m:sub>
+            <m:r>
+              <m:t>i</m:t>
+            </m:r>
+            <m:r>
+              <m:t>2</m:t>
+            </m:r>
+          </m:sub>
+        </m:sSub>
+        <m:r>
+          <m:rPr>
+            <m:sty m:val="p"/>
+          </m:rPr>
+          <m:t>+</m:t>
+        </m:r>
+        <m:sSub>
+          <m:e>
+            <m:r>
+              <m:rPr>
+                <m:sty m:val="b"/>
+              </m:rPr>
+              <m:t>v</m:t>
+            </m:r>
+          </m:e>
+          <m:sub>
+            <m:r>
+              <m:t>i</m:t>
+            </m:r>
+            <m:r>
+              <m:t>3</m:t>
+            </m:r>
+          </m:sub>
+        </m:sSub>
+        <m:r>
+          <m:rPr>
+            <m:sty m:val="p"/>
+          </m:rPr>
+          <m:t>)</m:t>
+        </m:r>
+        <m:r>
+          <m:rPr>
+            <m:sty m:val="p"/>
+          </m:rPr>
+          <m:t>/</m:t>
+        </m:r>
+        <m:r>
+          <m:t>3</m:t>
+        </m:r>
+      </m:oMath>
+      <w:r>
+        <w:t xml:space="preserve">, and the lamina center is</w:t>
+      </w:r>
+      <w:r>
+        <w:t xml:space="preserve"> </w:t>
+      </w:r>
+      <m:oMath>
+        <m:r>
+          <m:rPr>
+            <m:sty m:val="b"/>
+          </m:rPr>
+          <m:t>c</m:t>
+        </m:r>
+        <m:r>
+          <m:rPr>
+            <m:sty m:val="p"/>
+          </m:rPr>
+          <m:t>=</m:t>
+        </m:r>
+        <m:nary>
+          <m:naryPr>
+            <m:chr m:val="∑"/>
+            <m:limLoc m:val="undOvr"/>
+            <m:subHide m:val="off"/>
+            <m:supHide m:val="on"/>
+          </m:naryPr>
+          <m:sub>
+            <m:r>
+              <m:t>i</m:t>
+            </m:r>
+          </m:sub>
+          <m:sup>
+            <m:r>
+              <m:t>​</m:t>
+            </m:r>
+          </m:sup>
+          <m:e>
+            <m:sSub>
+              <m:e>
+                <m:r>
+                  <m:t>w</m:t>
+                </m:r>
+              </m:e>
+              <m:sub>
+                <m:r>
+                  <m:t>i</m:t>
+                </m:r>
+              </m:sub>
+            </m:sSub>
+          </m:e>
+        </m:nary>
+        <m:sSub>
+          <m:e>
+            <m:r>
+              <m:rPr>
+                <m:sty m:val="b"/>
+              </m:rPr>
+              <m:t>c</m:t>
+            </m:r>
+          </m:e>
+          <m:sub>
+            <m:r>
+              <m:t>i</m:t>
+            </m:r>
+          </m:sub>
+        </m:sSub>
+      </m:oMath>
+      <w:r>
+        <w:t xml:space="preserve">. Uniform barycentric coordinates on one</w:t>
+      </w:r>
+      <w:r>
+        <w:t xml:space="preserve"> </w:t>
+      </w:r>
+      <w:r>
+        <w:t xml:space="preserve">triangle have covariance</w:t>
+      </w:r>
+    </w:p>
+    <w:p>
+      <w:pPr>
+        <w:pStyle w:val="BodyText"/>
+      </w:pPr>
+      <m:oMathPara>
+        <m:oMathParaPr>
+          <m:jc m:val="center"/>
+        </m:oMathParaPr>
+        <m:oMath>
+          <m:sSub>
+            <m:e>
+              <m:r>
+                <m:rPr>
+                  <m:sty m:val="b"/>
+                </m:rPr>
+                <m:t>C</m:t>
+              </m:r>
+            </m:e>
+            <m:sub>
+              <m:r>
+                <m:t>i</m:t>
+              </m:r>
+            </m:sub>
+          </m:sSub>
+          <m:r>
+            <m:rPr>
+              <m:sty m:val="p"/>
+            </m:rPr>
+            <m:t>=</m:t>
+          </m:r>
+          <m:f>
+            <m:fPr>
+              <m:type m:val="bar"/>
+            </m:fPr>
+            <m:num>
+              <m:r>
+                <m:t>1</m:t>
+              </m:r>
+            </m:num>
+            <m:den>
+              <m:r>
+                <m:t>12</m:t>
+              </m:r>
+            </m:den>
+          </m:f>
+          <m:nary>
+            <m:naryPr>
+              <m:chr m:val="∑"/>
+              <m:limLoc m:val="undOvr"/>
+              <m:subHide m:val="off"/>
+              <m:supHide m:val="off"/>
+            </m:naryPr>
+            <m:sub>
+              <m:r>
+                <m:t>k</m:t>
+              </m:r>
+              <m:r>
+                <m:rPr>
+                  <m:sty m:val="p"/>
+                </m:rPr>
+                <m:t>=</m:t>
+              </m:r>
+              <m:r>
+                <m:t>1</m:t>
+              </m:r>
+            </m:sub>
+            <m:sup>
+              <m:r>
+                <m:t>3</m:t>
+              </m:r>
+            </m:sup>
+            <m:e>
+              <m:r>
+                <m:rPr>
+                  <m:sty m:val="p"/>
+                </m:rPr>
+                <m:t>(</m:t>
+              </m:r>
+            </m:e>
+          </m:nary>
+          <m:sSub>
+            <m:e>
+              <m:r>
+                <m:rPr>
+                  <m:sty m:val="b"/>
+                </m:rPr>
+                <m:t>v</m:t>
+              </m:r>
+            </m:e>
+            <m:sub>
+              <m:r>
+                <m:t>i</m:t>
+              </m:r>
+              <m:r>
+                <m:t>k</m:t>
+              </m:r>
+            </m:sub>
+          </m:sSub>
+          <m:r>
+            <m:rPr>
+              <m:sty m:val="p"/>
+            </m:rPr>
+            <m:t>−</m:t>
+          </m:r>
+          <m:sSub>
+            <m:e>
+              <m:r>
+                <m:rPr>
+                  <m:sty m:val="b"/>
+                </m:rPr>
+                <m:t>c</m:t>
+              </m:r>
+            </m:e>
+            <m:sub>
+              <m:r>
+                <m:t>i</m:t>
+              </m:r>
+            </m:sub>
+          </m:sSub>
+          <m:r>
+            <m:rPr>
+              <m:sty m:val="p"/>
+            </m:rPr>
+            <m:t>)</m:t>
+          </m:r>
+          <m:r>
+            <m:rPr>
+              <m:sty m:val="p"/>
+            </m:rPr>
+            <m:t>(</m:t>
+          </m:r>
+          <m:sSub>
+            <m:e>
+              <m:r>
+                <m:rPr>
+                  <m:sty m:val="b"/>
+                </m:rPr>
+                <m:t>v</m:t>
+              </m:r>
+            </m:e>
+            <m:sub>
+              <m:r>
+                <m:t>i</m:t>
+              </m:r>
+              <m:r>
+                <m:t>k</m:t>
+              </m:r>
+            </m:sub>
+          </m:sSub>
+          <m:r>
+            <m:rPr>
+              <m:sty m:val="p"/>
+            </m:rPr>
+            <m:t>−</m:t>
+          </m:r>
+          <m:sSub>
+            <m:e>
+              <m:r>
+                <m:rPr>
+                  <m:sty m:val="b"/>
+                </m:rPr>
+                <m:t>c</m:t>
+              </m:r>
+            </m:e>
+            <m:sub>
+              <m:r>
+                <m:t>i</m:t>
+              </m:r>
+            </m:sub>
+          </m:sSub>
+          <m:sSup>
+            <m:e>
+              <m:r>
+                <m:rPr>
+                  <m:sty m:val="p"/>
+                </m:rPr>
+                <m:t>)</m:t>
+              </m:r>
+            </m:e>
+            <m:sup>
+              <m:r>
+                <m:t>T</m:t>
+              </m:r>
+            </m:sup>
+          </m:sSup>
+          <m:r>
+            <m:rPr>
+              <m:sty m:val="p"/>
+            </m:rPr>
+            <m:t>.</m:t>
+          </m:r>
+        </m:oMath>
+      </m:oMathPara>
+    </w:p>
+    <w:p>
+      <w:pPr>
+        <w:pStyle w:val="FirstParagraph"/>
+      </w:pPr>
+      <w:r>
+        <w:t xml:space="preserve">Applying the law of total covariance over triangle identity and within-triangle</w:t>
+      </w:r>
+      <w:r>
+        <w:t xml:space="preserve"> </w:t>
+      </w:r>
+      <w:r>
+        <w:t xml:space="preserve">position gives</w:t>
+      </w:r>
+    </w:p>
+    <w:p>
+      <w:pPr>
+        <w:pStyle w:val="BodyText"/>
+      </w:pPr>
+      <w:bookmarkStart w:id="117" w:name="triangle-lamina-covariance"/>
+      <w:bookmarkEnd w:id="117"/>
+    </w:p>
+    <w:p>
+      <w:pPr>
+        <w:pStyle w:val="BodyText"/>
+      </w:pPr>
+      <m:oMathPara>
+        <m:oMathParaPr>
+          <m:jc m:val="center"/>
+        </m:oMathParaPr>
+        <m:oMath>
+          <m:r>
+            <m:rPr>
+              <m:sty m:val="b"/>
+            </m:rPr>
+            <m:t>C</m:t>
+          </m:r>
+          <m:r>
+            <m:rPr>
+              <m:sty m:val="p"/>
+            </m:rPr>
+            <m:t>=</m:t>
+          </m:r>
+          <m:nary>
+            <m:naryPr>
+              <m:chr m:val="∑"/>
+              <m:limLoc m:val="undOvr"/>
+              <m:subHide m:val="off"/>
+              <m:supHide m:val="on"/>
+            </m:naryPr>
+            <m:sub>
+              <m:r>
+                <m:t>i</m:t>
+              </m:r>
+            </m:sub>
+            <m:sup>
+              <m:r>
+                <m:t>​</m:t>
+              </m:r>
+            </m:sup>
+            <m:e>
+              <m:sSub>
+                <m:e>
+                  <m:r>
+                    <m:t>w</m:t>
+                  </m:r>
+                </m:e>
+                <m:sub>
+                  <m:r>
+                    <m:t>i</m:t>
+                  </m:r>
+                </m:sub>
+              </m:sSub>
+            </m:e>
+          </m:nary>
+          <m:d>
+            <m:dPr>
+              <m:begChr m:val="["/>
+              <m:sepChr m:val=""/>
+              <m:endChr m:val="]"/>
+              <m:grow/>
+            </m:dPr>
+            <m:e>
+              <m:sSub>
+                <m:e>
+                  <m:r>
+                    <m:rPr>
+                      <m:sty m:val="b"/>
+                    </m:rPr>
+                    <m:t>C</m:t>
+                  </m:r>
+                </m:e>
+                <m:sub>
+                  <m:r>
+                    <m:t>i</m:t>
+                  </m:r>
+                </m:sub>
+              </m:sSub>
+              <m:r>
+                <m:rPr>
+                  <m:sty m:val="p"/>
+                </m:rPr>
+                <m:t>+</m:t>
+              </m:r>
+              <m:r>
+                <m:rPr>
+                  <m:sty m:val="p"/>
+                </m:rPr>
+                <m:t>(</m:t>
+              </m:r>
+              <m:sSub>
+                <m:e>
+                  <m:r>
+                    <m:rPr>
+                      <m:sty m:val="b"/>
+                    </m:rPr>
+                    <m:t>c</m:t>
+                  </m:r>
+                </m:e>
+                <m:sub>
+                  <m:r>
+                    <m:t>i</m:t>
+                  </m:r>
+                </m:sub>
+              </m:sSub>
+              <m:r>
+                <m:rPr>
+                  <m:sty m:val="p"/>
+                </m:rPr>
+                <m:t>−</m:t>
+              </m:r>
+              <m:r>
+                <m:rPr>
+                  <m:sty m:val="b"/>
+                </m:rPr>
+                <m:t>c</m:t>
+              </m:r>
+              <m:r>
+                <m:rPr>
+                  <m:sty m:val="p"/>
+                </m:rPr>
+                <m:t>)</m:t>
+              </m:r>
+              <m:r>
+                <m:rPr>
+                  <m:sty m:val="p"/>
+                </m:rPr>
+                <m:t>(</m:t>
+              </m:r>
+              <m:sSub>
+                <m:e>
+                  <m:r>
+                    <m:rPr>
+                      <m:sty m:val="b"/>
+                    </m:rPr>
+                    <m:t>c</m:t>
+                  </m:r>
+                </m:e>
+                <m:sub>
+                  <m:r>
+                    <m:t>i</m:t>
+                  </m:r>
+                </m:sub>
+              </m:sSub>
+              <m:r>
+                <m:rPr>
+                  <m:sty m:val="p"/>
+                </m:rPr>
+                <m:t>−</m:t>
+              </m:r>
+              <m:r>
+                <m:rPr>
+                  <m:sty m:val="b"/>
+                </m:rPr>
+                <m:t>c</m:t>
+              </m:r>
+              <m:sSup>
+                <m:e>
+                  <m:r>
+                    <m:rPr>
+                      <m:sty m:val="p"/>
+                    </m:rPr>
+                    <m:t>)</m:t>
+                  </m:r>
+                </m:e>
+                <m:sup>
+                  <m:r>
+                    <m:t>T</m:t>
+                  </m:r>
+                </m:sup>
+              </m:sSup>
+            </m:e>
+          </m:d>
+          <m:r>
+            <m:rPr>
+              <m:sty m:val="p"/>
+            </m:rPr>
+            <m:t>.</m:t>
+          </m:r>
+        </m:oMath>
+      </m:oMathPara>
+    </w:p>
+    <w:p>
+      <w:pPr>
+        <w:pStyle w:val="FirstParagraph"/>
+      </w:pPr>
+      <w:r>
+        <w:t xml:space="preserve">For a mass distribution with central covariance</w:t>
+      </w:r>
+      <w:r>
+        <w:t xml:space="preserve"> </w:t>
+      </w:r>
+      <m:oMath>
+        <m:r>
+          <m:rPr>
+            <m:sty m:val="b"/>
+          </m:rPr>
+          <m:t>C</m:t>
+        </m:r>
+      </m:oMath>
+      <w:r>
+        <w:t xml:space="preserve">,</w:t>
+      </w:r>
+    </w:p>
+    <w:p>
+      <w:pPr>
+        <w:pStyle w:val="BodyText"/>
+      </w:pPr>
+      <w:bookmarkStart w:id="118" w:name="triangle-lamina-inertia"/>
+      <w:bookmarkEnd w:id="118"/>
+    </w:p>
+    <w:p>
+      <w:pPr>
+        <w:pStyle w:val="BodyText"/>
+      </w:pPr>
+      <m:oMathPara>
+        <m:oMathParaPr>
+          <m:jc m:val="center"/>
+        </m:oMathParaPr>
+        <m:oMath>
+          <m:r>
+            <m:rPr>
+              <m:sty m:val="b"/>
+            </m:rPr>
+            <m:t>I</m:t>
+          </m:r>
+          <m:r>
+            <m:rPr>
+              <m:sty m:val="p"/>
+            </m:rPr>
+            <m:t>=</m:t>
+          </m:r>
+          <m:r>
+            <m:t>m</m:t>
+          </m:r>
+          <m:d>
+            <m:dPr>
+              <m:begChr m:val="["/>
+              <m:sepChr m:val=""/>
+              <m:endChr m:val="]"/>
+              <m:grow/>
+            </m:dPr>
+            <m:e>
+              <m:r>
+                <m:rPr>
+                  <m:sty m:val="p"/>
+                </m:rPr>
+                <m:t>tr</m:t>
+              </m:r>
+              <m:r>
+                <m:rPr>
+                  <m:sty m:val="p"/>
+                </m:rPr>
+                <m:t>(</m:t>
+              </m:r>
+              <m:r>
+                <m:rPr>
+                  <m:sty m:val="b"/>
+                </m:rPr>
+                <m:t>C</m:t>
+              </m:r>
+              <m:r>
+                <m:rPr>
+                  <m:sty m:val="p"/>
+                </m:rPr>
+                <m:t>)</m:t>
+              </m:r>
+              <m:sSub>
+                <m:e>
+                  <m:r>
+                    <m:rPr>
+                      <m:sty m:val="b"/>
+                    </m:rPr>
+                    <m:t>1</m:t>
+                  </m:r>
+                </m:e>
+                <m:sub>
+                  <m:r>
+                    <m:t>3</m:t>
+                  </m:r>
+                </m:sub>
+              </m:sSub>
+              <m:r>
+                <m:rPr>
+                  <m:sty m:val="p"/>
+                </m:rPr>
+                <m:t>−</m:t>
+              </m:r>
+              <m:r>
+                <m:rPr>
+                  <m:sty m:val="b"/>
+                </m:rPr>
+                <m:t>C</m:t>
+              </m:r>
+            </m:e>
+          </m:d>
+          <m:r>
+            <m:rPr>
+              <m:sty m:val="p"/>
+            </m:rPr>
+            <m:t>.</m:t>
+          </m:r>
+        </m:oMath>
+      </m:oMathPara>
+    </w:p>
+    <w:p>
+      <w:pPr>
+        <w:pStyle w:val="FirstParagraph"/>
+      </w:pPr>
+      <w:r>
+        <w:t xml:space="preserve">This formula returns the standard inertia tensor, including signed</w:t>
+      </w:r>
+      <w:r>
+        <w:t xml:space="preserve"> </w:t>
+      </w:r>
+      <w:r>
+        <w:t xml:space="preserve">off-diagonal tensor components.</w:t>
+      </w:r>
+      <w:r>
+        <w:t xml:space="preserve"> </w:t>
+      </w:r>
+      <w:r>
+        <w:rPr>
+          <w:rStyle w:val="VerbatimChar"/>
+        </w:rPr>
+        <w:t xml:space="preserve">InertiaResult.as_urdf_dict()</w:t>
+      </w:r>
+      <w:r>
+        <w:t xml:space="preserve"> </w:t>
+      </w:r>
+      <w:r>
+        <w:t xml:space="preserve">exports those</w:t>
+      </w:r>
+      <w:r>
+        <w:t xml:space="preserve"> </w:t>
+      </w:r>
+      <w:r>
+        <w:t xml:space="preserve">same symmetric tensor entries as URDF</w:t>
+      </w:r>
+      <w:r>
+        <w:t xml:space="preserve"> </w:t>
+      </w:r>
+      <w:r>
+        <w:rPr>
+          <w:rStyle w:val="VerbatimChar"/>
+        </w:rPr>
+        <w:t xml:space="preserve">ixy</w:t>
+      </w:r>
+      <w:r>
+        <w:t xml:space="preserve">,</w:t>
+      </w:r>
+      <w:r>
+        <w:t xml:space="preserve"> </w:t>
+      </w:r>
+      <w:r>
+        <w:rPr>
+          <w:rStyle w:val="VerbatimChar"/>
+        </w:rPr>
+        <w:t xml:space="preserve">ixz</w:t>
+      </w:r>
+      <w:r>
+        <w:t xml:space="preserve">, and</w:t>
+      </w:r>
+      <w:r>
+        <w:t xml:space="preserve"> </w:t>
+      </w:r>
+      <w:r>
+        <w:rPr>
+          <w:rStyle w:val="VerbatimChar"/>
+        </w:rPr>
+        <w:t xml:space="preserve">iyz</w:t>
+      </w:r>
+      <w:r>
+        <w:t xml:space="preserve"> </w:t>
+      </w:r>
+      <w:r>
+        <w:t xml:space="preserve">coefficients.</w:t>
+      </w:r>
+      <w:r>
+        <w:t xml:space="preserve"> </w:t>
+      </w:r>
+      <w:r>
+        <w:t xml:space="preserve">The exporter does not negate them: an actual MuJoCo URDF loadback test checks</w:t>
+      </w:r>
+      <w:r>
+        <w:t xml:space="preserve"> </w:t>
+      </w:r>
+      <w:r>
+        <w:t xml:space="preserve">the reconstructed native tensor and kinetic energy for an asymmetric inertia.</w:t>
+      </w:r>
+      <w:r>
+        <w:t xml:space="preserve"> </w:t>
+      </w:r>
+      <w:r>
+        <w:t xml:space="preserve">This verifies that particular exporter/consumer path, not every URDF parser or</w:t>
+      </w:r>
+      <w:r>
+        <w:t xml:space="preserve"> </w:t>
+      </w:r>
+      <w:r>
+        <w:t xml:space="preserve">native engine.</w:t>
+      </w:r>
+    </w:p>
+    <w:bookmarkEnd w:id="119"/>
+    <w:bookmarkEnd w:id="120"/>
+    <w:bookmarkStart w:id="124" w:name="algorithm-1"/>
+    <w:p>
+      <w:pPr>
+        <w:pStyle w:val="Heading2"/>
+      </w:pPr>
+      <w:r>
+        <w:t xml:space="preserve">Algorithm</w:t>
+      </w:r>
+    </w:p>
+    <w:bookmarkStart w:id="121" w:name="inputs-1"/>
+    <w:p>
+      <w:pPr>
+        <w:pStyle w:val="Heading3"/>
+      </w:pPr>
+      <w:r>
+        <w:t xml:space="preserve">Inputs</w:t>
+      </w:r>
+    </w:p>
+    <w:p>
+      <w:pPr>
+        <w:pStyle w:val="FirstParagraph"/>
+      </w:pPr>
+      <w:r>
+        <w:t xml:space="preserve">The public function</w:t>
+      </w:r>
+      <w:r>
+        <w:t xml:space="preserve"> </w:t>
+      </w:r>
+      <w:r>
+        <w:rPr>
+          <w:rStyle w:val="VerbatimChar"/>
+        </w:rPr>
+        <w:t xml:space="preserve">compute_triangle_lamina(vertices, faces, mass)</w:t>
+      </w:r>
+      <w:r>
+        <w:t xml:space="preserve"> </w:t>
+      </w:r>
+      <w:r>
+        <w:t xml:space="preserve">consumes</w:t>
+      </w:r>
+      <w:r>
+        <w:t xml:space="preserve"> </w:t>
+      </w:r>
+      <w:r>
+        <w:t xml:space="preserve">only the arrays and scalar above. It does not consume a path, mesh object,</w:t>
+      </w:r>
+      <w:r>
+        <w:t xml:space="preserve"> </w:t>
+      </w:r>
+      <w:r>
+        <w:t xml:space="preserve">transform, frame label, density, thickness, or native model.</w:t>
+      </w:r>
+    </w:p>
+    <w:bookmarkEnd w:id="121"/>
+    <w:bookmarkStart w:id="122" w:name="procedure-1"/>
+    <w:p>
+      <w:pPr>
+        <w:pStyle w:val="Heading3"/>
+      </w:pPr>
+      <w:r>
+        <w:t xml:space="preserve">Procedure</w:t>
+      </w:r>
+    </w:p>
+    <w:p>
+      <w:pPr>
+        <w:pStyle w:val="Compact"/>
+        <w:numPr>
+          <w:ilvl w:val="0"/>
+          <w:numId w:val="1004"/>
+        </w:numPr>
+      </w:pPr>
+      <w:r>
+        <w:t xml:space="preserve">Validate the mass and array shapes, finiteness, face dtype, and index bounds.</w:t>
+      </w:r>
+    </w:p>
+    <w:p>
+      <w:pPr>
+        <w:pStyle w:val="Compact"/>
+        <w:numPr>
+          <w:ilvl w:val="0"/>
+          <w:numId w:val="1004"/>
+        </w:numPr>
+      </w:pPr>
+      <w:r>
+        <w:t xml:space="preserve">Gather indexed triangles and compute unsigned area weights.</w:t>
+      </w:r>
+    </w:p>
+    <w:p>
+      <w:pPr>
+        <w:pStyle w:val="Compact"/>
+        <w:numPr>
+          <w:ilvl w:val="0"/>
+          <w:numId w:val="1004"/>
+        </w:numPr>
+      </w:pPr>
+      <w:r>
+        <w:t xml:space="preserve">Reject nonpositive or nonfinite total area; omit only exactly zero-area</w:t>
+      </w:r>
+      <w:r>
+        <w:t xml:space="preserve"> </w:t>
+      </w:r>
+      <w:r>
+        <w:t xml:space="preserve">triangles from moment/topology accumulation.</w:t>
+      </w:r>
+    </w:p>
+    <w:p>
+      <w:pPr>
+        <w:pStyle w:val="Compact"/>
+        <w:numPr>
+          <w:ilvl w:val="0"/>
+          <w:numId w:val="1004"/>
+        </w:numPr>
+      </w:pPr>
+      <w:r>
+        <w:t xml:space="preserve">Choose the first vertex of a maximum-area face as a local origin, then</w:t>
+      </w:r>
+      <w:r>
+        <w:t xml:space="preserve"> </w:t>
+      </w:r>
+      <w:r>
+        <w:t xml:space="preserve">compute weighted center and central covariance in that translated frame.</w:t>
+      </w:r>
+    </w:p>
+    <w:p>
+      <w:pPr>
+        <w:pStyle w:val="Compact"/>
+        <w:numPr>
+          <w:ilvl w:val="0"/>
+          <w:numId w:val="1004"/>
+        </w:numPr>
+      </w:pPr>
+      <w:r>
+        <w:t xml:space="preserve">Convert covariance to inertia and reject nonfinite center or tensor values.</w:t>
+      </w:r>
+    </w:p>
+    <w:p>
+      <w:pPr>
+        <w:pStyle w:val="Compact"/>
+        <w:numPr>
+          <w:ilvl w:val="0"/>
+          <w:numId w:val="1004"/>
+        </w:numPr>
+      </w:pPr>
+      <w:r>
+        <w:t xml:space="preserve">Count exact duplicate positive-area coordinate triangles independent of</w:t>
+      </w:r>
+      <w:r>
+        <w:t xml:space="preserve"> </w:t>
+      </w:r>
+      <w:r>
+        <w:t xml:space="preserve">winding, and count edge degree using source vertex indices.</w:t>
+      </w:r>
+    </w:p>
+    <w:p>
+      <w:pPr>
+        <w:pStyle w:val="Compact"/>
+        <w:numPr>
+          <w:ilvl w:val="0"/>
+          <w:numId w:val="1004"/>
+        </w:numPr>
+      </w:pPr>
+      <w:r>
+        <w:t xml:space="preserve">Return a distinct lamina mode and explicit diagnostics without repairing or</w:t>
+      </w:r>
+      <w:r>
+        <w:t xml:space="preserve"> </w:t>
+      </w:r>
+      <w:r>
+        <w:t xml:space="preserve">modifying source arrays.</w:t>
+      </w:r>
+    </w:p>
+    <w:p>
+      <w:pPr>
+        <w:pStyle w:val="FirstParagraph"/>
+      </w:pPr>
+      <w:r>
+        <w:t xml:space="preserve">The numerical arrays are vectorized over faces. Working memory is linear in</w:t>
+      </w:r>
+      <w:r>
+        <w:t xml:space="preserve"> </w:t>
+      </w:r>
+      <w:r>
+        <w:t xml:space="preserve">the number of input faces; uniqueness diagnostics sort/compare face and edge</w:t>
+      </w:r>
+      <w:r>
+        <w:t xml:space="preserve"> </w:t>
+      </w:r>
+      <w:r>
+        <w:t xml:space="preserve">records and are not a streaming algorithm.</w:t>
+      </w:r>
+    </w:p>
+    <w:bookmarkEnd w:id="122"/>
+    <w:bookmarkStart w:id="123" w:name="outputs-1"/>
+    <w:p>
+      <w:pPr>
+        <w:pStyle w:val="Heading3"/>
+      </w:pPr>
+      <w:r>
+        <w:t xml:space="preserve">Outputs</w:t>
+      </w:r>
+    </w:p>
+    <w:p>
+      <w:pPr>
+        <w:pStyle w:val="FirstParagraph"/>
+      </w:pPr>
+      <w:r>
+        <w:rPr>
+          <w:rStyle w:val="VerbatimChar"/>
+        </w:rPr>
+        <w:t xml:space="preserve">TriangleLaminaResult</w:t>
+      </w:r>
+      <w:r>
+        <w:t xml:space="preserve"> </w:t>
+      </w:r>
+      <w:r>
+        <w:t xml:space="preserve">contains an</w:t>
+      </w:r>
+      <w:r>
+        <w:t xml:space="preserve"> </w:t>
+      </w:r>
+      <w:r>
+        <w:rPr>
+          <w:rStyle w:val="VerbatimChar"/>
+        </w:rPr>
+        <w:t xml:space="preserve">InertiaResult</w:t>
+      </w:r>
+      <w:r>
+        <w:t xml:space="preserve">, total area, zero-area face</w:t>
+      </w:r>
+      <w:r>
+        <w:t xml:space="preserve"> </w:t>
+      </w:r>
+      <w:r>
+        <w:t xml:space="preserve">count, duplicate positive-area coordinate-face count, indexed boundary-edge</w:t>
+      </w:r>
+      <w:r>
+        <w:t xml:space="preserve"> </w:t>
+      </w:r>
+      <w:r>
+        <w:t xml:space="preserve">count, and indexed nonmanifold-edge count. The embedded legacy result object</w:t>
+      </w:r>
+      <w:r>
+        <w:t xml:space="preserve"> </w:t>
+      </w:r>
+      <w:r>
+        <w:t xml:space="preserve">remains mutable for compatibility. Counts are diagnostics, not mesh validation.</w:t>
+      </w:r>
+    </w:p>
+    <w:bookmarkEnd w:id="123"/>
+    <w:bookmarkEnd w:id="124"/>
+    <w:bookmarkStart w:id="127" w:name="implementation-symbols-1"/>
+    <w:p>
+      <w:pPr>
+        <w:pStyle w:val="Heading2"/>
+      </w:pPr>
+      <w:r>
+        <w:t xml:space="preserve">Implementation Symbols</w:t>
+      </w:r>
+    </w:p>
+    <w:bookmarkStart w:id="125" w:name="public-symbols-1"/>
+    <w:p>
+      <w:pPr>
+        <w:pStyle w:val="Heading3"/>
+      </w:pPr>
+      <w:r>
+        <w:t xml:space="preserve">Public Symbols</w:t>
+      </w:r>
+    </w:p>
+    <w:p>
+      <w:pPr>
+        <w:pStyle w:val="FirstParagraph"/>
+      </w:pPr>
+      <w:r>
+        <w:rPr>
+          <w:rStyle w:val="VerbatimChar"/>
+        </w:rPr>
+        <w:t xml:space="preserve">compute_triangle_lamina</w:t>
+      </w:r>
+      <w:r>
+        <w:t xml:space="preserve"> </w:t>
+      </w:r>
+      <w:r>
+        <w:t xml:space="preserve">and</w:t>
+      </w:r>
+      <w:r>
+        <w:t xml:space="preserve"> </w:t>
+      </w:r>
+      <w:r>
+        <w:rPr>
+          <w:rStyle w:val="VerbatimChar"/>
+        </w:rPr>
+        <w:t xml:space="preserve">TriangleLaminaResult</w:t>
+      </w:r>
+      <w:r>
+        <w:t xml:space="preserve"> </w:t>
+      </w:r>
+      <w:r>
+        <w:t xml:space="preserve">are defined in</w:t>
+      </w:r>
+      <w:r>
+        <w:t xml:space="preserve"> </w:t>
+      </w:r>
+      <w:r>
+        <w:rPr>
+          <w:rStyle w:val="VerbatimChar"/>
+        </w:rPr>
+        <w:t xml:space="preserve">src/shared/python/humanoid_character_builder/mesh/triangle_lamina.py</w:t>
+      </w:r>
+      <w:r>
+        <w:t xml:space="preserve">.</w:t>
+      </w:r>
+      <w:r>
+        <w:t xml:space="preserve"> </w:t>
+      </w:r>
+      <w:r>
+        <w:rPr>
+          <w:rStyle w:val="VerbatimChar"/>
+        </w:rPr>
+        <w:t xml:space="preserve">InertiaMode.TRIANGLE_MULTISET_LAMINA_MASS</w:t>
+      </w:r>
+      <w:r>
+        <w:t xml:space="preserve"> </w:t>
+      </w:r>
+      <w:r>
+        <w:t xml:space="preserve">and the compatible</w:t>
+      </w:r>
+      <w:r>
+        <w:t xml:space="preserve"> </w:t>
+      </w:r>
+      <w:r>
+        <w:rPr>
+          <w:rStyle w:val="VerbatimChar"/>
+        </w:rPr>
+        <w:t xml:space="preserve">InertiaResult</w:t>
+      </w:r>
+      <w:r>
+        <w:t xml:space="preserve"> </w:t>
+      </w:r>
+      <w:r>
+        <w:t xml:space="preserve">representation are defined in</w:t>
+      </w:r>
+      <w:r>
+        <w:t xml:space="preserve"> </w:t>
+      </w:r>
+      <w:r>
+        <w:rPr>
+          <w:rStyle w:val="VerbatimChar"/>
+        </w:rPr>
+        <w:t xml:space="preserve">src/shared/python/humanoid_character_builder/mesh/inertia_calculator.py</w:t>
+      </w:r>
+      <w:r>
+        <w:t xml:space="preserve">.</w:t>
+      </w:r>
+      <w:r>
+        <w:t xml:space="preserve"> </w:t>
+      </w:r>
+      <w:r>
+        <w:t xml:space="preserve">This note does not assert that the module is a stable published consumer API.</w:t>
+      </w:r>
+    </w:p>
+    <w:bookmarkEnd w:id="125"/>
+    <w:bookmarkStart w:id="126" w:name="source-mapping-1"/>
+    <w:p>
+      <w:pPr>
+        <w:pStyle w:val="Heading3"/>
+      </w:pPr>
+      <w:r>
+        <w:t xml:space="preserve">Source Mapping</w:t>
+      </w:r>
+    </w:p>
+    <w:p>
+      <w:pPr>
+        <w:pStyle w:val="FirstParagraph"/>
+      </w:pPr>
+      <w:r>
+        <w:t xml:space="preserve">The method maps to</w:t>
+      </w:r>
+      <w:r>
+        <w:t xml:space="preserve"> </w:t>
+      </w:r>
+      <w:r>
+        <w:rPr>
+          <w:rStyle w:val="VerbatimChar"/>
+        </w:rPr>
+        <w:t xml:space="preserve">_area_weights</w:t>
+      </w:r>
+      <w:r>
+        <w:t xml:space="preserve">,</w:t>
+      </w:r>
+      <w:r>
+        <w:t xml:space="preserve"> </w:t>
+      </w:r>
+      <w:r>
+        <w:rPr>
+          <w:rStyle w:val="VerbatimChar"/>
+        </w:rPr>
+        <w:t xml:space="preserve">_centered_moments</w:t>
+      </w:r>
+      <w:r>
+        <w:t xml:space="preserve">, and</w:t>
+      </w:r>
+      <w:r>
+        <w:t xml:space="preserve"> </w:t>
+      </w:r>
+      <w:r>
+        <w:rPr>
+          <w:rStyle w:val="VerbatimChar"/>
+        </w:rPr>
+        <w:t xml:space="preserve">compute_triangle_lamina</w:t>
+      </w:r>
+      <w:r>
+        <w:t xml:space="preserve"> </w:t>
+      </w:r>
+      <w:r>
+        <w:t xml:space="preserve">in</w:t>
+      </w:r>
+      <w:r>
+        <w:t xml:space="preserve"> </w:t>
+      </w:r>
+      <w:r>
+        <w:rPr>
+          <w:rStyle w:val="VerbatimChar"/>
+        </w:rPr>
+        <w:t xml:space="preserve">triangle_lamina.py</w:t>
+      </w:r>
+      <w:r>
+        <w:t xml:space="preserve">; mode identity is mapped in</w:t>
+      </w:r>
+      <w:r>
+        <w:t xml:space="preserve"> </w:t>
+      </w:r>
+      <w:r>
+        <w:rPr>
+          <w:rStyle w:val="VerbatimChar"/>
+        </w:rPr>
+        <w:t xml:space="preserve">inertia_calculator.py</w:t>
+      </w:r>
+      <w:r>
+        <w:t xml:space="preserve">. Analytic and metamorphic checks are in</w:t>
+      </w:r>
+      <w:r>
+        <w:t xml:space="preserve"> </w:t>
+      </w:r>
+      <w:r>
+        <w:rPr>
+          <w:rStyle w:val="VerbatimChar"/>
+        </w:rPr>
+        <w:t xml:space="preserve">src/shared/python/humanoid_character_builder/tests/test_triangle_lamina.py</w:t>
+      </w:r>
+      <w:r>
+        <w:t xml:space="preserve">.</w:t>
+      </w:r>
+      <w:r>
+        <w:t xml:space="preserve"> </w:t>
+      </w:r>
+      <w:r>
+        <w:t xml:space="preserve">This kernel is separate from</w:t>
+      </w:r>
+      <w:r>
+        <w:t xml:space="preserve"> </w:t>
+      </w:r>
+      <w:r>
+        <w:rPr>
+          <w:rStyle w:val="VerbatimChar"/>
+        </w:rPr>
+        <w:t xml:space="preserve">MeshInertiaCalculator</w:t>
+      </w:r>
+      <w:r>
+        <w:t xml:space="preserve">, which derives solid</w:t>
+      </w:r>
+      <w:r>
+        <w:t xml:space="preserve"> </w:t>
+      </w:r>
+      <w:r>
+        <w:t xml:space="preserve">properties from volume-mesh processing and watertightness policy.</w:t>
+      </w:r>
+    </w:p>
+    <w:bookmarkEnd w:id="126"/>
+    <w:bookmarkEnd w:id="127"/>
+    <w:bookmarkStart w:id="130" w:name="error-and-failure-semantics-1"/>
+    <w:p>
+      <w:pPr>
+        <w:pStyle w:val="Heading2"/>
+      </w:pPr>
+      <w:r>
+        <w:t xml:space="preserve">Error and Failure Semantics</w:t>
+      </w:r>
+    </w:p>
+    <w:bookmarkStart w:id="128" w:name="error-conditions-1"/>
+    <w:p>
+      <w:pPr>
+        <w:pStyle w:val="Heading3"/>
+      </w:pPr>
+      <w:r>
+        <w:t xml:space="preserve">Error Conditions</w:t>
+      </w:r>
+    </w:p>
+    <w:p>
+      <w:pPr>
+        <w:pStyle w:val="FirstParagraph"/>
+      </w:pPr>
+      <w:r>
+        <w:t xml:space="preserve">Wrong scalar kind or noninteger face indices raise</w:t>
+      </w:r>
+      <w:r>
+        <w:t xml:space="preserve"> </w:t>
+      </w:r>
+      <w:r>
+        <w:rPr>
+          <w:rStyle w:val="VerbatimChar"/>
+        </w:rPr>
+        <w:t xml:space="preserve">TypeError</w:t>
+      </w:r>
+      <w:r>
+        <w:t xml:space="preserve">. Invalid scalar</w:t>
+      </w:r>
+      <w:r>
+        <w:t xml:space="preserve"> </w:t>
+      </w:r>
+      <w:r>
+        <w:t xml:space="preserve">range, malformed/nonfinite vertices, face shape or bounds, no positive finite</w:t>
+      </w:r>
+      <w:r>
+        <w:t xml:space="preserve"> </w:t>
+      </w:r>
+      <w:r>
+        <w:t xml:space="preserve">total area, and nonfinite output moments raise</w:t>
+      </w:r>
+      <w:r>
+        <w:t xml:space="preserve"> </w:t>
+      </w:r>
+      <w:r>
+        <w:rPr>
+          <w:rStyle w:val="VerbatimChar"/>
+        </w:rPr>
+        <w:t xml:space="preserve">ValueError</w:t>
+      </w:r>
+      <w:r>
+        <w:t xml:space="preserve">. The function does</w:t>
+      </w:r>
+      <w:r>
+        <w:t xml:space="preserve"> </w:t>
+      </w:r>
+      <w:r>
+        <w:t xml:space="preserve">not repair malformed topology or substitute default mass/geometry.</w:t>
+      </w:r>
+    </w:p>
+    <w:bookmarkEnd w:id="128"/>
+    <w:bookmarkStart w:id="129" w:name="recovery-and-cancellation-1"/>
+    <w:p>
+      <w:pPr>
+        <w:pStyle w:val="Heading3"/>
+      </w:pPr>
+      <w:r>
+        <w:t xml:space="preserve">Recovery and Cancellation</w:t>
+      </w:r>
+    </w:p>
+    <w:p>
+      <w:pPr>
+        <w:pStyle w:val="FirstParagraph"/>
+      </w:pPr>
+      <w:r>
+        <w:t xml:space="preserve">The caller must correct source inputs and resubmit. There is no partial result,</w:t>
+      </w:r>
+      <w:r>
+        <w:t xml:space="preserve"> </w:t>
+      </w:r>
+      <w:r>
+        <w:t xml:space="preserve">fallback solid calculation, or cancellation callback. Large inputs are bounded</w:t>
+      </w:r>
+      <w:r>
+        <w:t xml:space="preserve"> </w:t>
+      </w:r>
+      <w:r>
+        <w:t xml:space="preserve">only by caller-provided memory and face count; this API provides no resource</w:t>
+      </w:r>
+      <w:r>
+        <w:t xml:space="preserve"> </w:t>
+      </w:r>
+      <w:r>
+        <w:t xml:space="preserve">budget or streaming cancellation guarantee.</w:t>
+      </w:r>
+    </w:p>
+    <w:bookmarkEnd w:id="129"/>
+    <w:bookmarkEnd w:id="130"/>
+    <w:bookmarkStart w:id="133" w:name="uncertainty-and-sensitivity-1"/>
+    <w:p>
+      <w:pPr>
+        <w:pStyle w:val="Heading2"/>
+      </w:pPr>
+      <w:r>
+        <w:t xml:space="preserve">Uncertainty and Sensitivity</w:t>
+      </w:r>
+    </w:p>
+    <w:bookmarkStart w:id="131" w:name="uncertainty-sources-1"/>
+    <w:p>
+      <w:pPr>
+        <w:pStyle w:val="Heading3"/>
+      </w:pPr>
+      <w:r>
+        <w:t xml:space="preserve">Uncertainty Sources</w:t>
+      </w:r>
+    </w:p>
+    <w:p>
+      <w:pPr>
+        <w:pStyle w:val="FirstParagraph"/>
+      </w:pPr>
+      <w:r>
+        <w:t xml:space="preserve">This kernel propagates no uncertainty distribution. Its values depend on</w:t>
+      </w:r>
+      <w:r>
+        <w:t xml:space="preserve"> </w:t>
+      </w:r>
+      <w:r>
+        <w:t xml:space="preserve">caller-selected coordinates, mesh sampling, face multiplicity, declared mass,</w:t>
+      </w:r>
+      <w:r>
+        <w:t xml:space="preserve"> </w:t>
+      </w:r>
+      <w:r>
+        <w:t xml:space="preserve">and the unverified assumption of uniform area density. It does not determine</w:t>
+      </w:r>
+      <w:r>
+        <w:t xml:space="preserve"> </w:t>
+      </w:r>
+      <w:r>
+        <w:t xml:space="preserve">whether those assumptions are appropriate for an object or body segment.</w:t>
+      </w:r>
+    </w:p>
+    <w:bookmarkEnd w:id="131"/>
+    <w:bookmarkStart w:id="132" w:name="sensitivity-1"/>
+    <w:p>
+      <w:pPr>
+        <w:pStyle w:val="Heading3"/>
+      </w:pPr>
+      <w:r>
+        <w:t xml:space="preserve">Sensitivity</w:t>
+      </w:r>
+    </w:p>
+    <w:p>
+      <w:pPr>
+        <w:pStyle w:val="FirstParagraph"/>
+      </w:pPr>
+      <w:r>
+        <w:t xml:space="preserve">Area and second moments are sensitive to coordinate perturbations and changes</w:t>
+      </w:r>
+      <w:r>
+        <w:t xml:space="preserve"> </w:t>
+      </w:r>
+      <w:r>
+        <w:t xml:space="preserve">in tessellation or face multiplicity. Very small representable positive areas</w:t>
+      </w:r>
+      <w:r>
+        <w:t xml:space="preserve"> </w:t>
+      </w:r>
+      <w:r>
+        <w:t xml:space="preserve">remain in the calculation; no tolerance silently removes them. Nonzero areas</w:t>
+      </w:r>
+      <w:r>
+        <w:t xml:space="preserve"> </w:t>
+      </w:r>
+      <w:r>
+        <w:t xml:space="preserve">or fractions not representable as positive</w:t>
+      </w:r>
+      <w:r>
+        <w:t xml:space="preserve"> </w:t>
+      </w:r>
+      <w:r>
+        <w:rPr>
+          <w:rStyle w:val="VerbatimChar"/>
+        </w:rPr>
+        <w:t xml:space="preserve">float64</w:t>
+      </w:r>
+      <w:r>
+        <w:t xml:space="preserve"> </w:t>
+      </w:r>
+      <w:r>
+        <w:t xml:space="preserve">are rejected. Summation</w:t>
+      </w:r>
+      <w:r>
+        <w:t xml:space="preserve"> </w:t>
+      </w:r>
+      <w:r>
+        <w:t xml:space="preserve">and floating-point rounding still affect results. The local-origin accumulation</w:t>
+      </w:r>
+      <w:r>
+        <w:t xml:space="preserve"> </w:t>
+      </w:r>
+      <w:r>
+        <w:t xml:space="preserve">reduces avoidable cancellation for translated geometry but does not provide an</w:t>
+      </w:r>
+      <w:r>
+        <w:t xml:space="preserve"> </w:t>
+      </w:r>
+      <w:r>
+        <w:t xml:space="preserve">error bound for every scale or conditioning regime.</w:t>
+      </w:r>
+    </w:p>
+    <w:bookmarkEnd w:id="132"/>
+    <w:bookmarkEnd w:id="133"/>
+    <w:bookmarkStart w:id="136" w:name="verification-and-validation-1"/>
+    <w:p>
+      <w:pPr>
+        <w:pStyle w:val="Heading2"/>
+      </w:pPr>
+      <w:r>
+        <w:t xml:space="preserve">Verification and Validation</w:t>
+      </w:r>
+    </w:p>
+    <w:bookmarkStart w:id="134" w:name="test-evidence-1"/>
+    <w:p>
+      <w:pPr>
+        <w:pStyle w:val="Heading3"/>
+      </w:pPr>
+      <w:r>
+        <w:t xml:space="preserve">Test Evidence</w:t>
+      </w:r>
+    </w:p>
+    <w:p>
+      <w:pPr>
+        <w:pStyle w:val="FirstParagraph"/>
+      </w:pPr>
+      <w:r>
+        <w:rPr>
+          <w:rStyle w:val="VerbatimChar"/>
+        </w:rPr>
+        <w:t xml:space="preserve">test_triangle_analytic_mass_com_and_off_diagonal</w:t>
+      </w:r>
+      <w:r>
+        <w:t xml:space="preserve"> </w:t>
+      </w:r>
+      <w:r>
+        <w:t xml:space="preserve">checks the exact triangular</w:t>
+      </w:r>
+      <w:r>
+        <w:t xml:space="preserve"> </w:t>
+      </w:r>
+      <w:r>
+        <w:t xml:space="preserve">lamina result. Other tests check a rectangular plate and subdivision, an</w:t>
+      </w:r>
+      <w:r>
+        <w:t xml:space="preserve"> </w:t>
+      </w:r>
+      <w:r>
+        <w:t xml:space="preserve">analytic cube shell, rigid transforms/scaling/input immutability, duplicate</w:t>
+      </w:r>
+      <w:r>
+        <w:t xml:space="preserve"> </w:t>
+      </w:r>
+      <w:r>
+        <w:t xml:space="preserve">and degenerate faces, remote negligible-area faces, small representable and</w:t>
+      </w:r>
+      <w:r>
+        <w:t xml:space="preserve"> </w:t>
+      </w:r>
+      <w:r>
+        <w:t xml:space="preserve">unrepresentable areas, complex-coordinate rejection, and invalid input classes.</w:t>
+      </w:r>
+      <w:r>
+        <w:t xml:space="preserve"> </w:t>
+      </w:r>
+      <w:r>
+        <w:t xml:space="preserve">These are independent synthetic analytic or metamorphic tests; they are not</w:t>
+      </w:r>
+      <w:r>
+        <w:t xml:space="preserve"> </w:t>
+      </w:r>
+      <w:r>
+        <w:t xml:space="preserve">validation against a measured object or biomechanical segment.</w:t>
+      </w:r>
+    </w:p>
+    <w:bookmarkEnd w:id="134"/>
+    <w:bookmarkStart w:id="135" w:name="acceptance-criteria-1"/>
+    <w:p>
+      <w:pPr>
+        <w:pStyle w:val="Heading3"/>
+      </w:pPr>
+      <w:r>
+        <w:t xml:space="preserve">Acceptance Criteria</w:t>
+      </w:r>
+    </w:p>
+    <w:p>
+      <w:pPr>
+        <w:pStyle w:val="FirstParagraph"/>
+      </w:pPr>
+      <w:r>
+        <w:t xml:space="preserve">Numerical kernel acceptance requires finite typed inputs, correct analytic</w:t>
+      </w:r>
+      <w:r>
+        <w:t xml:space="preserve"> </w:t>
+      </w:r>
+      <w:r>
+        <w:t xml:space="preserve">moments, expected rigid-transform and subdivision invariants, explicit</w:t>
+      </w:r>
+      <w:r>
+        <w:t xml:space="preserve"> </w:t>
+      </w:r>
+      <w:r>
+        <w:t xml:space="preserve">degeneracy diagnostics, and fail-closed invalid-input behavior. Those criteria</w:t>
+      </w:r>
+      <w:r>
+        <w:t xml:space="preserve"> </w:t>
+      </w:r>
+      <w:r>
+        <w:t xml:space="preserve">do not establish source asset provenance, unit/frame correctness of a producer,</w:t>
+      </w:r>
+      <w:r>
+        <w:t xml:space="preserve"> </w:t>
+      </w:r>
+      <w:r>
+        <w:t xml:space="preserve">partial-overlap handling, biological mass distribution, or native-model</w:t>
+      </w:r>
+      <w:r>
+        <w:t xml:space="preserve"> </w:t>
+      </w:r>
+      <w:r>
+        <w:t xml:space="preserve">admission. The calculation freshness generator currently executes only the</w:t>
+      </w:r>
+      <w:r>
+        <w:t xml:space="preserve"> </w:t>
+      </w:r>
+      <w:r>
+        <w:t xml:space="preserve">D-plane pathway; this note therefore remains outside the registered calculation</w:t>
+      </w:r>
+      <w:r>
+        <w:t xml:space="preserve"> </w:t>
+      </w:r>
+      <w:r>
+        <w:t xml:space="preserve">set and cannot be represented as freshness-verified or exemplar-verified.</w:t>
+      </w:r>
+    </w:p>
+    <w:bookmarkEnd w:id="135"/>
+    <w:bookmarkEnd w:id="136"/>
+    <w:bookmarkStart w:id="139" w:name="limits-and-applicability-1"/>
+    <w:p>
+      <w:pPr>
+        <w:pStyle w:val="Heading2"/>
+      </w:pPr>
+      <w:r>
+        <w:t xml:space="preserve">Limits and Applicability</w:t>
+      </w:r>
+    </w:p>
+    <w:bookmarkStart w:id="137" w:name="validity-range-1"/>
+    <w:p>
+      <w:pPr>
+        <w:pStyle w:val="Heading3"/>
+      </w:pPr>
+      <w:r>
+        <w:t xml:space="preserve">Validity Range</w:t>
+      </w:r>
+    </w:p>
+    <w:p>
+      <w:pPr>
+        <w:pStyle w:val="FirstParagraph"/>
+      </w:pPr>
+      <w:r>
+        <w:t xml:space="preserve">The equations apply to a finite positive-area triangle multiset in one</w:t>
+      </w:r>
+      <w:r>
+        <w:t xml:space="preserve"> </w:t>
+      </w:r>
+      <w:r>
+        <w:t xml:space="preserve">orthonormal Euclidean metre frame with a positive finite caller-owned total</w:t>
+      </w:r>
+      <w:r>
+        <w:t xml:space="preserve"> </w:t>
+      </w:r>
+      <w:r>
+        <w:t xml:space="preserve">mass. Degenerate faces may be present but contribute no area or mass. No</w:t>
+      </w:r>
+      <w:r>
+        <w:t xml:space="preserve"> </w:t>
+      </w:r>
+      <w:r>
+        <w:t xml:space="preserve">evidence here establishes useful geometric scales beyond representable,</w:t>
+      </w:r>
+      <w:r>
+        <w:t xml:space="preserve"> </w:t>
+      </w:r>
+      <w:r>
+        <w:t xml:space="preserve">finite floating-point inputs.</w:t>
+      </w:r>
+    </w:p>
+    <w:bookmarkEnd w:id="137"/>
+    <w:bookmarkStart w:id="138" w:name="known-limitations-1"/>
+    <w:p>
+      <w:pPr>
+        <w:pStyle w:val="Heading3"/>
+      </w:pPr>
+      <w:r>
+        <w:t xml:space="preserve">Known Limitations</w:t>
+      </w:r>
+    </w:p>
+    <w:p>
+      <w:pPr>
+        <w:pStyle w:val="FirstParagraph"/>
+      </w:pPr>
+      <w:r>
+        <w:t xml:space="preserve">Coincident triangles retain multiplicity; partial overlap is neither detected</w:t>
+      </w:r>
+      <w:r>
+        <w:t xml:space="preserve"> </w:t>
+      </w:r>
+      <w:r>
+        <w:t xml:space="preserve">nor corrected. Duplicate detection is exact-coordinate and ignores winding,</w:t>
+      </w:r>
+      <w:r>
+        <w:t xml:space="preserve"> </w:t>
+      </w:r>
+      <w:r>
+        <w:t xml:space="preserve">whereas edge topology uses vertex indices. Indexed boundary/nonmanifold counts</w:t>
+      </w:r>
+      <w:r>
+        <w:t xml:space="preserve"> </w:t>
+      </w:r>
+      <w:r>
+        <w:t xml:space="preserve">do not prove surface closure, manifoldness, or self-intersection absence. No</w:t>
+      </w:r>
+      <w:r>
+        <w:t xml:space="preserve"> </w:t>
+      </w:r>
+      <w:r>
+        <w:t xml:space="preserve">volume, thickness, density field, material, anatomy, frame transform, native</w:t>
+      </w:r>
+      <w:r>
+        <w:t xml:space="preserve"> </w:t>
+      </w:r>
+      <w:r>
+        <w:t xml:space="preserve">asset loader, downstream consumer or physical acceptance is included. The</w:t>
+      </w:r>
+      <w:r>
+        <w:t xml:space="preserve"> </w:t>
+      </w:r>
+      <w:r>
+        <w:t xml:space="preserve">registered calculation, freshness workflow, source asset producer and any</w:t>
+      </w:r>
+      <w:r>
+        <w:t xml:space="preserve"> </w:t>
+      </w:r>
+      <w:r>
+        <w:t xml:space="preserve">engineering-use approval remain blocked.</w:t>
+      </w:r>
+    </w:p>
+    <w:bookmarkEnd w:id="138"/>
+    <w:bookmarkEnd w:id="139"/>
+    <w:bookmarkStart w:id="142" w:name="worked-examples-1"/>
+    <w:p>
+      <w:pPr>
+        <w:pStyle w:val="Heading2"/>
+      </w:pPr>
+      <w:r>
+        <w:t xml:space="preserve">Worked Examples</w:t>
+      </w:r>
+    </w:p>
+    <w:bookmarkStart w:id="140" w:name="example-inputs-1"/>
+    <w:p>
+      <w:pPr>
+        <w:pStyle w:val="Heading3"/>
+      </w:pPr>
+      <w:r>
+        <w:t xml:space="preserve">Example Inputs</w:t>
+      </w:r>
+    </w:p>
+    <w:p>
+      <w:pPr>
+        <w:pStyle w:val="FirstParagraph"/>
+      </w:pPr>
+      <w:r>
+        <w:t xml:space="preserve">Use vertices</w:t>
+      </w:r>
+      <w:r>
+        <w:t xml:space="preserve"> </w:t>
+      </w:r>
+      <m:oMath>
+        <m:r>
+          <m:rPr>
+            <m:sty m:val="p"/>
+          </m:rPr>
+          <m:t>(</m:t>
+        </m:r>
+        <m:r>
+          <m:t>0</m:t>
+        </m:r>
+        <m:r>
+          <m:rPr>
+            <m:sty m:val="p"/>
+          </m:rPr>
+          <m:t>,</m:t>
+        </m:r>
+        <m:r>
+          <m:t>0</m:t>
+        </m:r>
+        <m:r>
+          <m:rPr>
+            <m:sty m:val="p"/>
+          </m:rPr>
+          <m:t>,</m:t>
+        </m:r>
+        <m:r>
+          <m:t>0</m:t>
+        </m:r>
+        <m:r>
+          <m:rPr>
+            <m:sty m:val="p"/>
+          </m:rPr>
+          <m:t>)</m:t>
+        </m:r>
+      </m:oMath>
+      <w:r>
+        <w:t xml:space="preserve">,</w:t>
+      </w:r>
+      <w:r>
+        <w:t xml:space="preserve"> </w:t>
+      </w:r>
+      <m:oMath>
+        <m:r>
+          <m:rPr>
+            <m:sty m:val="p"/>
+          </m:rPr>
+          <m:t>(</m:t>
+        </m:r>
+        <m:r>
+          <m:t>3</m:t>
+        </m:r>
+        <m:r>
+          <m:rPr>
+            <m:sty m:val="p"/>
+          </m:rPr>
+          <m:t>,</m:t>
+        </m:r>
+        <m:r>
+          <m:t>0</m:t>
+        </m:r>
+        <m:r>
+          <m:rPr>
+            <m:sty m:val="p"/>
+          </m:rPr>
+          <m:t>,</m:t>
+        </m:r>
+        <m:r>
+          <m:t>0</m:t>
+        </m:r>
+        <m:r>
+          <m:rPr>
+            <m:sty m:val="p"/>
+          </m:rPr>
+          <m:t>)</m:t>
+        </m:r>
+      </m:oMath>
+      <w:r>
+        <w:t xml:space="preserve">, and</w:t>
+      </w:r>
+      <w:r>
+        <w:t xml:space="preserve"> </w:t>
+      </w:r>
+      <m:oMath>
+        <m:r>
+          <m:rPr>
+            <m:sty m:val="p"/>
+          </m:rPr>
+          <m:t>(</m:t>
+        </m:r>
+        <m:r>
+          <m:t>0</m:t>
+        </m:r>
+        <m:r>
+          <m:rPr>
+            <m:sty m:val="p"/>
+          </m:rPr>
+          <m:t>,</m:t>
+        </m:r>
+        <m:r>
+          <m:t>6</m:t>
+        </m:r>
+        <m:r>
+          <m:rPr>
+            <m:sty m:val="p"/>
+          </m:rPr>
+          <m:t>,</m:t>
+        </m:r>
+        <m:r>
+          <m:t>0</m:t>
+        </m:r>
+        <m:r>
+          <m:rPr>
+            <m:sty m:val="p"/>
+          </m:rPr>
+          <m:t>)</m:t>
+        </m:r>
+      </m:oMath>
+      <w:r>
+        <w:t xml:space="preserve"> </w:t>
+      </w:r>
+      <w:r>
+        <w:t xml:space="preserve">metres, one face with indices</w:t>
+      </w:r>
+      <w:r>
+        <w:t xml:space="preserve"> </w:t>
+      </w:r>
+      <m:oMath>
+        <m:r>
+          <m:rPr>
+            <m:sty m:val="p"/>
+          </m:rPr>
+          <m:t>(</m:t>
+        </m:r>
+        <m:r>
+          <m:t>0</m:t>
+        </m:r>
+        <m:r>
+          <m:rPr>
+            <m:sty m:val="p"/>
+          </m:rPr>
+          <m:t>,</m:t>
+        </m:r>
+        <m:r>
+          <m:t>1</m:t>
+        </m:r>
+        <m:r>
+          <m:rPr>
+            <m:sty m:val="p"/>
+          </m:rPr>
+          <m:t>,</m:t>
+        </m:r>
+        <m:r>
+          <m:t>2</m:t>
+        </m:r>
+        <m:r>
+          <m:rPr>
+            <m:sty m:val="p"/>
+          </m:rPr>
+          <m:t>)</m:t>
+        </m:r>
+      </m:oMath>
+      <w:r>
+        <w:t xml:space="preserve">, and total mass</w:t>
+      </w:r>
+      <w:r>
+        <w:t xml:space="preserve"> </w:t>
+      </w:r>
+      <m:oMath>
+        <m:r>
+          <m:t>2</m:t>
+        </m:r>
+      </m:oMath>
+      <w:r>
+        <w:t xml:space="preserve"> </w:t>
+      </w:r>
+      <w:r>
+        <w:t xml:space="preserve">kg. The triangle area is</w:t>
+      </w:r>
+      <w:r>
+        <w:t xml:space="preserve"> </w:t>
+      </w:r>
+      <m:oMath>
+        <m:r>
+          <m:t>9</m:t>
+        </m:r>
+      </m:oMath>
+      <w:r>
+        <w:t xml:space="preserve"> </w:t>
+      </w:r>
+      <w:r>
+        <w:t xml:space="preserve">m² and the face</w:t>
+      </w:r>
+      <w:r>
+        <w:t xml:space="preserve"> </w:t>
+      </w:r>
+      <w:r>
+        <w:t xml:space="preserve">receives all of the declared mass.</w:t>
+      </w:r>
+    </w:p>
+    <w:bookmarkEnd w:id="140"/>
+    <w:bookmarkStart w:id="141" w:name="example-results-1"/>
+    <w:p>
+      <w:pPr>
+        <w:pStyle w:val="Heading3"/>
+      </w:pPr>
+      <w:r>
+        <w:t xml:space="preserve">Example Results</w:t>
+      </w:r>
+    </w:p>
+    <w:p>
+      <w:pPr>
+        <w:pStyle w:val="FirstParagraph"/>
+      </w:pPr>
+      <w:r>
+        <w:t xml:space="preserve">The centroid is</w:t>
+      </w:r>
+      <w:r>
+        <w:t xml:space="preserve"> </w:t>
+      </w:r>
+      <m:oMath>
+        <m:r>
+          <m:rPr>
+            <m:sty m:val="p"/>
+          </m:rPr>
+          <m:t>(</m:t>
+        </m:r>
+        <m:r>
+          <m:t>1</m:t>
+        </m:r>
+        <m:r>
+          <m:rPr>
+            <m:sty m:val="p"/>
+          </m:rPr>
+          <m:t>,</m:t>
+        </m:r>
+        <m:r>
+          <m:t>2</m:t>
+        </m:r>
+        <m:r>
+          <m:rPr>
+            <m:sty m:val="p"/>
+          </m:rPr>
+          <m:t>,</m:t>
+        </m:r>
+        <m:r>
+          <m:t>0</m:t>
+        </m:r>
+        <m:r>
+          <m:rPr>
+            <m:sty m:val="p"/>
+          </m:rPr>
+          <m:t>)</m:t>
+        </m:r>
+      </m:oMath>
+      <w:r>
+        <w:t xml:space="preserve"> </w:t>
+      </w:r>
+      <w:r>
+        <w:t xml:space="preserve">m. Integrating the uniform triangular area gives</w:t>
+      </w:r>
+      <w:r>
+        <w:t xml:space="preserve"> </w:t>
+      </w:r>
+      <m:oMath>
+        <m:r>
+          <m:rPr>
+            <m:sty m:val="b"/>
+          </m:rPr>
+          <m:t>C</m:t>
+        </m:r>
+        <m:r>
+          <m:rPr>
+            <m:sty m:val="p"/>
+          </m:rPr>
+          <m:t>=</m:t>
+        </m:r>
+        <m:d>
+          <m:dPr>
+            <m:begChr m:val="["/>
+            <m:sepChr m:val=""/>
+            <m:endChr m:val="]"/>
+            <m:grow/>
+          </m:dPr>
+          <m:e>
+            <m:m>
+              <m:mPr>
+                <m:baseJc m:val="center"/>
+                <m:plcHide m:val="on"/>
+                <m:mcs>
+                  <m:mc>
+                    <m:mcPr>
+                      <m:mcJc m:val="center"/>
+                      <m:count m:val="1"/>
+                    </m:mcPr>
+                  </m:mc>
+                  <m:mc>
+                    <m:mcPr>
+                      <m:mcJc m:val="center"/>
+                      <m:count m:val="1"/>
+                    </m:mcPr>
+                  </m:mc>
+                  <m:mc>
+                    <m:mcPr>
+                      <m:mcJc m:val="center"/>
+                      <m:count m:val="1"/>
+                    </m:mcPr>
+                  </m:mc>
+                </m:mcs>
+              </m:mPr>
+              <m:mr>
+                <m:e>
+                  <m:r>
+                    <m:t>1</m:t>
+                  </m:r>
+                  <m:r>
+                    <m:rPr>
+                      <m:sty m:val="p"/>
+                    </m:rPr>
+                    <m:t>/</m:t>
+                  </m:r>
+                  <m:r>
+                    <m:t>2</m:t>
+                  </m:r>
+                </m:e>
+                <m:e>
+                  <m:r>
+                    <m:rPr>
+                      <m:sty m:val="p"/>
+                    </m:rPr>
+                    <m:t>−</m:t>
+                  </m:r>
+                  <m:r>
+                    <m:t>1</m:t>
+                  </m:r>
+                  <m:r>
+                    <m:rPr>
+                      <m:sty m:val="p"/>
+                    </m:rPr>
+                    <m:t>/</m:t>
+                  </m:r>
+                  <m:r>
+                    <m:t>2</m:t>
+                  </m:r>
+                </m:e>
+                <m:e>
+                  <m:r>
+                    <m:t>0</m:t>
+                  </m:r>
+                </m:e>
+              </m:mr>
+              <m:mr>
+                <m:e>
+                  <m:r>
+                    <m:rPr>
+                      <m:sty m:val="p"/>
+                    </m:rPr>
+                    <m:t>−</m:t>
+                  </m:r>
+                  <m:r>
+                    <m:t>1</m:t>
+                  </m:r>
+                  <m:r>
+                    <m:rPr>
+                      <m:sty m:val="p"/>
+                    </m:rPr>
+                    <m:t>/</m:t>
+                  </m:r>
+                  <m:r>
+                    <m:t>2</m:t>
+                  </m:r>
+                </m:e>
+                <m:e>
+                  <m:r>
+                    <m:t>2</m:t>
+                  </m:r>
+                </m:e>
+                <m:e>
+                  <m:r>
+                    <m:t>0</m:t>
+                  </m:r>
+                </m:e>
+              </m:mr>
+              <m:mr>
+                <m:e>
+                  <m:r>
+                    <m:t>0</m:t>
+                  </m:r>
+                </m:e>
+                <m:e>
+                  <m:r>
+                    <m:t>0</m:t>
+                  </m:r>
+                </m:e>
+                <m:e>
+                  <m:r>
+                    <m:t>0</m:t>
+                  </m:r>
+                </m:e>
+              </m:mr>
+            </m:m>
+          </m:e>
+        </m:d>
+      </m:oMath>
+      <w:r>
+        <w:t xml:space="preserve"> </w:t>
+      </w:r>
+      <w:r>
+        <w:t xml:space="preserve">m².</w:t>
+      </w:r>
+      <w:r>
+        <w:t xml:space="preserve"> </w:t>
+      </w:r>
+      <w:r>
+        <w:t xml:space="preserve">The returned inertia matrix is</w:t>
+      </w:r>
+      <w:r>
+        <w:t xml:space="preserve"> </w:t>
+      </w:r>
+      <m:oMath>
+        <m:r>
+          <m:rPr>
+            <m:sty m:val="b"/>
+          </m:rPr>
+          <m:t>I</m:t>
+        </m:r>
+        <m:r>
+          <m:rPr>
+            <m:sty m:val="p"/>
+          </m:rPr>
+          <m:t>=</m:t>
+        </m:r>
+        <m:d>
+          <m:dPr>
+            <m:begChr m:val="["/>
+            <m:sepChr m:val=""/>
+            <m:endChr m:val="]"/>
+            <m:grow/>
+          </m:dPr>
+          <m:e>
+            <m:m>
+              <m:mPr>
+                <m:baseJc m:val="center"/>
+                <m:plcHide m:val="on"/>
+                <m:mcs>
+                  <m:mc>
+                    <m:mcPr>
+                      <m:mcJc m:val="center"/>
+                      <m:count m:val="1"/>
+                    </m:mcPr>
+                  </m:mc>
+                  <m:mc>
+                    <m:mcPr>
+                      <m:mcJc m:val="center"/>
+                      <m:count m:val="1"/>
+                    </m:mcPr>
+                  </m:mc>
+                  <m:mc>
+                    <m:mcPr>
+                      <m:mcJc m:val="center"/>
+                      <m:count m:val="1"/>
+                    </m:mcPr>
+                  </m:mc>
+                </m:mcs>
+              </m:mPr>
+              <m:mr>
+                <m:e>
+                  <m:r>
+                    <m:t>4</m:t>
+                  </m:r>
+                </m:e>
+                <m:e>
+                  <m:r>
+                    <m:t>1</m:t>
+                  </m:r>
+                </m:e>
+                <m:e>
+                  <m:r>
+                    <m:t>0</m:t>
+                  </m:r>
+                </m:e>
+              </m:mr>
+              <m:mr>
+                <m:e>
+                  <m:r>
+                    <m:t>1</m:t>
+                  </m:r>
+                </m:e>
+                <m:e>
+                  <m:r>
+                    <m:t>1</m:t>
+                  </m:r>
+                </m:e>
+                <m:e>
+                  <m:r>
+                    <m:t>0</m:t>
+                  </m:r>
+                </m:e>
+              </m:mr>
+              <m:mr>
+                <m:e>
+                  <m:r>
+                    <m:t>0</m:t>
+                  </m:r>
+                </m:e>
+                <m:e>
+                  <m:r>
+                    <m:t>0</m:t>
+                  </m:r>
+                </m:e>
+                <m:e>
+                  <m:r>
+                    <m:t>5</m:t>
+                  </m:r>
+                </m:e>
+              </m:mr>
+            </m:m>
+          </m:e>
+        </m:d>
+      </m:oMath>
+      <w:r>
+        <w:t xml:space="preserve"> </w:t>
+      </w:r>
+      <w:r>
+        <w:t xml:space="preserve">kg m², with</w:t>
+      </w:r>
+      <w:r>
+        <w:t xml:space="preserve"> </w:t>
+      </w:r>
+      <w:r>
+        <w:t xml:space="preserve">all three indexed edges counted as boundary edges. The example verifies the</w:t>
+      </w:r>
+      <w:r>
+        <w:t xml:space="preserve"> </w:t>
+      </w:r>
+      <w:r>
+        <w:t xml:space="preserve">kernel’s declared lamina equations; it is not an asset-backed exemplar or</w:t>
+      </w:r>
+      <w:r>
+        <w:t xml:space="preserve"> </w:t>
+      </w:r>
+      <w:r>
+        <w:t xml:space="preserve">evidence about a physical segment.</w:t>
+      </w:r>
+    </w:p>
+    <w:bookmarkEnd w:id="141"/>
+    <w:bookmarkEnd w:id="142"/>
+    <w:bookmarkStart w:id="147" w:name="references-and-provenance-1"/>
+    <w:p>
+      <w:pPr>
+        <w:pStyle w:val="Heading2"/>
+      </w:pPr>
+      <w:r>
+        <w:t xml:space="preserve">References and Provenance</w:t>
+      </w:r>
+    </w:p>
+    <w:bookmarkStart w:id="145" w:name="references-2"/>
+    <w:p>
+      <w:pPr>
+        <w:pStyle w:val="Heading3"/>
+      </w:pPr>
+      <w:r>
+        <w:t xml:space="preserve">References</w:t>
+      </w:r>
+    </w:p>
+    <w:p>
+      <w:pPr>
+        <w:pStyle w:val="Compact"/>
+        <w:numPr>
+          <w:ilvl w:val="0"/>
+          <w:numId w:val="1005"/>
+        </w:numPr>
+      </w:pPr>
+      <w:r>
+        <w:rPr>
+          <w:rStyle w:val="VerbatimChar"/>
+        </w:rPr>
+        <w:t xml:space="preserve">src/shared/python/humanoid_character_builder/mesh/triangle_lamina.py</w:t>
+      </w:r>
+      <w:r>
+        <w:t xml:space="preserve"> </w:t>
+      </w:r>
+      <w:r>
+        <w:t xml:space="preserve">—</w:t>
+      </w:r>
+      <w:r>
+        <w:t xml:space="preserve"> </w:t>
+      </w:r>
+      <w:r>
+        <w:t xml:space="preserve">implementation of the triangle-multiset weighting and moments.</w:t>
+      </w:r>
+    </w:p>
+    <w:p>
+      <w:pPr>
+        <w:pStyle w:val="Compact"/>
+        <w:numPr>
+          <w:ilvl w:val="0"/>
+          <w:numId w:val="1005"/>
+        </w:numPr>
+      </w:pPr>
+      <w:r>
+        <w:rPr>
+          <w:rStyle w:val="VerbatimChar"/>
+        </w:rPr>
+        <w:t xml:space="preserve">src/shared/python/humanoid_character_builder/mesh/inertia_calculator.py</w:t>
+      </w:r>
+      <w:r>
+        <w:t xml:space="preserve"> </w:t>
+      </w:r>
+      <w:r>
+        <w:t xml:space="preserve">—</w:t>
+      </w:r>
+      <w:r>
+        <w:t xml:space="preserve"> </w:t>
+      </w:r>
+      <w:r>
+        <w:t xml:space="preserve">compatible result/mode definitions and separate solid-mesh pathway.</w:t>
+      </w:r>
+    </w:p>
+    <w:p>
+      <w:pPr>
+        <w:pStyle w:val="Compact"/>
+        <w:numPr>
+          <w:ilvl w:val="0"/>
+          <w:numId w:val="1005"/>
+        </w:numPr>
+      </w:pPr>
+      <w:r>
+        <w:rPr>
+          <w:rStyle w:val="VerbatimChar"/>
+        </w:rPr>
+        <w:t xml:space="preserve">src/shared/python/humanoid_character_builder/tests/test_triangle_lamina.py</w:t>
+      </w:r>
+      <w:r>
+        <w:t xml:space="preserve"> </w:t>
+      </w:r>
+      <w:r>
+        <w:t xml:space="preserve">—</w:t>
+      </w:r>
+      <w:r>
+        <w:t xml:space="preserve"> </w:t>
+      </w:r>
+      <w:r>
+        <w:t xml:space="preserve">analytic and metamorphic synthetic tests.</w:t>
+      </w:r>
+    </w:p>
+    <w:p>
+      <w:pPr>
+        <w:pStyle w:val="Compact"/>
+        <w:numPr>
+          <w:ilvl w:val="0"/>
+          <w:numId w:val="1005"/>
+        </w:numPr>
+      </w:pPr>
+      <w:r>
+        <w:rPr>
+          <w:rStyle w:val="VerbatimChar"/>
+        </w:rPr>
+        <w:t xml:space="preserve">src/shared/python/humanoid_character_builder/tests/test_urdf_inertia_export.py</w:t>
+      </w:r>
+      <w:r>
+        <w:t xml:space="preserve"> </w:t>
+      </w:r>
+      <w:r>
+        <w:t xml:space="preserve">—</w:t>
+      </w:r>
+      <w:r>
+        <w:t xml:space="preserve"> </w:t>
+      </w:r>
+      <w:r>
+        <w:t xml:space="preserve">symmetric-entry round-trip and an actual MuJoCo tensor/kinetic-energy readback.</w:t>
+      </w:r>
+    </w:p>
+    <w:p>
+      <w:pPr>
+        <w:pStyle w:val="Compact"/>
+        <w:numPr>
+          <w:ilvl w:val="0"/>
+          <w:numId w:val="1005"/>
+        </w:numPr>
+      </w:pPr>
+      <w:hyperlink r:id="rId143">
+        <w:r>
+          <w:rPr>
+            <w:rStyle w:val="Hyperlink"/>
+          </w:rPr>
+          <w:t xml:space="preserve">Inertia tensor of a triangle in barycentric coordinates</w:t>
+        </w:r>
+      </w:hyperlink>
+      <w:r>
+        <w:t xml:space="preserve"> </w:t>
+      </w:r>
+      <w:r>
+        <w:t xml:space="preserve">— independent</w:t>
+      </w:r>
+      <w:r>
+        <w:t xml:space="preserve"> </w:t>
+      </w:r>
+      <w:r>
+        <w:t xml:space="preserve">derivation reference for triangle area moments.</w:t>
+      </w:r>
+    </w:p>
+    <w:p>
+      <w:pPr>
+        <w:pStyle w:val="Compact"/>
+        <w:numPr>
+          <w:ilvl w:val="0"/>
+          <w:numId w:val="1005"/>
+        </w:numPr>
+      </w:pPr>
+      <w:hyperlink r:id="rId144">
+        <w:r>
+          <w:rPr>
+            <w:rStyle w:val="Hyperlink"/>
+          </w:rPr>
+          <w:t xml:space="preserve">ROS 2 KDL URDF parser</w:t>
+        </w:r>
+      </w:hyperlink>
+      <w:r>
+        <w:t xml:space="preserve"> </w:t>
+      </w:r>
+      <w:r>
+        <w:t xml:space="preserve">—</w:t>
+      </w:r>
+      <w:r>
+        <w:t xml:space="preserve"> </w:t>
+      </w:r>
+      <w:r>
+        <w:t xml:space="preserve">primary consumer source for the direct tensor-coefficient interpretation</w:t>
+      </w:r>
+      <w:r>
+        <w:t xml:space="preserve"> </w:t>
+      </w:r>
+      <w:r>
+        <w:t xml:space="preserve">tested by the exporter regression.</w:t>
+      </w:r>
+    </w:p>
+    <w:bookmarkEnd w:id="145"/>
+    <w:bookmarkStart w:id="146" w:name="provenance-1"/>
+    <w:p>
+      <w:pPr>
+        <w:pStyle w:val="Heading3"/>
+      </w:pPr>
+      <w:r>
+        <w:t xml:space="preserve">Provenance</w:t>
+      </w:r>
+    </w:p>
+    <w:p>
+      <w:pPr>
+        <w:pStyle w:val="FirstParagraph"/>
+      </w:pPr>
+      <w:r>
+        <w:t xml:space="preserve">This chapter is a provisional technical note for Tools #5503/#5504. The exact</w:t>
+      </w:r>
+      <w:r>
+        <w:t xml:space="preserve"> </w:t>
+      </w:r>
+      <w:r>
+        <w:t xml:space="preserve">source and tests are tracked in the same development change. The canonical</w:t>
+      </w:r>
+      <w:r>
+        <w:t xml:space="preserve"> </w:t>
+      </w:r>
+      <w:r>
+        <w:t xml:space="preserve">module inventory is regenerated, but executable freshness support beyond the</w:t>
+      </w:r>
+      <w:r>
+        <w:t xml:space="preserve"> </w:t>
+      </w:r>
+      <w:r>
+        <w:t xml:space="preserve">D-plane calculation, governed calculation registration, source geometry</w:t>
+      </w:r>
+      <w:r>
+        <w:t xml:space="preserve"> </w:t>
+      </w:r>
+      <w:r>
+        <w:t xml:space="preserve">producer, anatomical consumer traceability, external scientific review,</w:t>
+      </w:r>
+      <w:r>
+        <w:t xml:space="preserve"> </w:t>
+      </w:r>
+      <w:r>
+        <w:t xml:space="preserve">artifact/page review, and human approval are not complete. The MuJoCo check is</w:t>
+      </w:r>
+      <w:r>
+        <w:t xml:space="preserve"> </w:t>
+      </w:r>
+      <w:r>
+        <w:t xml:space="preserve">limited to an analytic asymmetric URDF fixture and does not establish</w:t>
+      </w:r>
+      <w:r>
+        <w:t xml:space="preserve"> </w:t>
+      </w:r>
+      <w:r>
+        <w:t xml:space="preserve">all-engine parity. No private mesh or capture data is used or reproduced here.</w:t>
+      </w:r>
+    </w:p>
+    <w:bookmarkEnd w:id="146"/>
+    <w:bookmarkEnd w:id="147"/>
+    <w:bookmarkStart w:id="154" w:name="revision-history-1"/>
+    <w:p>
+      <w:pPr>
+        <w:pStyle w:val="Heading2"/>
+      </w:pPr>
+      <w:r>
+        <w:t xml:space="preserve">Revision History</w:t>
+      </w:r>
+    </w:p>
+    <w:bookmarkStart w:id="153" w:name="revision-record-1"/>
+    <w:p>
+      <w:pPr>
+        <w:pStyle w:val="Heading3"/>
+      </w:pPr>
+      <w:r>
+        <w:t xml:space="preserve">Revision Record</w:t>
+      </w:r>
+    </w:p>
+    <w:p>
+      <w:pPr>
+        <w:pStyle w:val="Compact"/>
+        <w:numPr>
+          <w:ilvl w:val="0"/>
+          <w:numId w:val="1006"/>
+        </w:numPr>
+      </w:pPr>
+      <w:r>
+        <w:t xml:space="preserve">0.1.0 (2026-10-10): Document the provisional triangle-multiset lamina</w:t>
+      </w:r>
+      <w:r>
+        <w:t xml:space="preserve"> </w:t>
+      </w:r>
+      <w:r>
+        <w:t xml:space="preserve">kernel and its analytic/synthetic evidence; keep governed registration and</w:t>
+      </w:r>
+      <w:r>
+        <w:t xml:space="preserve"> </w:t>
+      </w:r>
+      <w:r>
+        <w:t xml:space="preserve">all source/consumer/engineering qualification blocked.</w:t>
+      </w:r>
+    </w:p>
+    <w:bookmarkStart w:id="152" w:name="refs"/>
+    <w:bookmarkStart w:id="149" w:name="ref-pandoc-manual"/>
     <w:p>
       <w:pPr>
         <w:pStyle w:val="Bibliography"/>
@@ -7244,7 +11323,7 @@
       <w:r>
         <w:t xml:space="preserve"> </w:t>
       </w:r>
-      <w:hyperlink r:id="rId102">
+      <w:hyperlink r:id="rId148">
         <w:r>
           <w:rPr>
             <w:rStyle w:val="Hyperlink"/>
@@ -7256,8 +11335,8 @@
         <w:t xml:space="preserve">.</w:t>
       </w:r>
     </w:p>
-    <w:bookmarkEnd w:id="103"/>
-    <w:bookmarkStart w:id="105" w:name="ref-quarto-guide"/>
+    <w:bookmarkEnd w:id="149"/>
+    <w:bookmarkStart w:id="151" w:name="ref-quarto-guide"/>
     <w:p>
       <w:pPr>
         <w:pStyle w:val="Bibliography"/>
@@ -7281,7 +11360,7 @@
       <w:r>
         <w:t xml:space="preserve"> </w:t>
       </w:r>
-      <w:hyperlink r:id="rId104">
+      <w:hyperlink r:id="rId150">
         <w:r>
           <w:rPr>
             <w:rStyle w:val="Hyperlink"/>
@@ -7293,10 +11372,11 @@
         <w:t xml:space="preserve">.</w:t>
       </w:r>
     </w:p>
-    <w:bookmarkEnd w:id="105"/>
-    <w:bookmarkEnd w:id="106"/>
-    <w:bookmarkEnd w:id="107"/>
-    <w:bookmarkEnd w:id="108"/>
+    <w:bookmarkEnd w:id="151"/>
+    <w:bookmarkEnd w:id="152"/>
+    <w:bookmarkEnd w:id="153"/>
+    <w:bookmarkEnd w:id="154"/>
+    <w:bookmarkEnd w:id="155"/>
     <w:sectPr>
       <w:headerReference r:id="rId9" w:type="default"/>
       <w:footerReference r:id="rId10" w:type="default"/>
@@ -7892,6 +11972,42 @@
     <w:lvlOverride w:ilvl="8">
       <w:startOverride w:val="1"/>
     </w:lvlOverride>
+  </w:num>
+  <w:num w:numId="1004">
+    <w:abstractNumId w:val="99411"/>
+    <w:lvlOverride w:ilvl="0">
+      <w:startOverride w:val="1"/>
+    </w:lvlOverride>
+    <w:lvlOverride w:ilvl="1">
+      <w:startOverride w:val="1"/>
+    </w:lvlOverride>
+    <w:lvlOverride w:ilvl="2">
+      <w:startOverride w:val="1"/>
+    </w:lvlOverride>
+    <w:lvlOverride w:ilvl="3">
+      <w:startOverride w:val="1"/>
+    </w:lvlOverride>
+    <w:lvlOverride w:ilvl="4">
+      <w:startOverride w:val="1"/>
+    </w:lvlOverride>
+    <w:lvlOverride w:ilvl="5">
+      <w:startOverride w:val="1"/>
+    </w:lvlOverride>
+    <w:lvlOverride w:ilvl="6">
+      <w:startOverride w:val="1"/>
+    </w:lvlOverride>
+    <w:lvlOverride w:ilvl="7">
+      <w:startOverride w:val="1"/>
+    </w:lvlOverride>
+    <w:lvlOverride w:ilvl="8">
+      <w:startOverride w:val="1"/>
+    </w:lvlOverride>
+  </w:num>
+  <w:num w:numId="1005">
+    <w:abstractNumId w:val="991"/>
+  </w:num>
+  <w:num w:numId="1006">
+    <w:abstractNumId w:val="991"/>
   </w:num>
 </w:numbering>
 </file>

</xml_diff>